<commit_message>
doc: implement basic project spec info
</commit_message>
<xml_diff>
--- a/操作系统开源创新大赛项目说明书.docx
+++ b/操作系统开源创新大赛项目说明书.docx
@@ -4,13 +4,25 @@
   <w:body>
     <w:p>
       <w:pPr>
-        <w:pStyle w:val="31"/>
+        <w:pStyle w:val="33"/>
       </w:pPr>
       <w:r>
         <w:rPr>
           <w:rFonts w:hint="eastAsia"/>
         </w:rPr>
         <w:t>中国研究生操作系统开源创新大赛</w:t>
+      </w:r>
+    </w:p>
+    <w:p>
+      <w:pPr>
+        <w:pStyle w:val="33"/>
+        <w:ind w:firstLine="480"/>
+      </w:pPr>
+      <w:r>
+        <w:rPr>
+          <w:rFonts w:hint="eastAsia"/>
+        </w:rPr>
+        <w:t>项目说明书</w:t>
       </w:r>
     </w:p>
     <w:p>
@@ -18,22 +30,10 @@
         <w:pStyle w:val="31"/>
         <w:ind w:firstLine="480"/>
       </w:pPr>
-      <w:r>
-        <w:rPr>
-          <w:rFonts w:hint="eastAsia"/>
-        </w:rPr>
-        <w:t>项目说明书</w:t>
-      </w:r>
-    </w:p>
-    <w:p>
-      <w:pPr>
-        <w:pStyle w:val="29"/>
-        <w:ind w:firstLine="480"/>
-      </w:pPr>
     </w:p>
     <w:tbl>
       <w:tblPr>
-        <w:tblStyle w:val="14"/>
+        <w:tblStyle w:val="15"/>
         <w:tblW w:w="0" w:type="auto"/>
         <w:jc w:val="center"/>
         <w:tblLayout w:type="fixed"/>
@@ -415,7 +415,7 @@
     </w:tbl>
     <w:p>
       <w:pPr>
-        <w:pStyle w:val="29"/>
+        <w:pStyle w:val="31"/>
         <w:jc w:val="center"/>
         <w:rPr>
           <w:rFonts w:hint="default" w:eastAsia="黑体"/>
@@ -448,8 +448,6 @@
         </w:rPr>
         <w:t>注：文件不得出现任何学校和团队成员相关信息（阅读后删除）</w:t>
       </w:r>
-      <w:bookmarkStart w:id="1" w:name="_GoBack"/>
-      <w:bookmarkEnd w:id="1"/>
     </w:p>
     <w:p>
       <w:pPr>
@@ -462,7 +460,7 @@
     </w:p>
     <w:p>
       <w:pPr>
-        <w:pStyle w:val="38"/>
+        <w:pStyle w:val="40"/>
         <w:spacing w:before="120" w:after="120"/>
       </w:pPr>
       <w:r>
@@ -561,6 +559,1069 @@
     <w:p>
       <w:pPr>
         <w:ind w:firstLine="199" w:firstLineChars="83"/>
+        <w:rPr>
+          <w:rFonts w:hint="eastAsia"/>
+        </w:rPr>
+      </w:pPr>
+      <w:r>
+        <w:rPr>
+          <w:rFonts w:hint="eastAsia"/>
+        </w:rPr>
+        <w:t>对该领域或同类功能软件的优缺点进行分析与描述，并对所提交软件作品设计的新颖之处进行较为全面的描述。</w:t>
+      </w:r>
+    </w:p>
+    <w:p>
+      <w:pPr>
+        <w:pStyle w:val="4"/>
+        <w:keepNext w:val="0"/>
+        <w:keepLines w:val="0"/>
+        <w:widowControl/>
+        <w:suppressLineNumbers w:val="0"/>
+        <w:shd w:val="clear" w:fill="F8F8F8"/>
+        <w:ind w:left="0" w:firstLine="0"/>
+        <w:rPr>
+          <w:rFonts w:hint="eastAsia" w:asciiTheme="minorEastAsia" w:hAnsiTheme="minorEastAsia" w:eastAsiaTheme="minorEastAsia" w:cstheme="minorEastAsia"/>
+          <w:i w:val="0"/>
+          <w:iCs w:val="0"/>
+          <w:caps w:val="0"/>
+          <w:color w:val="3B3B3B"/>
+          <w:spacing w:val="0"/>
+        </w:rPr>
+      </w:pPr>
+      <w:r>
+        <w:rPr>
+          <w:rFonts w:hint="eastAsia" w:asciiTheme="minorEastAsia" w:hAnsiTheme="minorEastAsia" w:eastAsiaTheme="minorEastAsia" w:cstheme="minorEastAsia"/>
+          <w:i w:val="0"/>
+          <w:iCs w:val="0"/>
+          <w:caps w:val="0"/>
+          <w:color w:val="3B3B3B"/>
+          <w:spacing w:val="0"/>
+          <w:shd w:val="clear" w:fill="F8F8F8"/>
+        </w:rPr>
+        <w:t>1.2.1 RISC-V 嵌入式生态发展现状</w:t>
+      </w:r>
+    </w:p>
+    <w:p>
+      <w:pPr>
+        <w:pStyle w:val="13"/>
+        <w:keepNext w:val="0"/>
+        <w:keepLines w:val="0"/>
+        <w:widowControl/>
+        <w:suppressLineNumbers w:val="0"/>
+        <w:shd w:val="clear" w:fill="F8F8F8"/>
+        <w:spacing w:before="21" w:beforeAutospacing="0" w:after="42" w:afterAutospacing="0"/>
+        <w:ind w:left="0" w:firstLine="0"/>
+        <w:rPr>
+          <w:rFonts w:hint="eastAsia" w:asciiTheme="minorEastAsia" w:hAnsiTheme="minorEastAsia" w:eastAsiaTheme="minorEastAsia" w:cstheme="minorEastAsia"/>
+          <w:i w:val="0"/>
+          <w:iCs w:val="0"/>
+          <w:caps w:val="0"/>
+          <w:color w:val="3B3B3B"/>
+          <w:spacing w:val="0"/>
+          <w:sz w:val="15"/>
+          <w:szCs w:val="15"/>
+        </w:rPr>
+      </w:pPr>
+      <w:r>
+        <w:rPr>
+          <w:rFonts w:hint="eastAsia" w:asciiTheme="minorEastAsia" w:hAnsiTheme="minorEastAsia" w:eastAsiaTheme="minorEastAsia" w:cstheme="minorEastAsia"/>
+          <w:i w:val="0"/>
+          <w:iCs w:val="0"/>
+          <w:caps w:val="0"/>
+          <w:color w:val="3B3B3B"/>
+          <w:spacing w:val="0"/>
+          <w:sz w:val="15"/>
+          <w:szCs w:val="15"/>
+          <w:shd w:val="clear" w:fill="F8F8F8"/>
+        </w:rPr>
+        <w:t>RISC-V 作为开放指令集架构，近年来在嵌入式 AI 和机器人领域取得了显著进展。2024–2025 年间，多个标志性事件推动了 RISC-V 机器人生态的成熟：</w:t>
+      </w:r>
+    </w:p>
+    <w:p>
+      <w:pPr>
+        <w:pStyle w:val="13"/>
+        <w:keepNext w:val="0"/>
+        <w:keepLines w:val="0"/>
+        <w:widowControl/>
+        <w:suppressLineNumbers w:val="0"/>
+        <w:shd w:val="clear" w:fill="F8F8F8"/>
+        <w:spacing w:before="21" w:beforeAutospacing="0" w:after="42" w:afterAutospacing="0"/>
+        <w:ind w:left="0" w:firstLine="0"/>
+        <w:rPr>
+          <w:rFonts w:hint="eastAsia" w:asciiTheme="minorEastAsia" w:hAnsiTheme="minorEastAsia" w:eastAsiaTheme="minorEastAsia" w:cstheme="minorEastAsia"/>
+          <w:i w:val="0"/>
+          <w:iCs w:val="0"/>
+          <w:caps w:val="0"/>
+          <w:color w:val="3B3B3B"/>
+          <w:spacing w:val="0"/>
+          <w:sz w:val="15"/>
+          <w:szCs w:val="15"/>
+        </w:rPr>
+      </w:pPr>
+      <w:r>
+        <w:rPr>
+          <w:rFonts w:hint="eastAsia" w:asciiTheme="minorEastAsia" w:hAnsiTheme="minorEastAsia" w:eastAsiaTheme="minorEastAsia" w:cstheme="minorEastAsia"/>
+          <w:i w:val="0"/>
+          <w:iCs w:val="0"/>
+          <w:caps w:val="0"/>
+          <w:color w:val="3B3B3B"/>
+          <w:spacing w:val="0"/>
+          <w:sz w:val="15"/>
+          <w:szCs w:val="15"/>
+          <w:shd w:val="clear" w:fill="F8F8F8"/>
+        </w:rPr>
+        <w:t>（1）</w:t>
+      </w:r>
+      <w:r>
+        <w:rPr>
+          <w:rStyle w:val="17"/>
+          <w:rFonts w:hint="eastAsia" w:asciiTheme="minorEastAsia" w:hAnsiTheme="minorEastAsia" w:eastAsiaTheme="minorEastAsia" w:cstheme="minorEastAsia"/>
+          <w:i w:val="0"/>
+          <w:iCs w:val="0"/>
+          <w:caps w:val="0"/>
+          <w:color w:val="3B3B3B"/>
+          <w:spacing w:val="0"/>
+          <w:sz w:val="15"/>
+          <w:szCs w:val="15"/>
+          <w:shd w:val="clear" w:fill="F8F8F8"/>
+        </w:rPr>
+        <w:t>openEuler RISC-V + ROS2 生态闭环</w:t>
+      </w:r>
+      <w:r>
+        <w:rPr>
+          <w:rFonts w:hint="eastAsia" w:asciiTheme="minorEastAsia" w:hAnsiTheme="minorEastAsia" w:eastAsiaTheme="minorEastAsia" w:cstheme="minorEastAsia"/>
+          <w:i w:val="0"/>
+          <w:iCs w:val="0"/>
+          <w:caps w:val="0"/>
+          <w:color w:val="3B3B3B"/>
+          <w:spacing w:val="0"/>
+          <w:sz w:val="15"/>
+          <w:szCs w:val="15"/>
+          <w:shd w:val="clear" w:fill="F8F8F8"/>
+        </w:rPr>
+        <w:t>。2024 年 3 月，中科院软件所、亚博智能与达摩院玄铁联合推出了首款搭载 openEuler 的 RISC-V 机器人小车解决方案，基于 Milk-V Meles 开发板（玄铁 C910 处理器），支持机器人运动控制、AI 视觉交互和 SLAM 建图导航。openEuler 24.03 版本实现了 X86/ARM/RISC-V 三架构全覆盖，集成 1000 余个 ROS 软件包，打通了 ROS1 Noetic、ROS2 Humble 及 ROS2 Jazzy 的一键部署。</w:t>
+      </w:r>
+    </w:p>
+    <w:p>
+      <w:pPr>
+        <w:pStyle w:val="13"/>
+        <w:keepNext w:val="0"/>
+        <w:keepLines w:val="0"/>
+        <w:widowControl/>
+        <w:suppressLineNumbers w:val="0"/>
+        <w:shd w:val="clear" w:fill="F8F8F8"/>
+        <w:spacing w:before="21" w:beforeAutospacing="0" w:after="42" w:afterAutospacing="0"/>
+        <w:ind w:left="0" w:firstLine="0"/>
+        <w:rPr>
+          <w:rFonts w:hint="eastAsia" w:asciiTheme="minorEastAsia" w:hAnsiTheme="minorEastAsia" w:eastAsiaTheme="minorEastAsia" w:cstheme="minorEastAsia"/>
+          <w:i w:val="0"/>
+          <w:iCs w:val="0"/>
+          <w:caps w:val="0"/>
+          <w:color w:val="3B3B3B"/>
+          <w:spacing w:val="0"/>
+          <w:sz w:val="15"/>
+          <w:szCs w:val="15"/>
+        </w:rPr>
+      </w:pPr>
+      <w:r>
+        <w:rPr>
+          <w:rFonts w:hint="eastAsia" w:asciiTheme="minorEastAsia" w:hAnsiTheme="minorEastAsia" w:eastAsiaTheme="minorEastAsia" w:cstheme="minorEastAsia"/>
+          <w:i w:val="0"/>
+          <w:iCs w:val="0"/>
+          <w:caps w:val="0"/>
+          <w:color w:val="3B3B3B"/>
+          <w:spacing w:val="0"/>
+          <w:sz w:val="15"/>
+          <w:szCs w:val="15"/>
+          <w:shd w:val="clear" w:fill="F8F8F8"/>
+        </w:rPr>
+        <w:t>（2）</w:t>
+      </w:r>
+      <w:r>
+        <w:rPr>
+          <w:rStyle w:val="17"/>
+          <w:rFonts w:hint="eastAsia" w:asciiTheme="minorEastAsia" w:hAnsiTheme="minorEastAsia" w:eastAsiaTheme="minorEastAsia" w:cstheme="minorEastAsia"/>
+          <w:i w:val="0"/>
+          <w:iCs w:val="0"/>
+          <w:caps w:val="0"/>
+          <w:color w:val="3B3B3B"/>
+          <w:spacing w:val="0"/>
+          <w:sz w:val="15"/>
+          <w:szCs w:val="15"/>
+          <w:shd w:val="clear" w:fill="F8F8F8"/>
+        </w:rPr>
+        <w:t>RISC-V 智能车竞赛与教育推广</w:t>
+      </w:r>
+      <w:r>
+        <w:rPr>
+          <w:rFonts w:hint="eastAsia" w:asciiTheme="minorEastAsia" w:hAnsiTheme="minorEastAsia" w:eastAsiaTheme="minorEastAsia" w:cstheme="minorEastAsia"/>
+          <w:i w:val="0"/>
+          <w:iCs w:val="0"/>
+          <w:caps w:val="0"/>
+          <w:color w:val="3B3B3B"/>
+          <w:spacing w:val="0"/>
+          <w:sz w:val="15"/>
+          <w:szCs w:val="15"/>
+          <w:shd w:val="clear" w:fill="F8F8F8"/>
+        </w:rPr>
+        <w:t>。2025 年第六届课堂智能车比赛中，基于 Milk-V Duo（SG2002 同系列芯片）的 RISC-V 小车实现了自主循迹、避障和红绿灯识别功能，每车预算不超过 800 元。基于 CanMV K230（双核玄铁 C908）的 RT-Thread 工地巡检机器人实现了建材识别、安全帽检测等 AI 视觉功能，代码已开源。</w:t>
+      </w:r>
+    </w:p>
+    <w:p>
+      <w:pPr>
+        <w:pStyle w:val="13"/>
+        <w:keepNext w:val="0"/>
+        <w:keepLines w:val="0"/>
+        <w:widowControl/>
+        <w:suppressLineNumbers w:val="0"/>
+        <w:shd w:val="clear" w:fill="F8F8F8"/>
+        <w:spacing w:before="21" w:beforeAutospacing="0" w:after="42" w:afterAutospacing="0"/>
+        <w:ind w:left="0" w:firstLine="0"/>
+        <w:rPr>
+          <w:rFonts w:hint="eastAsia" w:asciiTheme="minorEastAsia" w:hAnsiTheme="minorEastAsia" w:eastAsiaTheme="minorEastAsia" w:cstheme="minorEastAsia"/>
+          <w:i w:val="0"/>
+          <w:iCs w:val="0"/>
+          <w:caps w:val="0"/>
+          <w:color w:val="3B3B3B"/>
+          <w:spacing w:val="0"/>
+          <w:sz w:val="15"/>
+          <w:szCs w:val="15"/>
+        </w:rPr>
+      </w:pPr>
+      <w:r>
+        <w:rPr>
+          <w:rFonts w:hint="eastAsia" w:asciiTheme="minorEastAsia" w:hAnsiTheme="minorEastAsia" w:eastAsiaTheme="minorEastAsia" w:cstheme="minorEastAsia"/>
+          <w:i w:val="0"/>
+          <w:iCs w:val="0"/>
+          <w:caps w:val="0"/>
+          <w:color w:val="3B3B3B"/>
+          <w:spacing w:val="0"/>
+          <w:sz w:val="15"/>
+          <w:szCs w:val="15"/>
+          <w:shd w:val="clear" w:fill="F8F8F8"/>
+        </w:rPr>
+        <w:t>（3）</w:t>
+      </w:r>
+      <w:r>
+        <w:rPr>
+          <w:rStyle w:val="17"/>
+          <w:rFonts w:hint="eastAsia" w:asciiTheme="minorEastAsia" w:hAnsiTheme="minorEastAsia" w:eastAsiaTheme="minorEastAsia" w:cstheme="minorEastAsia"/>
+          <w:i w:val="0"/>
+          <w:iCs w:val="0"/>
+          <w:caps w:val="0"/>
+          <w:color w:val="3B3B3B"/>
+          <w:spacing w:val="0"/>
+          <w:sz w:val="15"/>
+          <w:szCs w:val="15"/>
+          <w:shd w:val="clear" w:fill="F8F8F8"/>
+        </w:rPr>
+        <w:t>SG2002 主线支持持续完善</w:t>
+      </w:r>
+      <w:r>
+        <w:rPr>
+          <w:rFonts w:hint="eastAsia" w:asciiTheme="minorEastAsia" w:hAnsiTheme="minorEastAsia" w:eastAsiaTheme="minorEastAsia" w:cstheme="minorEastAsia"/>
+          <w:i w:val="0"/>
+          <w:iCs w:val="0"/>
+          <w:caps w:val="0"/>
+          <w:color w:val="3B3B3B"/>
+          <w:spacing w:val="0"/>
+          <w:sz w:val="15"/>
+          <w:szCs w:val="15"/>
+          <w:shd w:val="clear" w:fill="F8F8F8"/>
+        </w:rPr>
+        <w:t>。Linux 内核 v6.12–v6.16 陆续合入了 SG2002/CV181x 系列的 DMA 控制器、pinctrl、SARADC、eMMC/SDIO、设备树和复位生成器驱动。U-Boot v2025.10 实现了 LicheeRV Nano 的完整主线支持。开源社区（LicheeSG-Nano-Build、Milk-V Duo Buildroot SDK）维护了活跃的构建脚本和中间件生态。</w:t>
+      </w:r>
+    </w:p>
+    <w:p>
+      <w:pPr>
+        <w:pStyle w:val="13"/>
+        <w:keepNext w:val="0"/>
+        <w:keepLines w:val="0"/>
+        <w:widowControl/>
+        <w:suppressLineNumbers w:val="0"/>
+        <w:shd w:val="clear" w:fill="F8F8F8"/>
+        <w:spacing w:before="21" w:beforeAutospacing="0" w:after="42" w:afterAutospacing="0"/>
+        <w:ind w:left="0" w:firstLine="0"/>
+        <w:rPr>
+          <w:rFonts w:hint="eastAsia" w:asciiTheme="minorEastAsia" w:hAnsiTheme="minorEastAsia" w:eastAsiaTheme="minorEastAsia" w:cstheme="minorEastAsia"/>
+          <w:i w:val="0"/>
+          <w:iCs w:val="0"/>
+          <w:caps w:val="0"/>
+          <w:color w:val="3B3B3B"/>
+          <w:spacing w:val="0"/>
+          <w:sz w:val="15"/>
+          <w:szCs w:val="15"/>
+        </w:rPr>
+      </w:pPr>
+      <w:r>
+        <w:rPr>
+          <w:rFonts w:hint="eastAsia" w:asciiTheme="minorEastAsia" w:hAnsiTheme="minorEastAsia" w:eastAsiaTheme="minorEastAsia" w:cstheme="minorEastAsia"/>
+          <w:i w:val="0"/>
+          <w:iCs w:val="0"/>
+          <w:caps w:val="0"/>
+          <w:color w:val="3B3B3B"/>
+          <w:spacing w:val="0"/>
+          <w:sz w:val="15"/>
+          <w:szCs w:val="15"/>
+          <w:shd w:val="clear" w:fill="F8F8F8"/>
+        </w:rPr>
+        <w:t>（4）</w:t>
+      </w:r>
+      <w:r>
+        <w:rPr>
+          <w:rStyle w:val="17"/>
+          <w:rFonts w:hint="eastAsia" w:asciiTheme="minorEastAsia" w:hAnsiTheme="minorEastAsia" w:eastAsiaTheme="minorEastAsia" w:cstheme="minorEastAsia"/>
+          <w:i w:val="0"/>
+          <w:iCs w:val="0"/>
+          <w:caps w:val="0"/>
+          <w:color w:val="3B3B3B"/>
+          <w:spacing w:val="0"/>
+          <w:sz w:val="15"/>
+          <w:szCs w:val="15"/>
+          <w:shd w:val="clear" w:fill="F8F8F8"/>
+        </w:rPr>
+        <w:t>AI 推理加速能力逐步释放</w:t>
+      </w:r>
+      <w:r>
+        <w:rPr>
+          <w:rFonts w:hint="eastAsia" w:asciiTheme="minorEastAsia" w:hAnsiTheme="minorEastAsia" w:eastAsiaTheme="minorEastAsia" w:cstheme="minorEastAsia"/>
+          <w:i w:val="0"/>
+          <w:iCs w:val="0"/>
+          <w:caps w:val="0"/>
+          <w:color w:val="3B3B3B"/>
+          <w:spacing w:val="0"/>
+          <w:sz w:val="15"/>
+          <w:szCs w:val="15"/>
+          <w:shd w:val="clear" w:fill="F8F8F8"/>
+        </w:rPr>
+        <w:t>。SG2002 片载 TPU（Tensor Processing Unit）通过 TDL SDK v2.x 支持常用视觉模型推理。围绕玄铁 C906/C908/C910 等 RISC-V 核心，社区和学术界在模型部署、算子优化等方面持续产出（如 RISCSparse 子流形稀疏卷积引擎在 RISC-V SoC 上达到 ARM Cortex-A57 的 10–20 倍推理速度）。</w:t>
+      </w:r>
+    </w:p>
+    <w:p>
+      <w:pPr>
+        <w:pStyle w:val="4"/>
+        <w:keepNext w:val="0"/>
+        <w:keepLines w:val="0"/>
+        <w:widowControl/>
+        <w:suppressLineNumbers w:val="0"/>
+        <w:shd w:val="clear" w:fill="F8F8F8"/>
+        <w:ind w:left="0" w:firstLine="0"/>
+        <w:rPr>
+          <w:rFonts w:hint="eastAsia" w:asciiTheme="minorEastAsia" w:hAnsiTheme="minorEastAsia" w:eastAsiaTheme="minorEastAsia" w:cstheme="minorEastAsia"/>
+          <w:i w:val="0"/>
+          <w:iCs w:val="0"/>
+          <w:caps w:val="0"/>
+          <w:color w:val="3B3B3B"/>
+          <w:spacing w:val="0"/>
+        </w:rPr>
+      </w:pPr>
+      <w:r>
+        <w:rPr>
+          <w:rFonts w:hint="eastAsia" w:asciiTheme="minorEastAsia" w:hAnsiTheme="minorEastAsia" w:eastAsiaTheme="minorEastAsia" w:cstheme="minorEastAsia"/>
+          <w:i w:val="0"/>
+          <w:iCs w:val="0"/>
+          <w:caps w:val="0"/>
+          <w:color w:val="3B3B3B"/>
+          <w:spacing w:val="0"/>
+          <w:shd w:val="clear" w:fill="F8F8F8"/>
+        </w:rPr>
+        <w:t>1.2.2 同类系统的局限性</w:t>
+      </w:r>
+    </w:p>
+    <w:p>
+      <w:pPr>
+        <w:pStyle w:val="13"/>
+        <w:keepNext w:val="0"/>
+        <w:keepLines w:val="0"/>
+        <w:widowControl/>
+        <w:suppressLineNumbers w:val="0"/>
+        <w:shd w:val="clear" w:fill="F8F8F8"/>
+        <w:spacing w:before="21" w:beforeAutospacing="0" w:after="42" w:afterAutospacing="0"/>
+        <w:ind w:left="0" w:firstLine="0"/>
+        <w:rPr>
+          <w:rFonts w:hint="eastAsia" w:asciiTheme="minorEastAsia" w:hAnsiTheme="minorEastAsia" w:eastAsiaTheme="minorEastAsia" w:cstheme="minorEastAsia"/>
+          <w:i w:val="0"/>
+          <w:iCs w:val="0"/>
+          <w:caps w:val="0"/>
+          <w:color w:val="3B3B3B"/>
+          <w:spacing w:val="0"/>
+          <w:sz w:val="15"/>
+          <w:szCs w:val="15"/>
+        </w:rPr>
+      </w:pPr>
+      <w:r>
+        <w:rPr>
+          <w:rFonts w:hint="eastAsia" w:asciiTheme="minorEastAsia" w:hAnsiTheme="minorEastAsia" w:eastAsiaTheme="minorEastAsia" w:cstheme="minorEastAsia"/>
+          <w:i w:val="0"/>
+          <w:iCs w:val="0"/>
+          <w:caps w:val="0"/>
+          <w:color w:val="3B3B3B"/>
+          <w:spacing w:val="0"/>
+          <w:sz w:val="15"/>
+          <w:szCs w:val="15"/>
+          <w:shd w:val="clear" w:fill="F8F8F8"/>
+        </w:rPr>
+        <w:t>尽管 RISC-V 机器人生态发展迅速，但当前同类系统在面对资源受限平台上的实时自主控制任务时，仍存在以下普遍不足：</w:t>
+      </w:r>
+    </w:p>
+    <w:p>
+      <w:pPr>
+        <w:pStyle w:val="13"/>
+        <w:keepNext w:val="0"/>
+        <w:keepLines w:val="0"/>
+        <w:widowControl/>
+        <w:suppressLineNumbers w:val="0"/>
+        <w:shd w:val="clear" w:fill="F8F8F8"/>
+        <w:spacing w:before="21" w:beforeAutospacing="0" w:after="42" w:afterAutospacing="0"/>
+        <w:ind w:left="0" w:firstLine="0"/>
+        <w:rPr>
+          <w:rFonts w:hint="eastAsia" w:asciiTheme="minorEastAsia" w:hAnsiTheme="minorEastAsia" w:eastAsiaTheme="minorEastAsia" w:cstheme="minorEastAsia"/>
+          <w:i w:val="0"/>
+          <w:iCs w:val="0"/>
+          <w:caps w:val="0"/>
+          <w:color w:val="3B3B3B"/>
+          <w:spacing w:val="0"/>
+          <w:sz w:val="15"/>
+          <w:szCs w:val="15"/>
+        </w:rPr>
+      </w:pPr>
+      <w:r>
+        <w:rPr>
+          <w:rFonts w:hint="eastAsia" w:asciiTheme="minorEastAsia" w:hAnsiTheme="minorEastAsia" w:eastAsiaTheme="minorEastAsia" w:cstheme="minorEastAsia"/>
+          <w:i w:val="0"/>
+          <w:iCs w:val="0"/>
+          <w:caps w:val="0"/>
+          <w:color w:val="3B3B3B"/>
+          <w:spacing w:val="0"/>
+          <w:sz w:val="15"/>
+          <w:szCs w:val="15"/>
+          <w:shd w:val="clear" w:fill="F8F8F8"/>
+        </w:rPr>
+        <w:t>（1）</w:t>
+      </w:r>
+      <w:r>
+        <w:rPr>
+          <w:rStyle w:val="17"/>
+          <w:rFonts w:hint="eastAsia" w:asciiTheme="minorEastAsia" w:hAnsiTheme="minorEastAsia" w:eastAsiaTheme="minorEastAsia" w:cstheme="minorEastAsia"/>
+          <w:i w:val="0"/>
+          <w:iCs w:val="0"/>
+          <w:caps w:val="0"/>
+          <w:color w:val="3B3B3B"/>
+          <w:spacing w:val="0"/>
+          <w:sz w:val="15"/>
+          <w:szCs w:val="15"/>
+          <w:shd w:val="clear" w:fill="F8F8F8"/>
+        </w:rPr>
+        <w:t>感知与控制的实时耦合不足</w:t>
+      </w:r>
+      <w:r>
+        <w:rPr>
+          <w:rFonts w:hint="eastAsia" w:asciiTheme="minorEastAsia" w:hAnsiTheme="minorEastAsia" w:eastAsiaTheme="minorEastAsia" w:cstheme="minorEastAsia"/>
+          <w:i w:val="0"/>
+          <w:iCs w:val="0"/>
+          <w:caps w:val="0"/>
+          <w:color w:val="3B3B3B"/>
+          <w:spacing w:val="0"/>
+          <w:sz w:val="15"/>
+          <w:szCs w:val="15"/>
+          <w:shd w:val="clear" w:fill="F8F8F8"/>
+        </w:rPr>
+        <w:t>。大多数 RISC-V 机器人项目（如 openEuler ROS 小车、MiracRV）依赖 ROS 中间件进行感知与控制的消息传递，存在毫秒至秒级的调度延迟。在帧率极低（&lt;1 FPS）的场景下，标准的 PID/纯追踪控制器会产生严重过冲。</w:t>
+      </w:r>
+    </w:p>
+    <w:p>
+      <w:pPr>
+        <w:pStyle w:val="13"/>
+        <w:keepNext w:val="0"/>
+        <w:keepLines w:val="0"/>
+        <w:widowControl/>
+        <w:suppressLineNumbers w:val="0"/>
+        <w:shd w:val="clear" w:fill="F8F8F8"/>
+        <w:spacing w:before="21" w:beforeAutospacing="0" w:after="42" w:afterAutospacing="0"/>
+        <w:ind w:left="0" w:firstLine="0"/>
+        <w:rPr>
+          <w:rFonts w:hint="eastAsia" w:asciiTheme="minorEastAsia" w:hAnsiTheme="minorEastAsia" w:eastAsiaTheme="minorEastAsia" w:cstheme="minorEastAsia"/>
+          <w:i w:val="0"/>
+          <w:iCs w:val="0"/>
+          <w:caps w:val="0"/>
+          <w:color w:val="3B3B3B"/>
+          <w:spacing w:val="0"/>
+          <w:sz w:val="15"/>
+          <w:szCs w:val="15"/>
+        </w:rPr>
+      </w:pPr>
+      <w:r>
+        <w:rPr>
+          <w:rFonts w:hint="eastAsia" w:asciiTheme="minorEastAsia" w:hAnsiTheme="minorEastAsia" w:eastAsiaTheme="minorEastAsia" w:cstheme="minorEastAsia"/>
+          <w:i w:val="0"/>
+          <w:iCs w:val="0"/>
+          <w:caps w:val="0"/>
+          <w:color w:val="3B3B3B"/>
+          <w:spacing w:val="0"/>
+          <w:sz w:val="15"/>
+          <w:szCs w:val="15"/>
+          <w:shd w:val="clear" w:fill="F8F8F8"/>
+        </w:rPr>
+        <w:t>（2）</w:t>
+      </w:r>
+      <w:r>
+        <w:rPr>
+          <w:rStyle w:val="17"/>
+          <w:rFonts w:hint="eastAsia" w:asciiTheme="minorEastAsia" w:hAnsiTheme="minorEastAsia" w:eastAsiaTheme="minorEastAsia" w:cstheme="minorEastAsia"/>
+          <w:i w:val="0"/>
+          <w:iCs w:val="0"/>
+          <w:caps w:val="0"/>
+          <w:color w:val="3B3B3B"/>
+          <w:spacing w:val="0"/>
+          <w:sz w:val="15"/>
+          <w:szCs w:val="15"/>
+          <w:shd w:val="clear" w:fill="F8F8F8"/>
+        </w:rPr>
+        <w:t>采集管道效率未被充分重视</w:t>
+      </w:r>
+      <w:r>
+        <w:rPr>
+          <w:rFonts w:hint="eastAsia" w:asciiTheme="minorEastAsia" w:hAnsiTheme="minorEastAsia" w:eastAsiaTheme="minorEastAsia" w:cstheme="minorEastAsia"/>
+          <w:i w:val="0"/>
+          <w:iCs w:val="0"/>
+          <w:caps w:val="0"/>
+          <w:color w:val="3B3B3B"/>
+          <w:spacing w:val="0"/>
+          <w:sz w:val="15"/>
+          <w:szCs w:val="15"/>
+          <w:shd w:val="clear" w:fill="F8F8F8"/>
+        </w:rPr>
+        <w:t>。现有项目通常直接使用 V4L2 或 OpenCV 的标准摄像头接口，未针对具体 SoC 的硬件特性（如内置 JPU、专用 isochronous UVC 驱动）调优采集管道。原始实现中采集占帧时间可达 90% 以上，掩盖了推理和控制算法的实际性能。</w:t>
+      </w:r>
+    </w:p>
+    <w:p>
+      <w:pPr>
+        <w:pStyle w:val="13"/>
+        <w:keepNext w:val="0"/>
+        <w:keepLines w:val="0"/>
+        <w:widowControl/>
+        <w:suppressLineNumbers w:val="0"/>
+        <w:shd w:val="clear" w:fill="F8F8F8"/>
+        <w:spacing w:before="21" w:beforeAutospacing="0" w:after="42" w:afterAutospacing="0"/>
+        <w:ind w:left="0" w:firstLine="0"/>
+        <w:rPr>
+          <w:rFonts w:hint="eastAsia" w:asciiTheme="minorEastAsia" w:hAnsiTheme="minorEastAsia" w:eastAsiaTheme="minorEastAsia" w:cstheme="minorEastAsia"/>
+          <w:i w:val="0"/>
+          <w:iCs w:val="0"/>
+          <w:caps w:val="0"/>
+          <w:color w:val="3B3B3B"/>
+          <w:spacing w:val="0"/>
+          <w:sz w:val="15"/>
+          <w:szCs w:val="15"/>
+        </w:rPr>
+      </w:pPr>
+      <w:r>
+        <w:rPr>
+          <w:rFonts w:hint="eastAsia" w:asciiTheme="minorEastAsia" w:hAnsiTheme="minorEastAsia" w:eastAsiaTheme="minorEastAsia" w:cstheme="minorEastAsia"/>
+          <w:i w:val="0"/>
+          <w:iCs w:val="0"/>
+          <w:caps w:val="0"/>
+          <w:color w:val="3B3B3B"/>
+          <w:spacing w:val="0"/>
+          <w:sz w:val="15"/>
+          <w:szCs w:val="15"/>
+          <w:shd w:val="clear" w:fill="F8F8F8"/>
+        </w:rPr>
+        <w:t>（3）</w:t>
+      </w:r>
+      <w:r>
+        <w:rPr>
+          <w:rStyle w:val="17"/>
+          <w:rFonts w:hint="eastAsia" w:asciiTheme="minorEastAsia" w:hAnsiTheme="minorEastAsia" w:eastAsiaTheme="minorEastAsia" w:cstheme="minorEastAsia"/>
+          <w:i w:val="0"/>
+          <w:iCs w:val="0"/>
+          <w:caps w:val="0"/>
+          <w:color w:val="3B3B3B"/>
+          <w:spacing w:val="0"/>
+          <w:sz w:val="15"/>
+          <w:szCs w:val="15"/>
+          <w:shd w:val="clear" w:fill="F8F8F8"/>
+        </w:rPr>
+        <w:t>嵌入式调试手段匮乏</w:t>
+      </w:r>
+      <w:r>
+        <w:rPr>
+          <w:rFonts w:hint="eastAsia" w:asciiTheme="minorEastAsia" w:hAnsiTheme="minorEastAsia" w:eastAsiaTheme="minorEastAsia" w:cstheme="minorEastAsia"/>
+          <w:i w:val="0"/>
+          <w:iCs w:val="0"/>
+          <w:caps w:val="0"/>
+          <w:color w:val="3B3B3B"/>
+          <w:spacing w:val="0"/>
+          <w:sz w:val="15"/>
+          <w:szCs w:val="15"/>
+          <w:shd w:val="clear" w:fill="F8F8F8"/>
+        </w:rPr>
+        <w:t>。多数 RISC-V 开发板依赖串口输出或 JTAG 进行调试，缺乏面向机器人行为调试的专用工具（如逐帧状态追踪、实时性能火焰图、远程可视化面板）。</w:t>
+      </w:r>
+    </w:p>
+    <w:p>
+      <w:pPr>
+        <w:pStyle w:val="13"/>
+        <w:keepNext w:val="0"/>
+        <w:keepLines w:val="0"/>
+        <w:widowControl/>
+        <w:suppressLineNumbers w:val="0"/>
+        <w:shd w:val="clear" w:fill="F8F8F8"/>
+        <w:spacing w:before="21" w:beforeAutospacing="0" w:after="42" w:afterAutospacing="0"/>
+        <w:ind w:left="0" w:firstLine="0"/>
+        <w:rPr>
+          <w:rFonts w:hint="eastAsia" w:asciiTheme="minorEastAsia" w:hAnsiTheme="minorEastAsia" w:eastAsiaTheme="minorEastAsia" w:cstheme="minorEastAsia"/>
+          <w:i w:val="0"/>
+          <w:iCs w:val="0"/>
+          <w:caps w:val="0"/>
+          <w:color w:val="3B3B3B"/>
+          <w:spacing w:val="0"/>
+          <w:sz w:val="15"/>
+          <w:szCs w:val="15"/>
+        </w:rPr>
+      </w:pPr>
+      <w:r>
+        <w:rPr>
+          <w:rFonts w:hint="eastAsia" w:asciiTheme="minorEastAsia" w:hAnsiTheme="minorEastAsia" w:eastAsiaTheme="minorEastAsia" w:cstheme="minorEastAsia"/>
+          <w:i w:val="0"/>
+          <w:iCs w:val="0"/>
+          <w:caps w:val="0"/>
+          <w:color w:val="3B3B3B"/>
+          <w:spacing w:val="0"/>
+          <w:sz w:val="15"/>
+          <w:szCs w:val="15"/>
+          <w:shd w:val="clear" w:fill="F8F8F8"/>
+        </w:rPr>
+        <w:t>（4）</w:t>
+      </w:r>
+      <w:r>
+        <w:rPr>
+          <w:rStyle w:val="17"/>
+          <w:rFonts w:hint="eastAsia" w:asciiTheme="minorEastAsia" w:hAnsiTheme="minorEastAsia" w:eastAsiaTheme="minorEastAsia" w:cstheme="minorEastAsia"/>
+          <w:i w:val="0"/>
+          <w:iCs w:val="0"/>
+          <w:caps w:val="0"/>
+          <w:color w:val="3B3B3B"/>
+          <w:spacing w:val="0"/>
+          <w:sz w:val="15"/>
+          <w:szCs w:val="15"/>
+          <w:shd w:val="clear" w:fill="F8F8F8"/>
+        </w:rPr>
+        <w:t>内核驱动与用户态程序割裂开发</w:t>
+      </w:r>
+      <w:r>
+        <w:rPr>
+          <w:rFonts w:hint="eastAsia" w:asciiTheme="minorEastAsia" w:hAnsiTheme="minorEastAsia" w:eastAsiaTheme="minorEastAsia" w:cstheme="minorEastAsia"/>
+          <w:i w:val="0"/>
+          <w:iCs w:val="0"/>
+          <w:caps w:val="0"/>
+          <w:color w:val="3B3B3B"/>
+          <w:spacing w:val="0"/>
+          <w:sz w:val="15"/>
+          <w:szCs w:val="15"/>
+          <w:shd w:val="clear" w:fill="F8F8F8"/>
+        </w:rPr>
+        <w:t>。用户态开发者通常将内核驱动视为黑盒，当遇到性能瓶颈时缺乏跨层次分析手段。摄像头驱动、JPU 解码器、USB 主控等底层组件各自独立优化，缺乏端到端的性能建模与协同调优。</w:t>
+      </w:r>
+    </w:p>
+    <w:p>
+      <w:pPr>
+        <w:pStyle w:val="4"/>
+        <w:keepNext w:val="0"/>
+        <w:keepLines w:val="0"/>
+        <w:widowControl/>
+        <w:suppressLineNumbers w:val="0"/>
+        <w:shd w:val="clear" w:fill="F8F8F8"/>
+        <w:ind w:left="0" w:firstLine="0"/>
+        <w:rPr>
+          <w:rFonts w:hint="eastAsia" w:asciiTheme="minorEastAsia" w:hAnsiTheme="minorEastAsia" w:eastAsiaTheme="minorEastAsia" w:cstheme="minorEastAsia"/>
+          <w:i w:val="0"/>
+          <w:iCs w:val="0"/>
+          <w:caps w:val="0"/>
+          <w:color w:val="3B3B3B"/>
+          <w:spacing w:val="0"/>
+        </w:rPr>
+      </w:pPr>
+      <w:r>
+        <w:rPr>
+          <w:rFonts w:hint="eastAsia" w:asciiTheme="minorEastAsia" w:hAnsiTheme="minorEastAsia" w:eastAsiaTheme="minorEastAsia" w:cstheme="minorEastAsia"/>
+          <w:i w:val="0"/>
+          <w:iCs w:val="0"/>
+          <w:caps w:val="0"/>
+          <w:color w:val="3B3B3B"/>
+          <w:spacing w:val="0"/>
+          <w:shd w:val="clear" w:fill="F8F8F8"/>
+        </w:rPr>
+        <w:t>1.2.3 本项目的新颖之处</w:t>
+      </w:r>
+    </w:p>
+    <w:p>
+      <w:pPr>
+        <w:pStyle w:val="13"/>
+        <w:keepNext w:val="0"/>
+        <w:keepLines w:val="0"/>
+        <w:widowControl/>
+        <w:suppressLineNumbers w:val="0"/>
+        <w:shd w:val="clear" w:fill="F8F8F8"/>
+        <w:spacing w:before="21" w:beforeAutospacing="0" w:after="42" w:afterAutospacing="0"/>
+        <w:ind w:left="0" w:firstLine="0"/>
+        <w:rPr>
+          <w:rFonts w:hint="eastAsia" w:asciiTheme="minorEastAsia" w:hAnsiTheme="minorEastAsia" w:eastAsiaTheme="minorEastAsia" w:cstheme="minorEastAsia"/>
+          <w:i w:val="0"/>
+          <w:iCs w:val="0"/>
+          <w:caps w:val="0"/>
+          <w:color w:val="3B3B3B"/>
+          <w:spacing w:val="0"/>
+          <w:sz w:val="15"/>
+          <w:szCs w:val="15"/>
+        </w:rPr>
+      </w:pPr>
+      <w:r>
+        <w:rPr>
+          <w:rFonts w:hint="eastAsia" w:asciiTheme="minorEastAsia" w:hAnsiTheme="minorEastAsia" w:eastAsiaTheme="minorEastAsia" w:cstheme="minorEastAsia"/>
+          <w:i w:val="0"/>
+          <w:iCs w:val="0"/>
+          <w:caps w:val="0"/>
+          <w:color w:val="3B3B3B"/>
+          <w:spacing w:val="0"/>
+          <w:sz w:val="15"/>
+          <w:szCs w:val="15"/>
+          <w:shd w:val="clear" w:fill="F8F8F8"/>
+        </w:rPr>
+        <w:t>针对上述局限性，本项目在以下方面做出了创新性贡献：</w:t>
+      </w:r>
+    </w:p>
+    <w:p>
+      <w:pPr>
+        <w:pStyle w:val="13"/>
+        <w:keepNext w:val="0"/>
+        <w:keepLines w:val="0"/>
+        <w:widowControl/>
+        <w:suppressLineNumbers w:val="0"/>
+        <w:shd w:val="clear" w:fill="F8F8F8"/>
+        <w:spacing w:before="21" w:beforeAutospacing="0" w:after="42" w:afterAutospacing="0"/>
+        <w:ind w:left="0" w:firstLine="0"/>
+        <w:rPr>
+          <w:rFonts w:hint="eastAsia" w:asciiTheme="minorEastAsia" w:hAnsiTheme="minorEastAsia" w:eastAsiaTheme="minorEastAsia" w:cstheme="minorEastAsia"/>
+          <w:i w:val="0"/>
+          <w:iCs w:val="0"/>
+          <w:caps w:val="0"/>
+          <w:color w:val="3B3B3B"/>
+          <w:spacing w:val="0"/>
+          <w:sz w:val="15"/>
+          <w:szCs w:val="15"/>
+        </w:rPr>
+      </w:pPr>
+      <w:r>
+        <w:rPr>
+          <w:rFonts w:hint="eastAsia" w:asciiTheme="minorEastAsia" w:hAnsiTheme="minorEastAsia" w:eastAsiaTheme="minorEastAsia" w:cstheme="minorEastAsia"/>
+          <w:i w:val="0"/>
+          <w:iCs w:val="0"/>
+          <w:caps w:val="0"/>
+          <w:color w:val="3B3B3B"/>
+          <w:spacing w:val="0"/>
+          <w:sz w:val="15"/>
+          <w:szCs w:val="15"/>
+          <w:shd w:val="clear" w:fill="F8F8F8"/>
+        </w:rPr>
+        <w:t>（1）</w:t>
+      </w:r>
+      <w:r>
+        <w:rPr>
+          <w:rStyle w:val="17"/>
+          <w:rFonts w:hint="eastAsia" w:asciiTheme="minorEastAsia" w:hAnsiTheme="minorEastAsia" w:eastAsiaTheme="minorEastAsia" w:cstheme="minorEastAsia"/>
+          <w:i w:val="0"/>
+          <w:iCs w:val="0"/>
+          <w:caps w:val="0"/>
+          <w:color w:val="3B3B3B"/>
+          <w:spacing w:val="0"/>
+          <w:sz w:val="15"/>
+          <w:szCs w:val="15"/>
+          <w:shd w:val="clear" w:fill="F8F8F8"/>
+        </w:rPr>
+        <w:t>首次在 SG2002 平台实现完整自主抓取闭环</w:t>
+      </w:r>
+      <w:r>
+        <w:rPr>
+          <w:rFonts w:hint="eastAsia" w:asciiTheme="minorEastAsia" w:hAnsiTheme="minorEastAsia" w:eastAsiaTheme="minorEastAsia" w:cstheme="minorEastAsia"/>
+          <w:i w:val="0"/>
+          <w:iCs w:val="0"/>
+          <w:caps w:val="0"/>
+          <w:color w:val="3B3B3B"/>
+          <w:spacing w:val="0"/>
+          <w:sz w:val="15"/>
+          <w:szCs w:val="15"/>
+          <w:shd w:val="clear" w:fill="F8F8F8"/>
+        </w:rPr>
+        <w:t>。不同于现有 RISC-V 机器人项目多停留在基础运动控制或单帧视觉检测阶段，本项目实现了从摄像头采集→TPU 实时推理→自适应状态机决策→底盘导航→5 步机械臂抓取→远程监控的完整端到端系统。</w:t>
+      </w:r>
+    </w:p>
+    <w:p>
+      <w:pPr>
+        <w:pStyle w:val="13"/>
+        <w:keepNext w:val="0"/>
+        <w:keepLines w:val="0"/>
+        <w:widowControl/>
+        <w:suppressLineNumbers w:val="0"/>
+        <w:shd w:val="clear" w:fill="F8F8F8"/>
+        <w:spacing w:before="21" w:beforeAutospacing="0" w:after="42" w:afterAutospacing="0"/>
+        <w:ind w:left="0" w:firstLine="0"/>
+        <w:rPr>
+          <w:rFonts w:hint="eastAsia" w:asciiTheme="minorEastAsia" w:hAnsiTheme="minorEastAsia" w:eastAsiaTheme="minorEastAsia" w:cstheme="minorEastAsia"/>
+          <w:i w:val="0"/>
+          <w:iCs w:val="0"/>
+          <w:caps w:val="0"/>
+          <w:color w:val="3B3B3B"/>
+          <w:spacing w:val="0"/>
+          <w:sz w:val="15"/>
+          <w:szCs w:val="15"/>
+        </w:rPr>
+      </w:pPr>
+      <w:r>
+        <w:rPr>
+          <w:rFonts w:hint="eastAsia" w:asciiTheme="minorEastAsia" w:hAnsiTheme="minorEastAsia" w:eastAsiaTheme="minorEastAsia" w:cstheme="minorEastAsia"/>
+          <w:i w:val="0"/>
+          <w:iCs w:val="0"/>
+          <w:caps w:val="0"/>
+          <w:color w:val="3B3B3B"/>
+          <w:spacing w:val="0"/>
+          <w:sz w:val="15"/>
+          <w:szCs w:val="15"/>
+          <w:shd w:val="clear" w:fill="F8F8F8"/>
+        </w:rPr>
+        <w:t>（2）</w:t>
+      </w:r>
+      <w:r>
+        <w:rPr>
+          <w:rStyle w:val="17"/>
+          <w:rFonts w:hint="eastAsia" w:asciiTheme="minorEastAsia" w:hAnsiTheme="minorEastAsia" w:eastAsiaTheme="minorEastAsia" w:cstheme="minorEastAsia"/>
+          <w:i w:val="0"/>
+          <w:iCs w:val="0"/>
+          <w:caps w:val="0"/>
+          <w:color w:val="3B3B3B"/>
+          <w:spacing w:val="0"/>
+          <w:sz w:val="15"/>
+          <w:szCs w:val="15"/>
+          <w:shd w:val="clear" w:fill="F8F8F8"/>
+        </w:rPr>
+        <w:t>端到端采集管道优化方法论</w:t>
+      </w:r>
+      <w:r>
+        <w:rPr>
+          <w:rFonts w:hint="eastAsia" w:asciiTheme="minorEastAsia" w:hAnsiTheme="minorEastAsia" w:eastAsiaTheme="minorEastAsia" w:cstheme="minorEastAsia"/>
+          <w:i w:val="0"/>
+          <w:iCs w:val="0"/>
+          <w:caps w:val="0"/>
+          <w:color w:val="3B3B3B"/>
+          <w:spacing w:val="0"/>
+          <w:sz w:val="15"/>
+          <w:szCs w:val="15"/>
+          <w:shd w:val="clear" w:fill="F8F8F8"/>
+        </w:rPr>
+        <w:t>。通过交叉阅读内核驱动源码定位瓶颈，并设计量化诊断工具（diagnose_timing）验证假设，将帧率从 0.3 FPS 提升至 3–5 FPS（15 倍）。这一方法论可推广到其他 RISC-V 嵌入式视觉系统。</w:t>
+      </w:r>
+    </w:p>
+    <w:p>
+      <w:pPr>
+        <w:pStyle w:val="13"/>
+        <w:keepNext w:val="0"/>
+        <w:keepLines w:val="0"/>
+        <w:widowControl/>
+        <w:suppressLineNumbers w:val="0"/>
+        <w:shd w:val="clear" w:fill="F8F8F8"/>
+        <w:spacing w:before="21" w:beforeAutospacing="0" w:after="42" w:afterAutospacing="0"/>
+        <w:ind w:left="0" w:firstLine="0"/>
+        <w:rPr>
+          <w:rFonts w:hint="eastAsia" w:asciiTheme="minorEastAsia" w:hAnsiTheme="minorEastAsia" w:eastAsiaTheme="minorEastAsia" w:cstheme="minorEastAsia"/>
+          <w:i w:val="0"/>
+          <w:iCs w:val="0"/>
+          <w:caps w:val="0"/>
+          <w:color w:val="3B3B3B"/>
+          <w:spacing w:val="0"/>
+          <w:sz w:val="15"/>
+          <w:szCs w:val="15"/>
+        </w:rPr>
+      </w:pPr>
+      <w:r>
+        <w:rPr>
+          <w:rFonts w:hint="eastAsia" w:asciiTheme="minorEastAsia" w:hAnsiTheme="minorEastAsia" w:eastAsiaTheme="minorEastAsia" w:cstheme="minorEastAsia"/>
+          <w:i w:val="0"/>
+          <w:iCs w:val="0"/>
+          <w:caps w:val="0"/>
+          <w:color w:val="3B3B3B"/>
+          <w:spacing w:val="0"/>
+          <w:sz w:val="15"/>
+          <w:szCs w:val="15"/>
+          <w:shd w:val="clear" w:fill="F8F8F8"/>
+        </w:rPr>
+        <w:t>（3）</w:t>
+      </w:r>
+      <w:r>
+        <w:rPr>
+          <w:rStyle w:val="17"/>
+          <w:rFonts w:hint="eastAsia" w:asciiTheme="minorEastAsia" w:hAnsiTheme="minorEastAsia" w:eastAsiaTheme="minorEastAsia" w:cstheme="minorEastAsia"/>
+          <w:i w:val="0"/>
+          <w:iCs w:val="0"/>
+          <w:caps w:val="0"/>
+          <w:color w:val="3B3B3B"/>
+          <w:spacing w:val="0"/>
+          <w:sz w:val="15"/>
+          <w:szCs w:val="15"/>
+          <w:shd w:val="clear" w:fill="F8F8F8"/>
+        </w:rPr>
+        <w:t>极低帧率专用控制策略</w:t>
+      </w:r>
+      <w:r>
+        <w:rPr>
+          <w:rFonts w:hint="eastAsia" w:asciiTheme="minorEastAsia" w:hAnsiTheme="minorEastAsia" w:eastAsiaTheme="minorEastAsia" w:cstheme="minorEastAsia"/>
+          <w:i w:val="0"/>
+          <w:iCs w:val="0"/>
+          <w:caps w:val="0"/>
+          <w:color w:val="3B3B3B"/>
+          <w:spacing w:val="0"/>
+          <w:sz w:val="15"/>
+          <w:szCs w:val="15"/>
+          <w:shd w:val="clear" w:fill="F8F8F8"/>
+        </w:rPr>
+        <w:t>。针对 0.3 FPS 条件下传统控制器失效的问题，设计了自适应二次速度衰减曲线和面积迟滞逻辑。该控制策略不依赖高帧率，可直接应用于其他资源受限的嵌入式机器人平台。</w:t>
+      </w:r>
+    </w:p>
+    <w:p>
+      <w:pPr>
+        <w:pStyle w:val="13"/>
+        <w:keepNext w:val="0"/>
+        <w:keepLines w:val="0"/>
+        <w:widowControl/>
+        <w:suppressLineNumbers w:val="0"/>
+        <w:shd w:val="clear" w:fill="F8F8F8"/>
+        <w:spacing w:before="21" w:beforeAutospacing="0" w:after="42" w:afterAutospacing="0"/>
+        <w:ind w:left="0" w:firstLine="0"/>
+        <w:rPr>
+          <w:rFonts w:hint="eastAsia" w:asciiTheme="minorEastAsia" w:hAnsiTheme="minorEastAsia" w:eastAsiaTheme="minorEastAsia" w:cstheme="minorEastAsia"/>
+          <w:i w:val="0"/>
+          <w:iCs w:val="0"/>
+          <w:caps w:val="0"/>
+          <w:color w:val="3B3B3B"/>
+          <w:spacing w:val="0"/>
+          <w:sz w:val="15"/>
+          <w:szCs w:val="15"/>
+        </w:rPr>
+      </w:pPr>
+      <w:r>
+        <w:rPr>
+          <w:rFonts w:hint="eastAsia" w:asciiTheme="minorEastAsia" w:hAnsiTheme="minorEastAsia" w:eastAsiaTheme="minorEastAsia" w:cstheme="minorEastAsia"/>
+          <w:i w:val="0"/>
+          <w:iCs w:val="0"/>
+          <w:caps w:val="0"/>
+          <w:color w:val="3B3B3B"/>
+          <w:spacing w:val="0"/>
+          <w:sz w:val="15"/>
+          <w:szCs w:val="15"/>
+          <w:shd w:val="clear" w:fill="F8F8F8"/>
+        </w:rPr>
+        <w:t>（4）</w:t>
+      </w:r>
+      <w:r>
+        <w:rPr>
+          <w:rStyle w:val="17"/>
+          <w:rFonts w:hint="eastAsia" w:asciiTheme="minorEastAsia" w:hAnsiTheme="minorEastAsia" w:eastAsiaTheme="minorEastAsia" w:cstheme="minorEastAsia"/>
+          <w:i w:val="0"/>
+          <w:iCs w:val="0"/>
+          <w:caps w:val="0"/>
+          <w:color w:val="3B3B3B"/>
+          <w:spacing w:val="0"/>
+          <w:sz w:val="15"/>
+          <w:szCs w:val="15"/>
+          <w:shd w:val="clear" w:fill="F8F8F8"/>
+        </w:rPr>
+        <w:t>软硬件协同设计架构</w:t>
+      </w:r>
+      <w:r>
+        <w:rPr>
+          <w:rFonts w:hint="eastAsia" w:asciiTheme="minorEastAsia" w:hAnsiTheme="minorEastAsia" w:eastAsiaTheme="minorEastAsia" w:cstheme="minorEastAsia"/>
+          <w:i w:val="0"/>
+          <w:iCs w:val="0"/>
+          <w:caps w:val="0"/>
+          <w:color w:val="3B3B3B"/>
+          <w:spacing w:val="0"/>
+          <w:sz w:val="15"/>
+          <w:szCs w:val="15"/>
+          <w:shd w:val="clear" w:fill="F8F8F8"/>
+        </w:rPr>
+        <w:t>。用户态程序与内核态驱动由同一团队协同开发，从系统全局视角优化数据管道。用户态提供详细的采集性能数据反馈给内核态，内核态根据用户态需求定制 ioctl 接口和缓冲管理策略。</w:t>
+      </w:r>
+    </w:p>
+    <w:p>
+      <w:pPr>
+        <w:pStyle w:val="13"/>
+        <w:keepNext w:val="0"/>
+        <w:keepLines w:val="0"/>
+        <w:widowControl/>
+        <w:suppressLineNumbers w:val="0"/>
+        <w:shd w:val="clear" w:fill="F8F8F8"/>
+        <w:spacing w:before="21" w:beforeAutospacing="0" w:after="42" w:afterAutospacing="0"/>
+        <w:ind w:left="0" w:firstLine="0"/>
+        <w:rPr>
+          <w:rFonts w:hint="eastAsia" w:asciiTheme="minorEastAsia" w:hAnsiTheme="minorEastAsia" w:eastAsiaTheme="minorEastAsia" w:cstheme="minorEastAsia"/>
+          <w:i w:val="0"/>
+          <w:iCs w:val="0"/>
+          <w:caps w:val="0"/>
+          <w:color w:val="3B3B3B"/>
+          <w:spacing w:val="0"/>
+          <w:sz w:val="15"/>
+          <w:szCs w:val="15"/>
+        </w:rPr>
+      </w:pPr>
+      <w:r>
+        <w:rPr>
+          <w:rFonts w:hint="eastAsia" w:asciiTheme="minorEastAsia" w:hAnsiTheme="minorEastAsia" w:eastAsiaTheme="minorEastAsia" w:cstheme="minorEastAsia"/>
+          <w:i w:val="0"/>
+          <w:iCs w:val="0"/>
+          <w:caps w:val="0"/>
+          <w:color w:val="3B3B3B"/>
+          <w:spacing w:val="0"/>
+          <w:sz w:val="15"/>
+          <w:szCs w:val="15"/>
+          <w:shd w:val="clear" w:fill="F8F8F8"/>
+        </w:rPr>
+        <w:t>（5）</w:t>
+      </w:r>
+      <w:r>
+        <w:rPr>
+          <w:rStyle w:val="17"/>
+          <w:rFonts w:hint="eastAsia" w:asciiTheme="minorEastAsia" w:hAnsiTheme="minorEastAsia" w:eastAsiaTheme="minorEastAsia" w:cstheme="minorEastAsia"/>
+          <w:i w:val="0"/>
+          <w:iCs w:val="0"/>
+          <w:caps w:val="0"/>
+          <w:color w:val="3B3B3B"/>
+          <w:spacing w:val="0"/>
+          <w:sz w:val="15"/>
+          <w:szCs w:val="15"/>
+          <w:shd w:val="clear" w:fill="F8F8F8"/>
+        </w:rPr>
+        <w:t>完善的调试与可观测性基础设施</w:t>
+      </w:r>
+      <w:r>
+        <w:rPr>
+          <w:rFonts w:hint="eastAsia" w:asciiTheme="minorEastAsia" w:hAnsiTheme="minorEastAsia" w:eastAsiaTheme="minorEastAsia" w:cstheme="minorEastAsia"/>
+          <w:i w:val="0"/>
+          <w:iCs w:val="0"/>
+          <w:caps w:val="0"/>
+          <w:color w:val="3B3B3B"/>
+          <w:spacing w:val="0"/>
+          <w:sz w:val="15"/>
+          <w:szCs w:val="15"/>
+          <w:shd w:val="clear" w:fill="F8F8F8"/>
+        </w:rPr>
+        <w:t>。建立了逐帧时间线、状态追踪、性能诊断、Web 远程可视化面板和 10 个独立测试工具的完整调试体系，弥补了 RISC-V 嵌入式平台机器人调试工具的空白</w:t>
+      </w:r>
+    </w:p>
+    <w:p>
+      <w:pPr>
+        <w:ind w:firstLine="199" w:firstLineChars="83"/>
+        <w:rPr>
+          <w:rFonts w:hint="eastAsia"/>
+        </w:rPr>
         <w:sectPr>
           <w:footerReference r:id="rId12" w:type="default"/>
           <w:pgSz w:w="12240" w:h="15840"/>
@@ -570,12 +1631,6 @@
           <w:docGrid w:linePitch="360" w:charSpace="0"/>
         </w:sectPr>
       </w:pPr>
-      <w:r>
-        <w:rPr>
-          <w:rFonts w:hint="eastAsia"/>
-        </w:rPr>
-        <w:t>对该领域或同类功能软件的优缺点进行分析与描述，并对所提交软件作品设计的新颖之处进行较为全面的描述。</w:t>
-      </w:r>
     </w:p>
     <w:p>
       <w:pPr>
@@ -613,6 +1668,16 @@
         </w:rPr>
         <w:t>对该软件设计过程使用的研究方法、软件开发思想进行简要的描述。</w:t>
       </w:r>
+    </w:p>
+    <w:p>
+      <w:pPr>
+        <w:ind w:firstLine="480"/>
+      </w:pPr>
+    </w:p>
+    <w:p>
+      <w:pPr>
+        <w:ind w:firstLine="480"/>
+      </w:pPr>
     </w:p>
     <w:p>
       <w:pPr>
@@ -826,7 +1891,15 @@
         <w:rPr>
           <w:rFonts w:hint="eastAsia"/>
         </w:rPr>
-        <w:t>详细介绍每个功能模块具有的功能及作用、用途。</w:t>
+        <w:t>详细介绍每个功能模块具有</w:t>
+      </w:r>
+      <w:bookmarkStart w:id="1" w:name="_GoBack"/>
+      <w:bookmarkEnd w:id="1"/>
+      <w:r>
+        <w:rPr>
+          <w:rFonts w:hint="eastAsia"/>
+        </w:rPr>
+        <w:t>的功能及作用、用途。</w:t>
       </w:r>
     </w:p>
     <w:p>
@@ -1009,35 +2082,102 @@
     <w:p>
       <w:pPr>
         <w:ind w:firstLine="480"/>
-        <w:sectPr>
-          <w:pgSz w:w="12240" w:h="15840"/>
-          <w:pgMar w:top="1701" w:right="1418" w:bottom="1134" w:left="1418" w:header="720" w:footer="720" w:gutter="0"/>
-          <w:cols w:space="720" w:num="1"/>
-          <w:docGrid w:linePitch="360" w:charSpace="0"/>
-        </w:sectPr>
-      </w:pPr>
-    </w:p>
-    <w:p>
-      <w:pPr>
-        <w:pStyle w:val="2"/>
-        <w:spacing w:before="120" w:after="120"/>
-      </w:pPr>
-      <w:r>
-        <w:rPr>
-          <w:rFonts w:hint="eastAsia"/>
-        </w:rPr>
-        <w:t xml:space="preserve"> 实现难点说明</w:t>
-      </w:r>
-    </w:p>
-    <w:p>
-      <w:pPr>
-        <w:ind w:firstLine="199" w:firstLineChars="83"/>
-      </w:pPr>
-      <w:r>
-        <w:rPr>
-          <w:rFonts w:hint="eastAsia"/>
-        </w:rPr>
-        <w:t>此章节为可选章节，当软件包含需要做出独立的解释性说明的算法或新型技术时，应自行选择合理的组织结构对相关算法、技术进行说明。</w:t>
+      </w:pPr>
+    </w:p>
+    <w:p>
+      <w:pPr>
+        <w:ind w:firstLine="480"/>
+      </w:pPr>
+    </w:p>
+    <w:p>
+      <w:pPr>
+        <w:ind w:firstLine="480"/>
+      </w:pPr>
+    </w:p>
+    <w:p>
+      <w:pPr>
+        <w:spacing w:after="60" w:line="276" w:lineRule="auto"/>
+      </w:pPr>
+      <w:r>
+        <w:rPr>
+          <w:rFonts w:ascii="微软雅黑" w:hAnsi="微软雅黑" w:eastAsia="微软雅黑"/>
+          <w:b/>
+          <w:sz w:val="20"/>
+        </w:rPr>
+        <w:t>优化前（原始版本）：camera capture ~2845ms (92%) + preprocess ~60ms (2%) + forward ~45ms (1.5%) + post ~14ms (0.5%) = ~3100ms/帧 ≈ 0.32 FPS</w:t>
+      </w:r>
+    </w:p>
+    <w:p>
+      <w:pPr>
+        <w:spacing w:after="100" w:line="276" w:lineRule="auto"/>
+        <w:rPr>
+          <w:rFonts w:ascii="微软雅黑" w:hAnsi="微软雅黑" w:eastAsia="微软雅黑"/>
+          <w:b/>
+          <w:sz w:val="20"/>
+        </w:rPr>
+      </w:pPr>
+      <w:r>
+        <w:rPr>
+          <w:rFonts w:ascii="微软雅黑" w:hAnsi="微软雅黑" w:eastAsia="微软雅黑"/>
+          <w:b/>
+          <w:sz w:val="20"/>
+        </w:rPr>
+        <w:t>优化后（当前版本）：camera capture ~63ms (33%) + preprocess ~56ms (29%) + forward ~44ms (23%) + post ~14ms (7%) = ~190ms/帧 ≈ 3–5 FPS</w:t>
+      </w:r>
+    </w:p>
+    <w:p>
+      <w:pPr>
+        <w:spacing w:after="100" w:line="276" w:lineRule="auto"/>
+        <w:rPr>
+          <w:rFonts w:hint="default" w:ascii="微软雅黑" w:hAnsi="微软雅黑" w:eastAsia="微软雅黑"/>
+          <w:b/>
+          <w:sz w:val="20"/>
+          <w:lang w:val="en-US" w:eastAsia="zh-CN"/>
+        </w:rPr>
+      </w:pPr>
+      <w:r>
+        <w:rPr>
+          <w:rFonts w:hint="eastAsia" w:ascii="微软雅黑" w:hAnsi="微软雅黑" w:eastAsia="微软雅黑"/>
+          <w:b/>
+          <w:sz w:val="20"/>
+          <w:lang w:val="en-US" w:eastAsia="zh-CN"/>
+        </w:rPr>
+        <w:t xml:space="preserve">dfdsds      </w:t>
+      </w:r>
+    </w:p>
+    <w:p>
+      <w:pPr>
+        <w:spacing w:after="100" w:line="276" w:lineRule="auto"/>
+        <w:rPr>
+          <w:rFonts w:hint="default" w:ascii="微软雅黑" w:hAnsi="微软雅黑" w:eastAsia="微软雅黑"/>
+          <w:b/>
+          <w:sz w:val="20"/>
+          <w:lang w:val="en-US" w:eastAsia="zh-CN"/>
+        </w:rPr>
+      </w:pPr>
+    </w:p>
+    <w:p>
+      <w:pPr>
+        <w:spacing w:after="120" w:line="276" w:lineRule="auto"/>
+      </w:pPr>
+      <w:r>
+        <w:rPr>
+          <w:rFonts w:ascii="微软雅黑" w:hAnsi="微软雅黑" w:eastAsia="微软雅黑"/>
+          <w:sz w:val="20"/>
+        </w:rPr>
+        <w:t>关键优化对比：camera capture 45× | 每帧总时间 16× | FPS 12–16× | per-frame 堆分配 2MB→0 | letterbox memset 1.2MB→0.3MB | 搜索有效转动占比 3.3%→100%</w:t>
+      </w:r>
+    </w:p>
+    <w:p>
+      <w:pPr>
+        <w:spacing w:after="200" w:line="276" w:lineRule="auto"/>
+      </w:pPr>
+      <w:r>
+        <w:rPr>
+          <w:rFonts w:ascii="微软雅黑" w:hAnsi="微软雅黑" w:eastAsia="微软雅黑"/>
+          <w:sz w:val="20"/>
+        </w:rPr>
+        <w:t>核心优化点：通过分析 StarryOS 内核驱动源码中的 UVC FID 状态机机制，定位到每帧 INIT ioctl 导致摄像头 AE/AWB 重新收敛（约 3 秒）的根因。将 INIT 移到 GET_FRAME 之前（零间隙），使流管道保持持续活跃。</w:t>
       </w:r>
     </w:p>
     <w:p>
@@ -1060,50 +2200,18 @@
         <w:rPr>
           <w:rFonts w:hint="eastAsia"/>
         </w:rPr>
-        <w:t>总 结</w:t>
-      </w:r>
-    </w:p>
-    <w:p>
-      <w:pPr>
-        <w:ind w:firstLine="480"/>
-      </w:pPr>
-      <w:r>
-        <w:rPr>
-          <w:rFonts w:hint="eastAsia"/>
-        </w:rPr>
-        <w:t>在此章节，可对项目整体过程、结果的完成度进行说明，如项目整体并未开发完成，亦可展望未来的工作和期许。</w:t>
-      </w:r>
-    </w:p>
-    <w:p>
-      <w:pPr>
-        <w:ind w:firstLine="480"/>
-      </w:pPr>
-    </w:p>
-    <w:p>
-      <w:pPr>
-        <w:ind w:firstLine="480"/>
-      </w:pPr>
-      <w:r>
-        <w:rPr>
-          <w:rFonts w:hint="eastAsia"/>
-        </w:rPr>
-        <w:t>如此次参赛有特别收获，也可以简要的讲述。</w:t>
-      </w:r>
-    </w:p>
-    <w:p>
-      <w:pPr>
-        <w:ind w:firstLine="480"/>
-      </w:pPr>
-    </w:p>
-    <w:p>
-      <w:pPr>
-        <w:ind w:firstLine="480"/>
-      </w:pPr>
-      <w:r>
-        <w:rPr>
-          <w:rFonts w:hint="eastAsia"/>
-        </w:rPr>
-        <w:t>此外，如需对使用的开源软件、开放知识作者进行鸣谢，也可在此处进行。</w:t>
+        <w:t xml:space="preserve"> 实现难点说明</w:t>
+      </w:r>
+    </w:p>
+    <w:p>
+      <w:pPr>
+        <w:ind w:firstLine="199" w:firstLineChars="83"/>
+      </w:pPr>
+      <w:r>
+        <w:rPr>
+          <w:rFonts w:hint="eastAsia"/>
+        </w:rPr>
+        <w:t>此章节为可选章节，当软件包含需要做出独立的解释性说明的算法或新型技术时，应自行选择合理的组织结构对相关算法、技术进行说明。</w:t>
       </w:r>
     </w:p>
     <w:p>
@@ -1119,13 +2227,79 @@
     </w:p>
     <w:p>
       <w:pPr>
-        <w:pStyle w:val="38"/>
+        <w:pStyle w:val="2"/>
         <w:spacing w:before="120" w:after="120"/>
       </w:pPr>
       <w:r>
         <w:rPr>
           <w:rFonts w:hint="eastAsia"/>
         </w:rPr>
+        <w:t>总 结</w:t>
+      </w:r>
+    </w:p>
+    <w:p>
+      <w:pPr>
+        <w:ind w:firstLine="480"/>
+      </w:pPr>
+      <w:r>
+        <w:rPr>
+          <w:rFonts w:hint="eastAsia"/>
+        </w:rPr>
+        <w:t>在此章节，可对项目整体过程、结果的完成度进行说明，如项目整体并未开发完成，亦可展望未来的工作和期许。</w:t>
+      </w:r>
+    </w:p>
+    <w:p>
+      <w:pPr>
+        <w:ind w:firstLine="480"/>
+      </w:pPr>
+    </w:p>
+    <w:p>
+      <w:pPr>
+        <w:ind w:firstLine="480"/>
+      </w:pPr>
+      <w:r>
+        <w:rPr>
+          <w:rFonts w:hint="eastAsia"/>
+        </w:rPr>
+        <w:t>如此次参赛有特别收获，也可以简要的讲述。</w:t>
+      </w:r>
+    </w:p>
+    <w:p>
+      <w:pPr>
+        <w:ind w:firstLine="480"/>
+      </w:pPr>
+    </w:p>
+    <w:p>
+      <w:pPr>
+        <w:ind w:firstLine="480"/>
+      </w:pPr>
+      <w:r>
+        <w:rPr>
+          <w:rFonts w:hint="eastAsia"/>
+        </w:rPr>
+        <w:t>此外，如需对使用的开源软件、开放知识作者进行鸣谢，也可在此处进行。</w:t>
+      </w:r>
+    </w:p>
+    <w:p>
+      <w:pPr>
+        <w:ind w:firstLine="480"/>
+        <w:sectPr>
+          <w:pgSz w:w="12240" w:h="15840"/>
+          <w:pgMar w:top="1701" w:right="1418" w:bottom="1134" w:left="1418" w:header="720" w:footer="720" w:gutter="0"/>
+          <w:cols w:space="720" w:num="1"/>
+          <w:docGrid w:linePitch="360" w:charSpace="0"/>
+        </w:sectPr>
+      </w:pPr>
+    </w:p>
+    <w:p>
+      <w:pPr>
+        <w:pStyle w:val="40"/>
+        <w:spacing w:before="120" w:after="120"/>
+      </w:pPr>
+      <w:r>
+        <w:rPr>
+          <w:rFonts w:hint="eastAsia"/>
+        </w:rPr>
         <w:t>参 考</w:t>
       </w:r>
     </w:p>
@@ -1142,7 +2316,7 @@
     </w:p>
     <w:p>
       <w:pPr>
-        <w:pStyle w:val="26"/>
+        <w:pStyle w:val="28"/>
         <w:numPr>
           <w:ilvl w:val="0"/>
           <w:numId w:val="2"/>
@@ -1158,7 +2332,7 @@
     </w:p>
     <w:p>
       <w:pPr>
-        <w:pStyle w:val="26"/>
+        <w:pStyle w:val="28"/>
         <w:numPr>
           <w:ilvl w:val="0"/>
           <w:numId w:val="2"/>
@@ -1245,13 +2419,13 @@
       </w:r>
       <w:r>
         <w:rPr>
-          <w:rStyle w:val="16"/>
+          <w:rStyle w:val="18"/>
         </w:rPr>
         <w:t>https://www.ibm.com/cn-zh/topics/open-source</w:t>
       </w:r>
       <w:r>
         <w:rPr>
-          <w:rStyle w:val="16"/>
+          <w:rStyle w:val="18"/>
         </w:rPr>
         <w:fldChar w:fldCharType="end"/>
       </w:r>
@@ -1261,7 +2435,7 @@
     </w:p>
     <w:p>
       <w:pPr>
-        <w:pStyle w:val="26"/>
+        <w:pStyle w:val="28"/>
         <w:ind w:left="840" w:firstLine="0" w:firstLineChars="0"/>
       </w:pPr>
     </w:p>
@@ -1421,7 +2595,7 @@
 <w:ftr xmlns:wpc="http://schemas.microsoft.com/office/word/2010/wordprocessingCanvas" xmlns:mc="http://schemas.openxmlformats.org/markup-compatibility/2006" xmlns:o="urn:schemas-microsoft-com:office:office" xmlns:r="http://schemas.openxmlformats.org/officeDocument/2006/relationships" xmlns:m="http://schemas.openxmlformats.org/officeDocument/2006/math" xmlns:v="urn:schemas-microsoft-com:vml" xmlns:wp14="http://schemas.microsoft.com/office/word/2010/wordprocessingDrawing" xmlns:wp="http://schemas.openxmlformats.org/drawingml/2006/wordprocessingDrawing" xmlns:w10="urn:schemas-microsoft-com:office:word" xmlns:w="http://schemas.openxmlformats.org/wordprocessingml/2006/main" xmlns:w14="http://schemas.microsoft.com/office/word/2010/wordml" xmlns:w15="http://schemas.microsoft.com/office/word/2012/wordml" xmlns:wpg="http://schemas.microsoft.com/office/word/2010/wordprocessingGroup" xmlns:wpi="http://schemas.microsoft.com/office/word/2010/wordprocessingInk" xmlns:wne="http://schemas.microsoft.com/office/word/2006/wordml" xmlns:wps="http://schemas.microsoft.com/office/word/2010/wordprocessingShape" xmlns:wpsCustomData="http://www.wps.cn/officeDocument/2013/wpsCustomData" mc:Ignorable="w14 w15 wp14">
   <w:sdt>
     <w:sdtPr>
-      <w:id w:val="-1827584317"/>
+      <w:id w:val="-1"/>
     </w:sdtPr>
     <w:sdtContent>
       <w:p>
@@ -1464,7 +2638,7 @@
 <w:ftr xmlns:wpc="http://schemas.microsoft.com/office/word/2010/wordprocessingCanvas" xmlns:mc="http://schemas.openxmlformats.org/markup-compatibility/2006" xmlns:o="urn:schemas-microsoft-com:office:office" xmlns:r="http://schemas.openxmlformats.org/officeDocument/2006/relationships" xmlns:m="http://schemas.openxmlformats.org/officeDocument/2006/math" xmlns:v="urn:schemas-microsoft-com:vml" xmlns:wp14="http://schemas.microsoft.com/office/word/2010/wordprocessingDrawing" xmlns:wp="http://schemas.openxmlformats.org/drawingml/2006/wordprocessingDrawing" xmlns:w10="urn:schemas-microsoft-com:office:word" xmlns:w="http://schemas.openxmlformats.org/wordprocessingml/2006/main" xmlns:w14="http://schemas.microsoft.com/office/word/2010/wordml" xmlns:w15="http://schemas.microsoft.com/office/word/2012/wordml" xmlns:wpg="http://schemas.microsoft.com/office/word/2010/wordprocessingGroup" xmlns:wpi="http://schemas.microsoft.com/office/word/2010/wordprocessingInk" xmlns:wne="http://schemas.microsoft.com/office/word/2006/wordml" xmlns:wps="http://schemas.microsoft.com/office/word/2010/wordprocessingShape" xmlns:wpsCustomData="http://www.wps.cn/officeDocument/2013/wpsCustomData" mc:Ignorable="w14 w15 wp14">
   <w:sdt>
     <w:sdtPr>
-      <w:id w:val="-502747747"/>
+      <w:id w:val="897342106"/>
     </w:sdtPr>
     <w:sdtContent>
       <w:p>
@@ -1799,7 +2973,7 @@
   <w:docDefaults>
     <w:rPrDefault>
       <w:rPr>
-        <w:rFonts w:asciiTheme="minorHAnsi" w:hAnsiTheme="minorHAnsi" w:eastAsiaTheme="minorEastAsia" w:cstheme="minorBidi"/>
+        <w:rFonts w:ascii="Times New Roman" w:hAnsi="Times New Roman" w:eastAsia="宋体" w:cs="Times New Roman"/>
       </w:rPr>
     </w:rPrDefault>
     <w:pPrDefault/>
@@ -1897,7 +3071,7 @@
     <w:lsdException w:uiPriority="99" w:name="Document Map"/>
     <w:lsdException w:uiPriority="99" w:name="Plain Text"/>
     <w:lsdException w:uiPriority="99" w:name="E-mail Signature"/>
-    <w:lsdException w:uiPriority="99" w:name="Normal (Web)"/>
+    <w:lsdException w:qFormat="1" w:uiPriority="99" w:name="Normal (Web)"/>
     <w:lsdException w:uiPriority="99" w:name="HTML Acronym"/>
     <w:lsdException w:uiPriority="99" w:name="HTML Address"/>
     <w:lsdException w:uiPriority="99" w:name="HTML Cite"/>
@@ -2073,7 +3247,7 @@
   <w:style w:type="paragraph" w:styleId="2">
     <w:name w:val="heading 1"/>
     <w:next w:val="1"/>
-    <w:link w:val="17"/>
+    <w:link w:val="19"/>
     <w:qFormat/>
     <w:uiPriority w:val="9"/>
     <w:pPr>
@@ -2104,7 +3278,7 @@
     <w:name w:val="heading 2"/>
     <w:basedOn w:val="2"/>
     <w:next w:val="1"/>
-    <w:link w:val="18"/>
+    <w:link w:val="20"/>
     <w:unhideWhenUsed/>
     <w:qFormat/>
     <w:uiPriority w:val="9"/>
@@ -2125,7 +3299,7 @@
     <w:name w:val="heading 3"/>
     <w:basedOn w:val="3"/>
     <w:next w:val="1"/>
-    <w:link w:val="19"/>
+    <w:link w:val="21"/>
     <w:unhideWhenUsed/>
     <w:qFormat/>
     <w:uiPriority w:val="9"/>
@@ -2147,7 +3321,7 @@
     <w:name w:val="heading 4"/>
     <w:basedOn w:val="4"/>
     <w:next w:val="1"/>
-    <w:link w:val="20"/>
+    <w:link w:val="22"/>
     <w:unhideWhenUsed/>
     <w:qFormat/>
     <w:uiPriority w:val="9"/>
@@ -2166,7 +3340,7 @@
     <w:name w:val="heading 5"/>
     <w:basedOn w:val="5"/>
     <w:next w:val="1"/>
-    <w:link w:val="21"/>
+    <w:link w:val="23"/>
     <w:unhideWhenUsed/>
     <w:qFormat/>
     <w:uiPriority w:val="9"/>
@@ -2181,7 +3355,7 @@
     <w:name w:val="heading 6"/>
     <w:basedOn w:val="6"/>
     <w:next w:val="1"/>
-    <w:link w:val="22"/>
+    <w:link w:val="24"/>
     <w:unhideWhenUsed/>
     <w:qFormat/>
     <w:uiPriority w:val="9"/>
@@ -2197,7 +3371,7 @@
     <w:name w:val="heading 7"/>
     <w:basedOn w:val="7"/>
     <w:next w:val="1"/>
-    <w:link w:val="23"/>
+    <w:link w:val="25"/>
     <w:unhideWhenUsed/>
     <w:qFormat/>
     <w:uiPriority w:val="9"/>
@@ -2215,7 +3389,7 @@
     <w:name w:val="heading 8"/>
     <w:basedOn w:val="8"/>
     <w:next w:val="1"/>
-    <w:link w:val="24"/>
+    <w:link w:val="26"/>
     <w:unhideWhenUsed/>
     <w:qFormat/>
     <w:uiPriority w:val="9"/>
@@ -2243,7 +3417,7 @@
     <w:name w:val="heading 9"/>
     <w:basedOn w:val="9"/>
     <w:next w:val="1"/>
-    <w:link w:val="25"/>
+    <w:link w:val="27"/>
     <w:unhideWhenUsed/>
     <w:qFormat/>
     <w:uiPriority w:val="9"/>
@@ -2257,14 +3431,14 @@
       <w:iCs/>
     </w:rPr>
   </w:style>
-  <w:style w:type="character" w:default="1" w:styleId="15">
+  <w:style w:type="character" w:default="1" w:styleId="16">
     <w:name w:val="Default Paragraph Font"/>
     <w:semiHidden/>
     <w:unhideWhenUsed/>
     <w:qFormat/>
     <w:uiPriority w:val="1"/>
   </w:style>
-  <w:style w:type="table" w:default="1" w:styleId="14">
+  <w:style w:type="table" w:default="1" w:styleId="15">
     <w:name w:val="Normal Table"/>
     <w:semiHidden/>
     <w:unhideWhenUsed/>
@@ -2282,7 +3456,7 @@
   <w:style w:type="paragraph" w:styleId="11">
     <w:name w:val="footer"/>
     <w:basedOn w:val="1"/>
-    <w:link w:val="37"/>
+    <w:link w:val="39"/>
     <w:unhideWhenUsed/>
     <w:qFormat/>
     <w:uiPriority w:val="99"/>
@@ -2297,7 +3471,7 @@
   <w:style w:type="paragraph" w:styleId="12">
     <w:name w:val="header"/>
     <w:basedOn w:val="1"/>
-    <w:link w:val="36"/>
+    <w:link w:val="38"/>
     <w:unhideWhenUsed/>
     <w:qFormat/>
     <w:uiPriority w:val="99"/>
@@ -2310,10 +3484,28 @@
     </w:pPr>
   </w:style>
   <w:style w:type="paragraph" w:styleId="13">
+    <w:name w:val="Normal (Web)"/>
+    <w:basedOn w:val="1"/>
+    <w:semiHidden/>
+    <w:unhideWhenUsed/>
+    <w:qFormat/>
+    <w:uiPriority w:val="99"/>
+    <w:pPr>
+      <w:spacing w:before="0" w:beforeAutospacing="1" w:after="0" w:afterAutospacing="1"/>
+      <w:ind w:left="0" w:right="0"/>
+      <w:jc w:val="left"/>
+    </w:pPr>
+    <w:rPr>
+      <w:kern w:val="0"/>
+      <w:sz w:val="24"/>
+      <w:lang w:val="en-US" w:eastAsia="zh-CN" w:bidi="ar"/>
+    </w:rPr>
+  </w:style>
+  <w:style w:type="paragraph" w:styleId="14">
     <w:name w:val="Title"/>
     <w:basedOn w:val="1"/>
     <w:next w:val="1"/>
-    <w:link w:val="27"/>
+    <w:link w:val="29"/>
     <w:qFormat/>
     <w:uiPriority w:val="10"/>
     <w:pPr>
@@ -2329,9 +3521,18 @@
       <w:szCs w:val="56"/>
     </w:rPr>
   </w:style>
-  <w:style w:type="character" w:styleId="16">
+  <w:style w:type="character" w:styleId="17">
+    <w:name w:val="Strong"/>
+    <w:basedOn w:val="16"/>
+    <w:qFormat/>
+    <w:uiPriority w:val="22"/>
+    <w:rPr>
+      <w:b/>
+    </w:rPr>
+  </w:style>
+  <w:style w:type="character" w:styleId="18">
     <w:name w:val="Hyperlink"/>
-    <w:basedOn w:val="15"/>
+    <w:basedOn w:val="16"/>
     <w:unhideWhenUsed/>
     <w:qFormat/>
     <w:uiPriority w:val="99"/>
@@ -2345,9 +3546,9 @@
       </w14:textFill>
     </w:rPr>
   </w:style>
-  <w:style w:type="character" w:customStyle="1" w:styleId="17">
+  <w:style w:type="character" w:customStyle="1" w:styleId="19">
     <w:name w:val="标题 1 字符"/>
-    <w:basedOn w:val="15"/>
+    <w:basedOn w:val="16"/>
     <w:link w:val="2"/>
     <w:qFormat/>
     <w:uiPriority w:val="9"/>
@@ -2363,9 +3564,9 @@
       </w14:textFill>
     </w:rPr>
   </w:style>
-  <w:style w:type="character" w:customStyle="1" w:styleId="18">
+  <w:style w:type="character" w:customStyle="1" w:styleId="20">
     <w:name w:val="标题 2 字符"/>
-    <w:basedOn w:val="15"/>
+    <w:basedOn w:val="16"/>
     <w:link w:val="3"/>
     <w:qFormat/>
     <w:uiPriority w:val="9"/>
@@ -2381,9 +3582,9 @@
       </w14:textFill>
     </w:rPr>
   </w:style>
-  <w:style w:type="character" w:customStyle="1" w:styleId="19">
+  <w:style w:type="character" w:customStyle="1" w:styleId="21">
     <w:name w:val="标题 3 字符"/>
-    <w:basedOn w:val="15"/>
+    <w:basedOn w:val="16"/>
     <w:link w:val="4"/>
     <w:qFormat/>
     <w:uiPriority w:val="9"/>
@@ -2394,9 +3595,9 @@
       <w:szCs w:val="24"/>
     </w:rPr>
   </w:style>
-  <w:style w:type="character" w:customStyle="1" w:styleId="20">
+  <w:style w:type="character" w:customStyle="1" w:styleId="22">
     <w:name w:val="标题 4 字符"/>
-    <w:basedOn w:val="15"/>
+    <w:basedOn w:val="16"/>
     <w:link w:val="5"/>
     <w:qFormat/>
     <w:uiPriority w:val="9"/>
@@ -2407,9 +3608,9 @@
       <w:szCs w:val="24"/>
     </w:rPr>
   </w:style>
-  <w:style w:type="character" w:customStyle="1" w:styleId="21">
+  <w:style w:type="character" w:customStyle="1" w:styleId="23">
     <w:name w:val="标题 5 字符"/>
-    <w:basedOn w:val="15"/>
+    <w:basedOn w:val="16"/>
     <w:link w:val="6"/>
     <w:qFormat/>
     <w:uiPriority w:val="9"/>
@@ -2420,9 +3621,9 @@
       <w:szCs w:val="24"/>
     </w:rPr>
   </w:style>
-  <w:style w:type="character" w:customStyle="1" w:styleId="22">
+  <w:style w:type="character" w:customStyle="1" w:styleId="24">
     <w:name w:val="标题 6 字符"/>
-    <w:basedOn w:val="15"/>
+    <w:basedOn w:val="16"/>
     <w:link w:val="7"/>
     <w:qFormat/>
     <w:uiPriority w:val="9"/>
@@ -2433,9 +3634,9 @@
       <w:szCs w:val="24"/>
     </w:rPr>
   </w:style>
-  <w:style w:type="character" w:customStyle="1" w:styleId="23">
+  <w:style w:type="character" w:customStyle="1" w:styleId="25">
     <w:name w:val="标题 7 字符"/>
-    <w:basedOn w:val="15"/>
+    <w:basedOn w:val="16"/>
     <w:link w:val="8"/>
     <w:qFormat/>
     <w:uiPriority w:val="9"/>
@@ -2445,9 +3646,9 @@
       <w:szCs w:val="24"/>
     </w:rPr>
   </w:style>
-  <w:style w:type="character" w:customStyle="1" w:styleId="24">
+  <w:style w:type="character" w:customStyle="1" w:styleId="26">
     <w:name w:val="标题 8 字符"/>
-    <w:basedOn w:val="15"/>
+    <w:basedOn w:val="16"/>
     <w:link w:val="9"/>
     <w:qFormat/>
     <w:uiPriority w:val="9"/>
@@ -2466,9 +3667,9 @@
       </w14:textFill>
     </w:rPr>
   </w:style>
-  <w:style w:type="character" w:customStyle="1" w:styleId="25">
+  <w:style w:type="character" w:customStyle="1" w:styleId="27">
     <w:name w:val="标题 9 字符"/>
-    <w:basedOn w:val="15"/>
+    <w:basedOn w:val="16"/>
     <w:link w:val="10"/>
     <w:qFormat/>
     <w:uiPriority w:val="9"/>
@@ -2488,7 +3689,7 @@
       </w14:textFill>
     </w:rPr>
   </w:style>
-  <w:style w:type="paragraph" w:styleId="26">
+  <w:style w:type="paragraph" w:styleId="28">
     <w:name w:val="List Paragraph"/>
     <w:basedOn w:val="1"/>
     <w:qFormat/>
@@ -2498,10 +3699,10 @@
       <w:contextualSpacing/>
     </w:pPr>
   </w:style>
-  <w:style w:type="character" w:customStyle="1" w:styleId="27">
+  <w:style w:type="character" w:customStyle="1" w:styleId="29">
     <w:name w:val="标题 字符"/>
-    <w:basedOn w:val="15"/>
-    <w:link w:val="13"/>
+    <w:basedOn w:val="16"/>
+    <w:link w:val="14"/>
     <w:qFormat/>
     <w:uiPriority w:val="10"/>
     <w:rPr>
@@ -2512,10 +3713,10 @@
       <w:szCs w:val="56"/>
     </w:rPr>
   </w:style>
-  <w:style w:type="paragraph" w:customStyle="1" w:styleId="28">
+  <w:style w:type="paragraph" w:customStyle="1" w:styleId="30">
     <w:name w:val="封面编号"/>
     <w:basedOn w:val="1"/>
-    <w:link w:val="30"/>
+    <w:link w:val="32"/>
     <w:qFormat/>
     <w:uiPriority w:val="0"/>
     <w:pPr>
@@ -2530,10 +3731,10 @@
       <w:sz w:val="28"/>
     </w:rPr>
   </w:style>
-  <w:style w:type="paragraph" w:customStyle="1" w:styleId="29">
+  <w:style w:type="paragraph" w:customStyle="1" w:styleId="31">
     <w:name w:val="封面标题"/>
     <w:basedOn w:val="1"/>
-    <w:link w:val="32"/>
+    <w:link w:val="34"/>
     <w:qFormat/>
     <w:uiPriority w:val="0"/>
     <w:pPr>
@@ -2547,10 +3748,10 @@
       <w:szCs w:val="44"/>
     </w:rPr>
   </w:style>
-  <w:style w:type="character" w:customStyle="1" w:styleId="30">
+  <w:style w:type="character" w:customStyle="1" w:styleId="32">
     <w:name w:val="封面编号 字符"/>
-    <w:basedOn w:val="15"/>
-    <w:link w:val="28"/>
+    <w:basedOn w:val="16"/>
+    <w:link w:val="30"/>
     <w:qFormat/>
     <w:uiPriority w:val="0"/>
     <w:rPr>
@@ -2560,10 +3761,10 @@
       <w:sz w:val="28"/>
     </w:rPr>
   </w:style>
-  <w:style w:type="paragraph" w:customStyle="1" w:styleId="31">
+  <w:style w:type="paragraph" w:customStyle="1" w:styleId="33">
     <w:name w:val="封面类型标题"/>
-    <w:basedOn w:val="29"/>
-    <w:link w:val="34"/>
+    <w:basedOn w:val="31"/>
+    <w:link w:val="36"/>
     <w:qFormat/>
     <w:uiPriority w:val="0"/>
     <w:pPr>
@@ -2576,10 +3777,10 @@
       <w:szCs w:val="48"/>
     </w:rPr>
   </w:style>
-  <w:style w:type="character" w:customStyle="1" w:styleId="32">
+  <w:style w:type="character" w:customStyle="1" w:styleId="34">
     <w:name w:val="封面标题 字符"/>
-    <w:basedOn w:val="15"/>
-    <w:link w:val="29"/>
+    <w:basedOn w:val="16"/>
+    <w:link w:val="31"/>
     <w:qFormat/>
     <w:uiPriority w:val="0"/>
     <w:rPr>
@@ -2588,10 +3789,10 @@
       <w:szCs w:val="44"/>
     </w:rPr>
   </w:style>
-  <w:style w:type="paragraph" w:customStyle="1" w:styleId="33">
+  <w:style w:type="paragraph" w:customStyle="1" w:styleId="35">
     <w:name w:val="封面信息"/>
-    <w:basedOn w:val="29"/>
-    <w:link w:val="35"/>
+    <w:basedOn w:val="31"/>
+    <w:link w:val="37"/>
     <w:qFormat/>
     <w:uiPriority w:val="0"/>
     <w:pPr>
@@ -2604,10 +3805,10 @@
       <w:sz w:val="32"/>
     </w:rPr>
   </w:style>
-  <w:style w:type="character" w:customStyle="1" w:styleId="34">
+  <w:style w:type="character" w:customStyle="1" w:styleId="36">
     <w:name w:val="封面类型标题 字符"/>
-    <w:basedOn w:val="32"/>
-    <w:link w:val="31"/>
+    <w:basedOn w:val="34"/>
+    <w:link w:val="33"/>
     <w:qFormat/>
     <w:uiPriority w:val="0"/>
     <w:rPr>
@@ -2617,10 +3818,10 @@
       <w:szCs w:val="48"/>
     </w:rPr>
   </w:style>
-  <w:style w:type="character" w:customStyle="1" w:styleId="35">
+  <w:style w:type="character" w:customStyle="1" w:styleId="37">
     <w:name w:val="封面信息 字符"/>
-    <w:basedOn w:val="32"/>
-    <w:link w:val="33"/>
+    <w:basedOn w:val="34"/>
+    <w:link w:val="35"/>
     <w:qFormat/>
     <w:uiPriority w:val="0"/>
     <w:rPr>
@@ -2630,9 +3831,9 @@
       <w:szCs w:val="44"/>
     </w:rPr>
   </w:style>
-  <w:style w:type="character" w:customStyle="1" w:styleId="36">
+  <w:style w:type="character" w:customStyle="1" w:styleId="38">
     <w:name w:val="页眉 字符"/>
-    <w:basedOn w:val="15"/>
+    <w:basedOn w:val="16"/>
     <w:link w:val="12"/>
     <w:qFormat/>
     <w:uiPriority w:val="99"/>
@@ -2641,9 +3842,9 @@
       <w:sz w:val="24"/>
     </w:rPr>
   </w:style>
-  <w:style w:type="character" w:customStyle="1" w:styleId="37">
+  <w:style w:type="character" w:customStyle="1" w:styleId="39">
     <w:name w:val="页脚 字符"/>
-    <w:basedOn w:val="15"/>
+    <w:basedOn w:val="16"/>
     <w:link w:val="11"/>
     <w:qFormat/>
     <w:uiPriority w:val="99"/>
@@ -2652,11 +3853,11 @@
       <w:sz w:val="24"/>
     </w:rPr>
   </w:style>
-  <w:style w:type="paragraph" w:customStyle="1" w:styleId="38">
+  <w:style w:type="paragraph" w:customStyle="1" w:styleId="40">
     <w:name w:val="标题 1 无章节"/>
     <w:basedOn w:val="2"/>
     <w:next w:val="1"/>
-    <w:link w:val="39"/>
+    <w:link w:val="41"/>
     <w:qFormat/>
     <w:uiPriority w:val="0"/>
     <w:pPr>
@@ -2665,10 +3866,10 @@
       </w:numPr>
     </w:pPr>
   </w:style>
-  <w:style w:type="character" w:customStyle="1" w:styleId="39">
+  <w:style w:type="character" w:customStyle="1" w:styleId="41">
     <w:name w:val="标题 1 无章节 字符"/>
-    <w:basedOn w:val="17"/>
-    <w:link w:val="38"/>
+    <w:basedOn w:val="19"/>
+    <w:link w:val="40"/>
     <w:qFormat/>
     <w:uiPriority w:val="0"/>
     <w:rPr>
@@ -2683,9 +3884,9 @@
       </w14:textFill>
     </w:rPr>
   </w:style>
-  <w:style w:type="character" w:customStyle="1" w:styleId="40">
+  <w:style w:type="character" w:customStyle="1" w:styleId="42">
     <w:name w:val="未处理的提及1"/>
-    <w:basedOn w:val="15"/>
+    <w:basedOn w:val="16"/>
     <w:semiHidden/>
     <w:unhideWhenUsed/>
     <w:qFormat/>
@@ -2954,7 +4155,7 @@
 </file>
 
 <file path=customXml/item1.xml><?xml version="1.0" encoding="utf-8"?>
-<b:Sources xmlns:b="http://schemas.openxmlformats.org/officeDocument/2006/bibliography" xmlns="http://schemas.openxmlformats.org/officeDocument/2006/bibliography" SelectedStyle="\APASixthEditionOfficeOnline.xsl" StyleName="APA" Version="6"/>
+<b:Sources xmlns:b="http://schemas.openxmlformats.org/officeDocument/2006/bibliography" xmlns="http://schemas.openxmlformats.org/officeDocument/2006/bibliography" StyleName="APA" Version="6" SelectedStyle="\APASixthEditionOfficeOnline.xsl"/>
 </file>
 
 <file path=customXml/itemProps1.xml><?xml version="1.0" encoding="utf-8"?>

</xml_diff>

<commit_message>
doc: fix some format problem of project spec
</commit_message>
<xml_diff>
--- a/操作系统开源创新大赛项目说明书.docx
+++ b/操作系统开源创新大赛项目说明书.docx
@@ -2675,19 +2675,22 @@
           <w:rFonts w:hint="default"/>
         </w:rPr>
       </w:pPr>
+      <w:r>
+        <w:rPr>
+          <w:rFonts w:hint="default"/>
+        </w:rPr>
+        <w:t>固件与引导层由 OpenSBI 和定制版 U-Boot 组成。OpenSBI 负责 RISC-V 特权级的初始化，为后续的引导程序提供 SBI 接口。U-Boot 在标准的硬件初始化之外，额外提供了三项对开发流程至关重要的增强功能：saveenv 允许将环境变量持久化到 SD 卡的 FAT 分区，ums 允许将开发板上的 SD 卡通过 USB 线缆模拟为主机的块设备，tftpboot 允许通过 USB RNDIS 虚拟网卡以 TFTP 协议从主机高速拉取内核镜像。这三项功能将内核开发中"编译 → 烧录 → 测试"的迭代循环从每次约 10 分钟的手动拔卡操作压缩到了 30 秒以内的网络传输，是整个开发效率提升的硬件基础。</w:t>
+      </w:r>
     </w:p>
     <w:p>
       <w:pPr>
         <w:ind w:firstLine="480"/>
-        <w:rPr>
-          <w:rFonts w:hint="default"/>
-        </w:rPr>
-      </w:pPr>
-      <w:r>
-        <w:rPr>
-          <w:rFonts w:hint="default"/>
-        </w:rPr>
-        <w:t>固件与引导层由 OpenSBI 和定制版 U-Boot 组成。OpenSBI 负责 RISC-V 特权级的初始化，为后续的引导程序提供 SBI 接口。U-Boot 在标准的硬件初始化之外，额外提供了三项对开发流程至关重要的增强功能：saveenv 允许将环境变量持久化到 SD 卡的 FAT 分区，ums 允许将开发板上的 SD 卡通过 USB 线缆模拟为主机的块设备，tftpboot 允许通过 USB RNDIS 虚拟网卡以 TFTP 协议从主机高速拉取内核镜像。这三项功能将内核开发中"编译 → 烧录 → 测试"的迭代循环从每次约 10 分钟的手动拔卡操作压缩到了 30 秒以内的网络传输，是整个开发效率提升的硬件基础。</w:t>
+      </w:pPr>
+      <w:r>
+        <w:rPr>
+          <w:rFonts w:hint="default"/>
+        </w:rPr>
+        <w:t>内核层是整个系统的核心。StarryOS 作为兼容 Linux 系统调用的宏内核，为上层提供了一套与 Linux 高度兼容的运行环境。从功能上，内核可以划分为系统调用兼容层（实现了包括进程管理、文件操作、网络套接字、内存映射、信号处理等在内的一百余个 Linux 系统调用）、文件系统层（VFS 框架 + FAT/ext4 物理文件系统 + devfs/procfs/sysfs 等伪文件系统）、网络协议栈（TCP/UDP/IP 协议栈 + WiFi 管理接口）、设备驱动框架（通过 rdrive 注册表和 pseudofs 伪文件系统统一管理所有驱动实例）以及平台抽象层（封装 RISC-V 特权指令、MMIO 操作、中断管理等架构相关细节）。本项目在内核层的工作涵盖了 bug 修复、功能补全和性能优化三个类别，总计产出了 10 余个独立的补丁。</w:t>
       </w:r>
     </w:p>
     <w:p>
@@ -2697,25 +2700,61 @@
           <w:rFonts w:hint="default"/>
         </w:rPr>
       </w:pPr>
+      <w:r>
+        <w:rPr>
+          <w:rFonts w:hint="default"/>
+        </w:rPr>
+        <w:t>系统服务层主要包括 BusyBox 工具集、无线网络管理工具（wpa_supplicant、udhcpc）、AKA-00 机器人控制运行时以及 CVI TPU 推理运行时库。这些服务组件在 StarryOS 上以与 Linux 完全相同的二进制格式运行，无需任何重新编译。这一事实本身就是对 StarryOS 系统调用兼容层完整性的一个强有力的验证。</w:t>
+      </w:r>
     </w:p>
     <w:p>
       <w:pPr>
         <w:ind w:firstLine="480"/>
-        <w:rPr>
-          <w:rFonts w:hint="default"/>
-        </w:rPr>
-      </w:pPr>
-      <w:r>
-        <w:rPr>
-          <w:rFonts w:hint="default"/>
-        </w:rPr>
-        <w:t>内核层是整个系统的核心。StarryOS 作为兼容 Linux 系统调用的宏内核，为上层提供了一套与 Linux 高度兼容的运行环境。从功能上，内核可以划分为系统调用兼容层（实现了包括进程管理、文件操作、网络套接字、内存映射、信号处理等在内的一百余个 Linux 系统调用）、文件系统层（VFS 框架 + FAT/ext4 物理文件系统 + devfs/procfs/sysfs 等伪文件系统）、网络协议栈（TCP/UDP/IP 协议栈 + WiFi 管理接口）、设备驱动框架（通过 rdrive 注册表和 pseudofs 伪文件系统统一管理所有驱动实例）以及平台抽象层（封装 RISC-V 特权指令、MMIO 操作、中断管理等架构相关细节）。本项目在内核层的工作涵盖了 bug 修复、功能补全和性能优化三个类别，总计产出了 10 余个独立的补丁。</w:t>
-      </w:r>
+      </w:pPr>
+      <w:r>
+        <w:rPr>
+          <w:rFonts w:hint="default"/>
+        </w:rPr>
+        <w:t>应用层的核心程序是 akars。该程序内部的组织结构遵循"感知-决策-执行"的机器人控制范式，由三大模块构成。感知模块负责 USB 摄像头帧采集、JPU 硬件解码、YUV 到 RGB 色彩空间转换以及 YOLOv8 TPU 推理；决策模块以有限状态机的形式实现，根据检测结果在搜索（连续顺时针旋转扫描）、追击（根据球面积二次减速靠近）和抓取（5 步机械臂序列）三个状态间切换；执行模块通过 UART 串口协议分别与 ESP32 底盘控制器和 ZP10S 舵机控制板通信，将决策模块输出的运动指令转化为硬件动作。此外，akars 还集成了一个独立的 Web 控制面板模块，通过 HTTP 接口提供实时摄像头预览、硬件状态查询和手动遥控功能。</w:t>
+      </w:r>
+    </w:p>
+    <w:p>
+      <w:pPr>
+        <w:ind w:firstLine="199" w:firstLineChars="83"/>
+      </w:pPr>
+    </w:p>
+    <w:p>
+      <w:pPr>
+        <w:pStyle w:val="3"/>
+      </w:pPr>
+      <w:r>
+        <w:rPr>
+          <w:rFonts w:hint="eastAsia"/>
+        </w:rPr>
+        <w:t xml:space="preserve"> </w:t>
+      </w:r>
+      <w:bookmarkStart w:id="11" w:name="_Toc603498501"/>
+      <w:r>
+        <w:rPr>
+          <w:rFonts w:hint="eastAsia"/>
+        </w:rPr>
+        <w:t>固件与引导层</w:t>
+      </w:r>
+      <w:bookmarkEnd w:id="11"/>
     </w:p>
     <w:p>
       <w:pPr>
         <w:ind w:firstLine="480"/>
-      </w:pPr>
+        <w:rPr>
+          <w:rFonts w:hint="default"/>
+        </w:rPr>
+      </w:pPr>
+      <w:r>
+        <w:rPr>
+          <w:rFonts w:hint="default"/>
+        </w:rPr>
+        <w:t>固件与引导层的核心职责是在操作系统内核启动之前完成硬件的基本初始化和内核镜像的加载。在本项目中，这一层的组成包括 OpenSBI（RISC-V 监管模式二进制接口）和 U-Boot（通用引导加载程序）。</w:t>
+      </w:r>
     </w:p>
     <w:p>
       <w:pPr>
@@ -2728,7 +2767,7 @@
         <w:rPr>
           <w:rFonts w:hint="default"/>
         </w:rPr>
-        <w:t>系统服务层主要包括 BusyBox 工具集、无线网络管理工具（wpa_supplicant、udhcpc）、AKA-00 机器人控制运行时以及 CVI TPU 推理运行时库。这些服务组件在 StarryOS 上以与 Linux 完全相同的二进制格式运行，无需任何重新编译。这一事实本身就是对 StarryOS 系统调用兼容层完整性的一个强有力的验证。</w:t>
+        <w:t>OpenSBI 负责从机器态（M-mode）切换到监管态（S-mode），为内核提供时钟、IPI、远程栅栏等 SBI 服务。这部分由算能官方提供的固件二进制（fip.bin 中包含的 OpenSBI 镜像）完成，本项目的定制工作主要体现在 U-Boot 层面。</w:t>
       </w:r>
     </w:p>
     <w:p>
@@ -2738,111 +2777,16 @@
           <w:rFonts w:hint="default"/>
         </w:rPr>
       </w:pPr>
+      <w:r>
+        <w:rPr>
+          <w:rFonts w:hint="default"/>
+        </w:rPr>
+        <w:t>项目所基于的原始 U-Boot 版本（来自 LicheeRV-Nano-Build）仅提供了最基础的 SD 卡启动功能，开发流程严重受限于"编译 → 写卡 → 插卡 → 上电"的漫长循环。为了将内核开发迭代的效率提升到可接受的水平，本项目对 U-Boot 进行了三项关键的功能增强和大量硬件适配修复。</w:t>
+      </w:r>
     </w:p>
     <w:p>
       <w:pPr>
         <w:ind w:firstLine="480"/>
-      </w:pPr>
-      <w:r>
-        <w:rPr>
-          <w:rFonts w:hint="default"/>
-        </w:rPr>
-        <w:t>应用层的核心程序是 akars。该程序内部的组织结构遵循"感知-决策-执行"的机器人控制范式，由三大模块构成。感知模块负责 USB 摄像头帧采集、JPU 硬件解码、YUV 到 RGB 色彩空间转换以及 YOLOv8 TPU 推理；决策模块以有限状态机的形式实现，根据检测结果在搜索（连续顺时针旋转扫描）、追击（根据球面积二次减速靠近）和抓取（5 步机械臂序列）三个状态间切换；执行模块通过 UART 串口协议分别与 ESP32 底盘控制器和 ZP10S 舵机控制板通信，将决策模块输出的运动指令转化为硬件动作。此外，akars 还集成了一个独立的 Web 控制面板模块，通过 HTTP 接口提供实时摄像头预览、硬件状态查询和手动遥控功能。</w:t>
-      </w:r>
-    </w:p>
-    <w:p>
-      <w:pPr>
-        <w:ind w:firstLine="199" w:firstLineChars="83"/>
-      </w:pPr>
-    </w:p>
-    <w:p>
-      <w:pPr>
-        <w:pStyle w:val="3"/>
-      </w:pPr>
-      <w:r>
-        <w:rPr>
-          <w:rFonts w:hint="eastAsia"/>
-        </w:rPr>
-        <w:t xml:space="preserve"> </w:t>
-      </w:r>
-      <w:bookmarkStart w:id="11" w:name="_Toc603498501"/>
-      <w:r>
-        <w:rPr>
-          <w:rFonts w:hint="eastAsia"/>
-        </w:rPr>
-        <w:t>固件与引导层</w:t>
-      </w:r>
-      <w:bookmarkEnd w:id="11"/>
-    </w:p>
-    <w:p>
-      <w:pPr>
-        <w:ind w:firstLine="199" w:firstLineChars="83"/>
-        <w:rPr>
-          <w:rFonts w:hint="default"/>
-        </w:rPr>
-      </w:pPr>
-      <w:r>
-        <w:rPr>
-          <w:rFonts w:hint="default"/>
-        </w:rPr>
-        <w:t>固件与引导层的核心职责是在操作系统内核启动之前完成硬件的基本初始化和内核镜像的加载。在本项目中，这一层的组成包括 OpenSBI（RISC-V 监管模式二进制接口）和 U-Boot（通用引导加载程序）。</w:t>
-      </w:r>
-    </w:p>
-    <w:p>
-      <w:pPr>
-        <w:ind w:firstLine="199" w:firstLineChars="83"/>
-        <w:rPr>
-          <w:rFonts w:hint="default"/>
-        </w:rPr>
-      </w:pPr>
-    </w:p>
-    <w:p>
-      <w:pPr>
-        <w:ind w:firstLine="199" w:firstLineChars="83"/>
-        <w:rPr>
-          <w:rFonts w:hint="default"/>
-        </w:rPr>
-      </w:pPr>
-      <w:r>
-        <w:rPr>
-          <w:rFonts w:hint="default"/>
-        </w:rPr>
-        <w:t>OpenSBI 负责从机器态（M-mode）切换到监管态（S-mode），为内核提供时钟、IPI、远程栅栏等 SBI 服务。这部分由算能官方提供的固件二进制（fip.bin 中包含的 OpenSBI 镜像）完成，本项目的定制工作主要体现在 U-Boot 层面。</w:t>
-      </w:r>
-    </w:p>
-    <w:p>
-      <w:pPr>
-        <w:ind w:firstLine="199" w:firstLineChars="83"/>
-        <w:rPr>
-          <w:rFonts w:hint="default"/>
-        </w:rPr>
-      </w:pPr>
-    </w:p>
-    <w:p>
-      <w:pPr>
-        <w:ind w:firstLine="199" w:firstLineChars="83"/>
-        <w:rPr>
-          <w:rFonts w:hint="default"/>
-        </w:rPr>
-      </w:pPr>
-      <w:r>
-        <w:rPr>
-          <w:rFonts w:hint="default"/>
-        </w:rPr>
-        <w:t>项目所基于的原始 U-Boot 版本（来自 LicheeRV-Nano-Build）仅提供了最基础的 SD 卡启动功能，开发流程严重受限于"编译 → 写卡 → 插卡 → 上电"的漫长循环。为了将内核开发迭代的效率提升到可接受的水平，本项目对 U-Boot 进行了三项关键的功能增强和大量硬件适配修复。</w:t>
-      </w:r>
-    </w:p>
-    <w:p>
-      <w:pPr>
-        <w:ind w:firstLine="199" w:firstLineChars="83"/>
-        <w:rPr>
-          <w:rFonts w:hint="default"/>
-        </w:rPr>
-      </w:pPr>
-    </w:p>
-    <w:p>
-      <w:pPr>
-        <w:ind w:firstLine="199" w:firstLineChars="83"/>
         <w:rPr>
           <w:rFonts w:hint="default"/>
         </w:rPr>
@@ -2856,15 +2800,7 @@
     </w:p>
     <w:p>
       <w:pPr>
-        <w:ind w:firstLine="199" w:firstLineChars="83"/>
-        <w:rPr>
-          <w:rFonts w:hint="default"/>
-        </w:rPr>
-      </w:pPr>
-    </w:p>
-    <w:p>
-      <w:pPr>
-        <w:ind w:firstLine="199" w:firstLineChars="83"/>
+        <w:ind w:firstLine="480"/>
         <w:rPr>
           <w:rFonts w:hint="default"/>
         </w:rPr>
@@ -2878,18 +2814,7 @@
     </w:p>
     <w:p>
       <w:pPr>
-        <w:ind w:firstLine="199" w:firstLineChars="83"/>
-        <w:rPr>
-          <w:rFonts w:hint="default"/>
-        </w:rPr>
-      </w:pPr>
-    </w:p>
-    <w:p>
-      <w:pPr>
-        <w:ind w:firstLine="199" w:firstLineChars="83"/>
-        <w:rPr>
-          <w:rFonts w:hint="default"/>
-        </w:rPr>
+        <w:ind w:firstLine="480"/>
       </w:pPr>
       <w:r>
         <w:rPr>
@@ -2897,11 +2822,6 @@
         </w:rPr>
         <w:t>TFTP 网络启动（tftpboot）功能则利用 DWC2 OTG 控制器的 RNDIS 模式，在开发板和主机之间建立了一个基于 USB 线缆的以太网链路。在 U-Boot 中设置好 IP 地址后，可以通过 TFTP 协议直接从主机拉取内核镜像到内存并启动。这一功能与 ums 互补：ums 适用于大批量文件的传输（如更新 rootfs），而 tftpboot 则适用于内核镜像的快速迭代测试——开发者只需在主机端将编译好的 boot.sd 放入 TFTP 目录，然后在 U-Boot 中执行一行命令即可加载并启动新内核。</w:t>
       </w:r>
-    </w:p>
-    <w:p>
-      <w:pPr>
-        <w:ind w:firstLine="199" w:firstLineChars="83"/>
-      </w:pPr>
     </w:p>
     <w:p>
       <w:pPr>
@@ -2924,68 +2844,68 @@
     </w:p>
     <w:p>
       <w:pPr>
+        <w:ind w:firstLine="480"/>
+        <w:rPr>
+          <w:rFonts w:hint="eastAsia" w:eastAsia="宋体"/>
+          <w:lang w:val="en-US" w:eastAsia="zh-CN"/>
+        </w:rPr>
+      </w:pPr>
+      <w:r>
         <w:rPr>
           <w:rFonts w:hint="default"/>
           <w:lang w:val="en-US"/>
         </w:rPr>
+        <w:t>StarryOS 内核是本项目技术栈的核心。它基于 rcore-os 社区的 tgoskits 组件库构建，在架构上兼容 Linux 系统调用接口，使得大量现有的 Linux 用户态程序可以无需修改直接运行。本项目在内核层的工作可分为系统调用修复、驱动功能补全、设备节点新增和调试工具改进四个方向。</w:t>
+      </w:r>
+    </w:p>
+    <w:p>
+      <w:pPr>
+        <w:rPr>
+          <w:rFonts w:hint="default" w:eastAsia="宋体"/>
+          <w:lang w:val="en-US" w:eastAsia="zh-CN"/>
+        </w:rPr>
       </w:pPr>
       <w:r>
         <w:rPr>
           <w:rFonts w:hint="default"/>
           <w:lang w:val="en-US"/>
         </w:rPr>
-        <w:t>StarryOS 内核是本项目技术栈的核心。它基于 rcore-os 社区的 tgoskits 组件库构建，在架构上兼容 Linux 系统调用接口，使得大量现有的 Linux 用户态程序可以无需修改直接运行。本项目在内核层的工作可分为系统调用修复、驱动功能补全、设备节点新增和调试工具改进四个方向。</w:t>
-      </w:r>
-    </w:p>
-    <w:p>
-      <w:pPr>
-        <w:rPr>
-          <w:rFonts w:hint="eastAsia" w:eastAsia="宋体"/>
-          <w:lang w:val="en-US" w:eastAsia="zh-CN"/>
-        </w:rPr>
-      </w:pPr>
-    </w:p>
-    <w:p>
-      <w:pPr>
+        <w:t>在系统调用修复方面，最具有代表性的工作是 strace/ptrace 子系统的三项缺陷修正。strace 是 Linux 下最重要的系统调用追踪工具，对于理解和调试用户态程序与内核的交互至关重要。在 StarryOS 的原始实现中，strace 完全无法正常工作——它无法显示任何系统调用信息。通过深入分析，项目团队定位到了三个独立的</w:t>
+      </w:r>
+      <w:r>
+        <w:rPr>
+          <w:rFonts w:hint="eastAsia"/>
+          <w:lang w:val="en-US" w:eastAsia="zh-CN"/>
+        </w:rPr>
+        <w:t>根本原因</w:t>
+      </w:r>
+      <w:r>
         <w:rPr>
           <w:rFonts w:hint="default"/>
           <w:lang w:val="en-US"/>
         </w:rPr>
-      </w:pPr>
+        <w:t>。第一个问题是 sys_ptrace 中 PTRACE_SEIZE 的参数传递错误：代码将 addr 而非 data 传递给了 ptrace_seize()，导致 PTRACE_O_TRACESYSGOOD 选项从未被设置，tracee 的系统调用停止信号始终是原始的 SIGTRAP(5) 而非 SIGTRAP | 0x80(0x85)，使得 strace 将系统调用停止误判为普通信号投递停止，永远不会进入系统调用追踪路径。第二个问题在</w:t>
+      </w:r>
+      <w:r>
+        <w:rPr>
+          <w:rFonts w:hint="eastAsia"/>
+          <w:lang w:val="en-US" w:eastAsia="zh-CN"/>
+        </w:rPr>
+        <w:t>r</w:t>
+      </w:r>
       <w:r>
         <w:rPr>
           <w:rFonts w:hint="default"/>
           <w:lang w:val="en-US"/>
         </w:rPr>
-        <w:t>在系统调用修复方面，最具有代表性的工作是 strace/ptrace 子系统的三项缺陷修正。strace 是 Linux 下最重要的系统调用追踪工具，对于理解和调试用户态程序与内核的交互至关重要。在 StarryOS 的原始实现中，strace 完全无法正常工作——它无法显示任何系统调用信息。通过深入分析，项目团队定位到了三个独立的</w:t>
-      </w:r>
-      <w:r>
-        <w:rPr>
-          <w:rFonts w:hint="eastAsia"/>
-          <w:lang w:val="en-US" w:eastAsia="zh-CN"/>
-        </w:rPr>
-        <w:t>根本原因</w:t>
-      </w:r>
-      <w:r>
-        <w:rPr>
-          <w:rFonts w:hint="default"/>
-          <w:lang w:val="en-US"/>
-        </w:rPr>
-        <w:t>。第一个问题是 sys_ptrace 中 PTRACE_SEIZE 的参数传递错误：代码将 addr 而非 data 传递给了 ptrace_seize()，导致 PTRACE_O_TRACESYSGOOD 选项从未被设置，tracee 的系统调用停止信号始终是原始的 SIGTRAP(5) 而非 SIGTRAP | 0x80(0x85)，使得 strace 将系统调用停止误判为普通信号投递停止，永远不会进入系统调用追踪路径。第二个问题在</w:t>
-      </w:r>
-      <w:r>
-        <w:rPr>
-          <w:rFonts w:hint="eastAsia"/>
-          <w:lang w:val="en-US" w:eastAsia="zh-CN"/>
-        </w:rPr>
-        <w:t>r</w:t>
-      </w:r>
-      <w:r>
-        <w:rPr>
-          <w:rFonts w:hint="default"/>
-          <w:lang w:val="en-US"/>
-        </w:rPr>
         <w:t>信号处理层：wait_ptrace_resume 在被 task.interrupt() 中断时会错误地调用 clear_ptrace_stop() 清除 exec-stop 记录，导致 tracer 永远收不到子进程的 SIGTRAP 通知。第三个问题则是 new_user_task 中 exec-stop 检查和 syscall-exit-trace 检查的执行顺序与 Linux 语义不符——按照 Linux 的规范，exec-stop 应当替代（supersede）而非在 syscall exit stop 之后发生。以上三处修复使得 strace 在 StarryOS 上恢复正常工作，为后续的用户态程序调试和性能诊断提供了不可或缺的工具支撑。</w:t>
+      </w:r>
+      <w:r>
+        <w:rPr>
+          <w:rFonts w:hint="eastAsia"/>
+          <w:lang w:val="en-US" w:eastAsia="zh-CN"/>
+        </w:rPr>
+        <w:t>如图3.1，图3.2所示。</w:t>
       </w:r>
     </w:p>
     <w:p>
@@ -3104,46 +3024,43 @@
     </w:p>
     <w:p>
       <w:pPr>
-        <w:ind w:left="0" w:leftChars="0" w:firstLine="0" w:firstLineChars="0"/>
-        <w:jc w:val="center"/>
-        <w:rPr>
-          <w:rFonts w:hint="default" w:eastAsia="宋体"/>
+        <w:ind w:left="0" w:leftChars="0" w:firstLine="800" w:firstLineChars="400"/>
+        <w:jc w:val="both"/>
+        <w:rPr>
+          <w:rFonts w:hint="default"/>
+          <w:lang w:val="en-US"/>
+        </w:rPr>
+      </w:pPr>
+      <w:r>
+        <w:rPr>
+          <w:rFonts w:hint="eastAsia"/>
           <w:sz w:val="20"/>
           <w:szCs w:val="18"/>
           <w:lang w:val="en-US" w:eastAsia="zh-CN"/>
         </w:rPr>
-      </w:pPr>
-      <w:r>
-        <w:rPr>
-          <w:rFonts w:hint="eastAsia"/>
-          <w:sz w:val="20"/>
-          <w:szCs w:val="18"/>
-          <w:lang w:val="en-US" w:eastAsia="zh-CN"/>
-        </w:rPr>
-        <w:t>旧内核使用strace卡死，新内核正确跟踪</w:t>
-      </w:r>
-    </w:p>
-    <w:p>
-      <w:pPr>
+        <w:t>图3.1旧内核使用strace卡死                                        图3.2新内核正确跟踪</w:t>
+      </w:r>
+    </w:p>
+    <w:p>
+      <w:pPr>
+        <w:rPr>
+          <w:rFonts w:hint="default" w:eastAsia="宋体"/>
+          <w:lang w:val="en-US" w:eastAsia="zh-CN"/>
+        </w:rPr>
+      </w:pPr>
+      <w:r>
         <w:rPr>
           <w:rFonts w:hint="default"/>
           <w:lang w:val="en-US"/>
         </w:rPr>
-      </w:pPr>
-    </w:p>
-    <w:p>
-      <w:pPr>
-        <w:rPr>
-          <w:rFonts w:hint="default"/>
-          <w:lang w:val="en-US"/>
-        </w:rPr>
-      </w:pPr>
-      <w:r>
-        <w:rPr>
-          <w:rFonts w:hint="default"/>
-          <w:lang w:val="en-US"/>
-        </w:rPr>
         <w:t>在驱动功能补全方面，WiFi 驱动的修复和增强是使机器人具备无线网络能力的前提。原始 StarryOS 中 AIC8800 WiFi 芯片的驱动（aic8800.rs）存在一个中断使能时机错误，导致驱动初始化时与硬件握手的时序不正确，最终配置超时失败。修复方法是将中断使能代码的执行提前到硬件配置之前。除此之外，WiFi 相关的无线扩展接口（wext.rs）缺少用户态 WiFi 管理工具所需的若干 ioctl 命令，项目补全了这些缺失的接口。更进一步，项目团队还实现了内核 DNS 变更的回调通知机制——当 DHCP 客户端从路由器获取到 DNS 服务器地址后，内核通过网络栈的 commit_interface_update 路径触发回调，自动将 DNS 地址写入 /etc/resolv.conf 文件，从而解决了用户态程序只能使用 IP 地址而无法解析域名的实际问题。</w:t>
+      </w:r>
+      <w:r>
+        <w:rPr>
+          <w:rFonts w:hint="eastAsia"/>
+          <w:lang w:val="en-US" w:eastAsia="zh-CN"/>
+        </w:rPr>
+        <w:t>如图3.3，图3.4所示。</w:t>
       </w:r>
     </w:p>
     <w:p>
@@ -3273,7 +3190,7 @@
         <w:snapToGrid/>
         <w:spacing w:line="240" w:lineRule="auto"/>
         <w:ind w:left="0" w:leftChars="0" w:firstLine="0" w:firstLineChars="0"/>
-        <w:jc w:val="center"/>
+        <w:jc w:val="both"/>
         <w:textAlignment w:val="auto"/>
         <w:rPr>
           <w:rFonts w:hint="default"/>
@@ -3287,22 +3204,29 @@
           <w:szCs w:val="20"/>
           <w:lang w:val="en-US" w:eastAsia="zh-CN"/>
         </w:rPr>
-        <w:t>旧内核网络驱动和网络程序接口均没有正确实现，新内核成功实现网络栈</w:t>
-      </w:r>
-    </w:p>
-    <w:p>
-      <w:pPr>
+        <w:t>图3.3 旧内核网络驱动和网络程序接口均没有正确实现           图3.4新内核成功实现网络栈</w:t>
+      </w:r>
+    </w:p>
+    <w:p>
+      <w:pPr>
+        <w:rPr>
+          <w:rFonts w:hint="default" w:eastAsia="宋体"/>
+          <w:lang w:val="en-US" w:eastAsia="zh-CN"/>
+        </w:rPr>
+      </w:pPr>
+      <w:r>
         <w:rPr>
           <w:rFonts w:hint="default"/>
           <w:lang w:val="en-US"/>
         </w:rPr>
-      </w:pPr>
-      <w:r>
-        <w:rPr>
-          <w:rFonts w:hint="default"/>
-          <w:lang w:val="en-US"/>
-        </w:rPr>
         <w:t>FAT 文件系统挂载功能的修复则使 SD 卡的启动分区能够被挂载到 /boot 目录下，为系统配置文件的持久化存储提供了基础。</w:t>
+      </w:r>
+      <w:r>
+        <w:rPr>
+          <w:rFonts w:hint="eastAsia"/>
+          <w:lang w:val="en-US" w:eastAsia="zh-CN"/>
+        </w:rPr>
+        <w:t>如图3.5，图3.6所示。</w:t>
       </w:r>
     </w:p>
     <w:p>
@@ -3431,8 +3355,8 @@
         <w:adjustRightInd/>
         <w:snapToGrid/>
         <w:spacing w:line="240" w:lineRule="auto"/>
-        <w:ind w:left="0" w:leftChars="0" w:firstLine="0" w:firstLineChars="0"/>
-        <w:jc w:val="center"/>
+        <w:ind w:left="0" w:leftChars="0" w:firstLine="1116" w:firstLineChars="558"/>
+        <w:jc w:val="both"/>
         <w:textAlignment w:val="auto"/>
         <w:rPr>
           <w:rFonts w:hint="default" w:eastAsia="宋体"/>
@@ -3446,22 +3370,49 @@
           <w:szCs w:val="20"/>
           <w:lang w:val="en-US" w:eastAsia="zh-CN"/>
         </w:rPr>
-        <w:t>旧内核的FAT驱动实现有误，新内核FAT分区自动挂载</w:t>
-      </w:r>
-    </w:p>
-    <w:p>
-      <w:pPr>
+        <w:t xml:space="preserve">图3.5 旧内核的FAT驱动实现有误    </w:t>
+      </w:r>
+      <w:r>
+        <w:rPr>
+          <w:rFonts w:hint="eastAsia"/>
+          <w:sz w:val="20"/>
+          <w:szCs w:val="20"/>
+          <w:lang w:val="en-US" w:eastAsia="zh-CN"/>
+        </w:rPr>
+        <w:tab/>
+        <w:t/>
+      </w:r>
+      <w:r>
+        <w:rPr>
+          <w:rFonts w:hint="eastAsia"/>
+          <w:sz w:val="20"/>
+          <w:szCs w:val="20"/>
+          <w:lang w:val="en-US" w:eastAsia="zh-CN"/>
+        </w:rPr>
+        <w:tab/>
+        <w:t>图3.6 新内核FAT分区自动挂载</w:t>
+      </w:r>
+    </w:p>
+    <w:p>
+      <w:pPr>
+        <w:rPr>
+          <w:rFonts w:hint="default" w:eastAsia="宋体"/>
+          <w:lang w:val="en-US" w:eastAsia="zh-CN"/>
+        </w:rPr>
+      </w:pPr>
+      <w:r>
         <w:rPr>
           <w:rFonts w:hint="default"/>
           <w:lang w:val="en-US"/>
         </w:rPr>
-      </w:pPr>
-      <w:r>
-        <w:rPr>
-          <w:rFonts w:hint="default"/>
-          <w:lang w:val="en-US"/>
-        </w:rPr>
         <w:t>在调试工具改进方面，ktracepoint 框架的修复是一个典型的"调试工具的 bug 需要调试"的案例。StarryOS 的 ktracepoint 是一个内核级的追踪框架，类似于 Linux 的 ftrace，允许开发者在内核关键路径上插入追踪点，运行时通过读写 /sys/kernel/debug/tracing 下的文件来启用追踪和读取日志。然而，原始实现中存在一个致命的并发安全问题：追踪数据写入管道时使用的 raw_pipe.lock() 是一个睡眠锁（Mutex），而追踪点的调用上下文可能处于关抢占的原子环境中（例如摄像头驱动的 ioctl 路径，持有 SpinNoPreempt 锁），睡眠锁的 might_sleep() 检测会在原子上下文中触发 panic 导致内核挂死。修复方案是将追踪状态中的 raw_pipe 和 cmdline_cache 两个字段的锁类型从 Mutex 替换为 SpinNoPreempt，与调用上下文的锁语义保持一致。在此基础上，项目还为摄像头驱动新增了 cvi_camera_ioctl 追踪点，能够记录每次 ioctl 调用的命令类型、耗时和成功状态，为摄像头性能分析提供了精确的逐帧数据。</w:t>
+      </w:r>
+      <w:r>
+        <w:rPr>
+          <w:rFonts w:hint="eastAsia"/>
+          <w:lang w:val="en-US" w:eastAsia="zh-CN"/>
+        </w:rPr>
+        <w:t>如图3.7，图3.8所示。</w:t>
       </w:r>
     </w:p>
     <w:p>
@@ -3583,8 +3534,8 @@
     </w:p>
     <w:p>
       <w:pPr>
-        <w:ind w:left="0" w:leftChars="0" w:firstLine="0" w:firstLineChars="0"/>
-        <w:jc w:val="center"/>
+        <w:ind w:left="720" w:leftChars="0" w:firstLine="720" w:firstLineChars="0"/>
+        <w:jc w:val="both"/>
         <w:rPr>
           <w:rFonts w:hint="default"/>
           <w:sz w:val="20"/>
@@ -3599,7 +3550,47 @@
           <w:szCs w:val="18"/>
           <w:lang w:val="en-US" w:eastAsia="zh-CN"/>
         </w:rPr>
-        <w:t>旧内核panic，新内核成功输出调试信息</w:t>
+        <w:t xml:space="preserve">图3.7 旧内核panic   </w:t>
+      </w:r>
+      <w:r>
+        <w:rPr>
+          <w:rFonts w:hint="eastAsia"/>
+          <w:sz w:val="20"/>
+          <w:szCs w:val="18"/>
+          <w:lang w:val="en-US" w:eastAsia="zh-CN"/>
+        </w:rPr>
+        <w:tab/>
+        <w:t/>
+      </w:r>
+      <w:r>
+        <w:rPr>
+          <w:rFonts w:hint="eastAsia"/>
+          <w:sz w:val="20"/>
+          <w:szCs w:val="18"/>
+          <w:lang w:val="en-US" w:eastAsia="zh-CN"/>
+        </w:rPr>
+        <w:tab/>
+        <w:t/>
+      </w:r>
+      <w:r>
+        <w:rPr>
+          <w:rFonts w:hint="eastAsia"/>
+          <w:sz w:val="20"/>
+          <w:szCs w:val="18"/>
+          <w:lang w:val="en-US" w:eastAsia="zh-CN"/>
+        </w:rPr>
+        <w:tab/>
+        <w:t/>
+      </w:r>
+      <w:r>
+        <w:rPr>
+          <w:rFonts w:hint="eastAsia"/>
+          <w:sz w:val="20"/>
+          <w:szCs w:val="18"/>
+          <w:lang w:val="en-US" w:eastAsia="zh-CN"/>
+        </w:rPr>
+        <w:tab/>
+        <w:t xml:space="preserve">    图3.8 新内核成功输出调试信息</w:t>
       </w:r>
     </w:p>
     <w:p>
@@ -3613,16 +3604,23 @@
     <w:p>
       <w:pPr>
         <w:rPr>
+          <w:rFonts w:hint="default" w:eastAsia="宋体"/>
+          <w:lang w:val="en-US" w:eastAsia="zh-CN"/>
+        </w:rPr>
+      </w:pPr>
+      <w:r>
+        <w:rPr>
           <w:rFonts w:hint="default"/>
           <w:lang w:val="en-US"/>
         </w:rPr>
-      </w:pPr>
-      <w:r>
-        <w:rPr>
-          <w:rFonts w:hint="default"/>
-          <w:lang w:val="en-US"/>
-        </w:rPr>
         <w:t>dmesg 功能的启用和 init.sh 自动执行机制则属于提升系统可用性的基础设施改进。前者将内核日志缓冲区暴露为标准设备文件，使得在没有串口连接的 WiFi 远程场景下也能查看内核日志；后者允许在 StarryOS 启动后自动执行一个 Shell 初始化脚本，完成诸如加载内核模块、配置网络接口、设置环境变量等启动任务，使 StarryOS 的行为更接近一个标准的 Linux 发行版。</w:t>
+      </w:r>
+      <w:r>
+        <w:rPr>
+          <w:rFonts w:hint="eastAsia"/>
+          <w:lang w:val="en-US" w:eastAsia="zh-CN"/>
+        </w:rPr>
+        <w:t>图3.9,图3.10所示。</w:t>
       </w:r>
     </w:p>
     <w:p>
@@ -3747,8 +3745,7 @@
         <w:adjustRightInd/>
         <w:snapToGrid/>
         <w:spacing w:line="240" w:lineRule="auto"/>
-        <w:ind w:left="0" w:leftChars="0" w:firstLine="0" w:firstLineChars="0"/>
-        <w:jc w:val="center"/>
+        <w:jc w:val="both"/>
         <w:textAlignment w:val="auto"/>
         <w:rPr>
           <w:rFonts w:hint="eastAsia" w:eastAsia="宋体"/>
@@ -3762,7 +3759,27 @@
           <w:szCs w:val="18"/>
           <w:lang w:val="en-US" w:eastAsia="zh-CN"/>
         </w:rPr>
-        <w:t>旧内核只有固定一行内容，新内核能输出内核实时日志</w:t>
+        <w:t>图3.9 旧内核只有固定一行内容</w:t>
+      </w:r>
+      <w:r>
+        <w:rPr>
+          <w:rFonts w:hint="eastAsia"/>
+          <w:sz w:val="20"/>
+          <w:szCs w:val="18"/>
+          <w:lang w:val="en-US" w:eastAsia="zh-CN"/>
+        </w:rPr>
+        <w:tab/>
+        <w:t/>
+      </w:r>
+      <w:r>
+        <w:rPr>
+          <w:rFonts w:hint="eastAsia"/>
+          <w:sz w:val="20"/>
+          <w:szCs w:val="18"/>
+          <w:lang w:val="en-US" w:eastAsia="zh-CN"/>
+        </w:rPr>
+        <w:tab/>
+        <w:t>图3.10 新内核能输出内核实时日志</w:t>
       </w:r>
     </w:p>
     <w:p>
@@ -3801,13 +3818,6 @@
           <w:rFonts w:hint="default"/>
         </w:rPr>
       </w:pPr>
-    </w:p>
-    <w:p>
-      <w:pPr>
-        <w:rPr>
-          <w:rFonts w:hint="default"/>
-        </w:rPr>
-      </w:pPr>
       <w:r>
         <w:rPr>
           <w:rFonts w:hint="default"/>
@@ -3854,13 +3864,6 @@
           <w:rFonts w:hint="default"/>
         </w:rPr>
       </w:pPr>
-    </w:p>
-    <w:p>
-      <w:pPr>
-        <w:rPr>
-          <w:rFonts w:hint="default"/>
-        </w:rPr>
-      </w:pPr>
       <w:r>
         <w:rPr>
           <w:rFonts w:hint="default"/>
@@ -3874,13 +3877,6 @@
           <w:rFonts w:hint="default"/>
         </w:rPr>
       </w:pPr>
-    </w:p>
-    <w:p>
-      <w:pPr>
-        <w:rPr>
-          <w:rFonts w:hint="default"/>
-        </w:rPr>
-      </w:pPr>
       <w:r>
         <w:rPr>
           <w:rFonts w:hint="default"/>
@@ -3927,13 +3923,6 @@
         </w:rPr>
         <w:t>Web 远程监控系统基于 Axum Web 框架和 Tokio 异步运行时构建，在机器人上监听 8080 端口提供 HTTP 服务。控制面板是一个单页 Web 应用，支持实时状态查询（硬件状态的 JSON 快照）、远程遥控（底盘前进/后退/左转/右转，机械臂抓取/释放/就绪 /重新连接）以及摄像头实时预览（后台线程持续采集 + 编码为 JPEG + 前端每 200 毫秒轮询刷新）。此外，还开发了一个独立的最小化 Web 控制程序 cam_web，不依赖完整的 serve 或 hunt 流程，适用于快速的硬件调试场景。</w:t>
       </w:r>
-    </w:p>
-    <w:p>
-      <w:pPr>
-        <w:rPr>
-          <w:rFonts w:hint="default"/>
-        </w:rPr>
-      </w:pPr>
     </w:p>
     <w:p>
       <w:pPr>
@@ -4000,7 +3989,8 @@
         <w:ind w:firstLine="480"/>
         <w:jc w:val="both"/>
         <w:rPr>
-          <w:rFonts w:hint="default"/>
+          <w:rFonts w:hint="default" w:eastAsia="宋体"/>
+          <w:lang w:val="en-US" w:eastAsia="zh-CN"/>
         </w:rPr>
       </w:pPr>
       <w:r>
@@ -4008,6 +3998,20 @@
           <w:rFonts w:hint="default"/>
         </w:rPr>
         <w:t>本项目采用多层次、多维度的测试策略，确保从内核到应用层的各项功能正常工作且性能可度量。测试环境由 SG2002 开发板（运行 StarryOS）、宿主机（Arch Linux，x86_64）以及必要的串口调试工具（minicom、TFTP 服务器等）组成。</w:t>
+      </w:r>
+      <w:r>
+        <w:rPr>
+          <w:rFonts w:hint="eastAsia"/>
+          <w:lang w:eastAsia="zh-CN"/>
+        </w:rPr>
+        <w:t>如图</w:t>
+      </w:r>
+      <w:r>
+        <w:rPr>
+          <w:rFonts w:hint="eastAsia"/>
+          <w:lang w:val="en-US" w:eastAsia="zh-CN"/>
+        </w:rPr>
+        <w:t>4.1,图4.2所示。</w:t>
       </w:r>
     </w:p>
     <w:p>
@@ -4029,10 +4033,6 @@
         <w:ind w:firstLine="199" w:firstLineChars="83"/>
         <w:jc w:val="center"/>
         <w:textAlignment w:val="auto"/>
-        <w:rPr>
-          <w:rFonts w:hint="default"/>
-          <w:lang w:val="en-US"/>
-        </w:rPr>
       </w:pPr>
       <w:r>
         <w:drawing>
@@ -4077,6 +4077,80 @@
           </wp:inline>
         </w:drawing>
       </w:r>
+    </w:p>
+    <w:p>
+      <w:pPr>
+        <w:keepNext w:val="0"/>
+        <w:keepLines w:val="0"/>
+        <w:pageBreakBefore w:val="0"/>
+        <w:widowControl/>
+        <w:kinsoku/>
+        <w:wordWrap/>
+        <w:overflowPunct/>
+        <w:topLinePunct w:val="0"/>
+        <w:autoSpaceDE/>
+        <w:autoSpaceDN/>
+        <w:bidi w:val="0"/>
+        <w:adjustRightInd/>
+        <w:snapToGrid/>
+        <w:spacing w:line="240" w:lineRule="auto"/>
+        <w:ind w:firstLine="199" w:firstLineChars="83"/>
+        <w:jc w:val="center"/>
+        <w:textAlignment w:val="auto"/>
+        <w:rPr>
+          <w:rFonts w:hint="default" w:eastAsia="宋体"/>
+          <w:lang w:val="en-US" w:eastAsia="zh-CN"/>
+        </w:rPr>
+      </w:pPr>
+      <w:r>
+        <w:rPr>
+          <w:rFonts w:hint="eastAsia"/>
+          <w:lang w:eastAsia="zh-CN"/>
+        </w:rPr>
+        <w:t>图</w:t>
+      </w:r>
+      <w:r>
+        <w:rPr>
+          <w:rFonts w:hint="eastAsia"/>
+          <w:lang w:val="en-US" w:eastAsia="zh-CN"/>
+        </w:rPr>
+        <w:t xml:space="preserve">4.1 </w:t>
+      </w:r>
+      <w:r>
+        <w:rPr>
+          <w:rFonts w:hint="default"/>
+          <w:lang w:val="en-US" w:eastAsia="zh-CN"/>
+        </w:rPr>
+        <w:t xml:space="preserve">minicom </w:t>
+      </w:r>
+      <w:r>
+        <w:rPr>
+          <w:rFonts w:hint="eastAsia"/>
+          <w:lang w:val="en-US" w:eastAsia="zh-CN"/>
+        </w:rPr>
+        <w:t>工具</w:t>
+      </w:r>
+    </w:p>
+    <w:p>
+      <w:pPr>
+        <w:keepNext w:val="0"/>
+        <w:keepLines w:val="0"/>
+        <w:pageBreakBefore w:val="0"/>
+        <w:widowControl/>
+        <w:kinsoku/>
+        <w:wordWrap/>
+        <w:overflowPunct/>
+        <w:topLinePunct w:val="0"/>
+        <w:autoSpaceDE/>
+        <w:autoSpaceDN/>
+        <w:bidi w:val="0"/>
+        <w:adjustRightInd/>
+        <w:snapToGrid/>
+        <w:spacing w:line="240" w:lineRule="auto"/>
+        <w:ind w:firstLine="199" w:firstLineChars="83"/>
+        <w:jc w:val="center"/>
+        <w:textAlignment w:val="auto"/>
+      </w:pPr>
       <w:r>
         <w:rPr>
           <w:rFonts w:hint="default"/>
@@ -4130,11 +4204,61 @@
     </w:p>
     <w:p>
       <w:pPr>
+        <w:keepNext w:val="0"/>
+        <w:keepLines w:val="0"/>
+        <w:pageBreakBefore w:val="0"/>
+        <w:widowControl/>
+        <w:kinsoku/>
+        <w:wordWrap/>
+        <w:overflowPunct/>
+        <w:topLinePunct w:val="0"/>
+        <w:autoSpaceDE/>
+        <w:autoSpaceDN/>
+        <w:bidi w:val="0"/>
+        <w:adjustRightInd/>
+        <w:snapToGrid/>
+        <w:spacing w:line="240" w:lineRule="auto"/>
+        <w:ind w:firstLine="199" w:firstLineChars="83"/>
+        <w:jc w:val="center"/>
+        <w:textAlignment w:val="auto"/>
+        <w:rPr>
+          <w:rFonts w:hint="default" w:eastAsia="宋体"/>
+          <w:lang w:val="en-US" w:eastAsia="zh-CN"/>
+        </w:rPr>
+      </w:pPr>
+      <w:r>
+        <w:rPr>
+          <w:rFonts w:hint="eastAsia"/>
+          <w:lang w:eastAsia="zh-CN"/>
+        </w:rPr>
+        <w:t>图</w:t>
+      </w:r>
+      <w:r>
+        <w:rPr>
+          <w:rFonts w:hint="eastAsia"/>
+          <w:lang w:val="en-US" w:eastAsia="zh-CN"/>
+        </w:rPr>
+        <w:t xml:space="preserve">4.2 </w:t>
+      </w:r>
+      <w:r>
+        <w:rPr>
+          <w:rFonts w:hint="default"/>
+          <w:lang w:val="en-US" w:eastAsia="zh-CN"/>
+        </w:rPr>
+        <w:t xml:space="preserve">ArchLinux </w:t>
+      </w:r>
+      <w:r>
+        <w:rPr>
+          <w:rFonts w:hint="eastAsia"/>
+          <w:lang w:val="en-US" w:eastAsia="zh-CN"/>
+        </w:rPr>
+        <w:t>系统</w:t>
+      </w:r>
+    </w:p>
+    <w:p>
+      <w:pPr>
         <w:ind w:firstLine="480"/>
         <w:jc w:val="both"/>
-        <w:rPr>
-          <w:rFonts w:hint="default"/>
-        </w:rPr>
       </w:pPr>
       <w:r>
         <w:rPr>
@@ -4142,11 +4266,6 @@
         </w:rPr>
         <w:t>在内核层面，每完成一项内核修改（如 WiFi 驱动修复、FAT 挂载启用、dmesg 功能等），均在开发板上实际启动 StarryOS 并通过串口或 SSH 交互式验证功能是否达到预期行为。在应用层面，性能测试是关注的重点。核心性能指标包括：摄像头帧采集耗时、图像预处理耗时、TPU 前向推理耗时、后处理（NMS）耗时、电机控制耗时以及完整循环的端到端延迟和帧率。</w:t>
       </w:r>
-    </w:p>
-    <w:p>
-      <w:pPr>
-        <w:ind w:firstLine="199" w:firstLineChars="83"/>
-      </w:pPr>
     </w:p>
     <w:p>
       <w:pPr>
@@ -4167,7 +4286,8 @@
         <w:ind w:firstLine="480"/>
         <w:jc w:val="both"/>
         <w:rPr>
-          <w:rFonts w:hint="default"/>
+          <w:rFonts w:hint="default" w:eastAsia="宋体"/>
+          <w:lang w:val="en-US" w:eastAsia="zh-CN"/>
         </w:rPr>
       </w:pPr>
       <w:r>
@@ -4175,6 +4295,34 @@
           <w:rFonts w:hint="default"/>
         </w:rPr>
         <w:t>WiFi 修复的验证路径为：启动 StarryOS → 运行 `wifi_switch` 用户态程序 → 检查 `ip addr` 输出确认 `wlan0` 接口出现 → 使用 `wpa_supplicant` 连接无线网络 → 通过 `ping` 命令验证网络连通性 → 通过 `nslookup` 验证 DNS 解析是否正常工作。</w:t>
+      </w:r>
+      <w:r>
+        <w:rPr>
+          <w:rFonts w:hint="eastAsia"/>
+          <w:lang w:eastAsia="zh-CN"/>
+        </w:rPr>
+        <w:t>如图</w:t>
+      </w:r>
+      <w:r>
+        <w:rPr>
+          <w:rFonts w:hint="eastAsia"/>
+          <w:lang w:val="en-US" w:eastAsia="zh-CN"/>
+        </w:rPr>
+        <w:t>4.3,图4.4所示，</w:t>
+      </w:r>
+      <w:r>
+        <w:rPr>
+          <w:rFonts w:hint="default"/>
+          <w:lang w:val="en-US" w:eastAsia="zh-CN"/>
+        </w:rPr>
+        <w:t>ping</w:t>
+      </w:r>
+      <w:r>
+        <w:rPr>
+          <w:rFonts w:hint="eastAsia"/>
+          <w:lang w:val="en-US" w:eastAsia="zh-CN"/>
+        </w:rPr>
+        <w:t>通正常。</w:t>
       </w:r>
     </w:p>
     <w:p>
@@ -4256,12 +4404,65 @@
         <w:adjustRightInd/>
         <w:snapToGrid/>
         <w:spacing w:line="240" w:lineRule="auto"/>
-        <w:ind w:firstLine="199" w:firstLineChars="83"/>
         <w:textAlignment w:val="auto"/>
         <w:rPr>
-          <w:rFonts w:hint="default"/>
-        </w:rPr>
-      </w:pPr>
+          <w:rFonts w:hint="default" w:eastAsia="宋体"/>
+          <w:lang w:val="en-US" w:eastAsia="zh-CN"/>
+        </w:rPr>
+      </w:pPr>
+      <w:r>
+        <w:rPr>
+          <w:rFonts w:hint="eastAsia"/>
+          <w:lang w:val="en-US" w:eastAsia="zh-CN"/>
+        </w:rPr>
+        <w:t xml:space="preserve">    </w:t>
+      </w:r>
+      <w:r>
+        <w:rPr>
+          <w:rFonts w:hint="eastAsia"/>
+          <w:lang w:val="en-US" w:eastAsia="zh-CN"/>
+        </w:rPr>
+        <w:tab/>
+        <w:t/>
+      </w:r>
+      <w:r>
+        <w:rPr>
+          <w:rFonts w:hint="eastAsia"/>
+          <w:lang w:val="en-US" w:eastAsia="zh-CN"/>
+        </w:rPr>
+        <w:tab/>
+        <w:t/>
+      </w:r>
+      <w:r>
+        <w:rPr>
+          <w:rFonts w:hint="eastAsia"/>
+          <w:lang w:val="en-US" w:eastAsia="zh-CN"/>
+        </w:rPr>
+        <w:tab/>
+        <w:t/>
+      </w:r>
+      <w:r>
+        <w:rPr>
+          <w:rFonts w:hint="eastAsia"/>
+          <w:lang w:val="en-US" w:eastAsia="zh-CN"/>
+        </w:rPr>
+        <w:tab/>
+        <w:t>图4.3 pi</w:t>
+      </w:r>
+      <w:r>
+        <w:rPr>
+          <w:rFonts w:hint="default"/>
+          <w:lang w:val="en-US" w:eastAsia="zh-CN"/>
+        </w:rPr>
+        <w:t>ng</w:t>
+      </w:r>
+      <w:r>
+        <w:rPr>
+          <w:rFonts w:hint="eastAsia"/>
+          <w:lang w:val="en-US" w:eastAsia="zh-CN"/>
+        </w:rPr>
+        <w:t>通正常</w:t>
+      </w:r>
     </w:p>
     <w:p>
       <w:pPr>
@@ -4327,18 +4528,41 @@
     </w:p>
     <w:p>
       <w:pPr>
-        <w:ind w:firstLine="199" w:firstLineChars="83"/>
-        <w:rPr>
-          <w:rFonts w:hint="default"/>
-        </w:rPr>
-      </w:pPr>
+        <w:ind w:firstLine="3338" w:firstLineChars="1391"/>
+        <w:rPr>
+          <w:rFonts w:hint="default" w:eastAsia="宋体"/>
+          <w:lang w:val="en-US" w:eastAsia="zh-CN"/>
+        </w:rPr>
+      </w:pPr>
+      <w:r>
+        <w:rPr>
+          <w:rFonts w:hint="eastAsia"/>
+          <w:lang w:val="en-US" w:eastAsia="zh-CN"/>
+        </w:rPr>
+        <w:t xml:space="preserve">  图4.4 </w:t>
+      </w:r>
+      <w:r>
+        <w:rPr>
+          <w:rFonts w:hint="default"/>
+          <w:lang w:val="en-US" w:eastAsia="zh-CN"/>
+        </w:rPr>
+        <w:t xml:space="preserve">wifi </w:t>
+      </w:r>
+      <w:r>
+        <w:rPr>
+          <w:rFonts w:hint="eastAsia"/>
+          <w:lang w:val="en-US" w:eastAsia="zh-CN"/>
+        </w:rPr>
+        <w:t>正常加载</w:t>
+      </w:r>
     </w:p>
     <w:p>
       <w:pPr>
         <w:ind w:firstLine="480"/>
         <w:jc w:val="both"/>
         <w:rPr>
-          <w:rFonts w:hint="default"/>
+          <w:rFonts w:hint="default" w:eastAsia="宋体"/>
+          <w:lang w:val="en-US" w:eastAsia="zh-CN"/>
         </w:rPr>
       </w:pPr>
       <w:r>
@@ -4346,6 +4570,34 @@
           <w:rFonts w:hint="default"/>
         </w:rPr>
         <w:t>其次是通过 `strace` 工具追踪用户态程序的系统调用行为，验证系统调用兼容层的正确性——在本项目修复 `strace` 之前，这项验证手段本身是不可用的，这构成了一个典型的"工具链自举"问题。</w:t>
+      </w:r>
+      <w:r>
+        <w:rPr>
+          <w:rFonts w:hint="default"/>
+          <w:lang w:val="en-US"/>
+        </w:rPr>
+        <w:t>strace</w:t>
+      </w:r>
+      <w:r>
+        <w:rPr>
+          <w:rFonts w:hint="eastAsia"/>
+          <w:lang w:val="en-US" w:eastAsia="zh-CN"/>
+        </w:rPr>
+        <w:t>的调用</w:t>
+      </w:r>
+      <w:r>
+        <w:rPr>
+          <w:rFonts w:hint="eastAsia"/>
+          <w:lang w:eastAsia="zh-CN"/>
+        </w:rPr>
+        <w:t>如图</w:t>
+      </w:r>
+      <w:r>
+        <w:rPr>
+          <w:rFonts w:hint="eastAsia"/>
+          <w:lang w:val="en-US" w:eastAsia="zh-CN"/>
+        </w:rPr>
+        <w:t>4.5所示。</w:t>
       </w:r>
     </w:p>
     <w:p>
@@ -4366,9 +4618,6 @@
         <w:spacing w:line="240" w:lineRule="auto"/>
         <w:ind w:firstLine="199" w:firstLineChars="83"/>
         <w:textAlignment w:val="auto"/>
-        <w:rPr>
-          <w:rFonts w:hint="default"/>
-        </w:rPr>
       </w:pPr>
       <w:r>
         <w:drawing>
@@ -4416,21 +4665,6 @@
     </w:p>
     <w:p>
       <w:pPr>
-        <w:ind w:firstLine="480"/>
-        <w:jc w:val="both"/>
-        <w:rPr>
-          <w:rFonts w:hint="default"/>
-        </w:rPr>
-      </w:pPr>
-      <w:r>
-        <w:rPr>
-          <w:rFonts w:hint="default"/>
-        </w:rPr>
-        <w:t>最后是利用 `ktracepoint` 追踪框架在关键内核路径上插入观测点，验证驱动程序内部逻辑的执行正确性——例如通过 `cvi_camera_ioctl` tracepoint 确认每次 ioctl 调用的命令类型和耗时是否符合预期。</w:t>
-      </w:r>
-    </w:p>
-    <w:p>
-      <w:pPr>
         <w:keepNext w:val="0"/>
         <w:keepLines w:val="0"/>
         <w:pageBreakBefore w:val="0"/>
@@ -4445,9 +4679,57 @@
         <w:adjustRightInd/>
         <w:snapToGrid/>
         <w:spacing w:line="240" w:lineRule="auto"/>
-        <w:ind w:firstLine="199" w:firstLineChars="83"/>
         <w:textAlignment w:val="auto"/>
-      </w:pPr>
+        <w:rPr>
+          <w:rFonts w:hint="default" w:eastAsia="宋体"/>
+          <w:lang w:val="en-US" w:eastAsia="zh-CN"/>
+        </w:rPr>
+      </w:pPr>
+      <w:r>
+        <w:rPr>
+          <w:rFonts w:hint="eastAsia"/>
+          <w:lang w:val="en-US" w:eastAsia="zh-CN"/>
+        </w:rPr>
+        <w:t xml:space="preserve">    </w:t>
+      </w:r>
+      <w:r>
+        <w:rPr>
+          <w:rFonts w:hint="eastAsia"/>
+          <w:lang w:val="en-US" w:eastAsia="zh-CN"/>
+        </w:rPr>
+        <w:tab/>
+        <w:t/>
+      </w:r>
+      <w:r>
+        <w:rPr>
+          <w:rFonts w:hint="eastAsia"/>
+          <w:lang w:val="en-US" w:eastAsia="zh-CN"/>
+        </w:rPr>
+        <w:tab/>
+        <w:t/>
+      </w:r>
+      <w:r>
+        <w:rPr>
+          <w:rFonts w:hint="eastAsia"/>
+          <w:lang w:val="en-US" w:eastAsia="zh-CN"/>
+        </w:rPr>
+        <w:tab/>
+        <w:t xml:space="preserve">图4.5 </w:t>
+      </w:r>
+      <w:r>
+        <w:rPr>
+          <w:rFonts w:hint="default"/>
+          <w:lang w:val="en-US" w:eastAsia="zh-CN"/>
+        </w:rPr>
+        <w:t>strace</w:t>
+      </w:r>
+      <w:r>
+        <w:rPr>
+          <w:rFonts w:hint="eastAsia"/>
+          <w:lang w:val="en-US" w:eastAsia="zh-CN"/>
+        </w:rPr>
+        <w:t>工具正常使用</w:t>
+      </w:r>
     </w:p>
     <w:p>
       <w:pPr>
@@ -4462,14 +4744,205 @@
         <w:rPr>
           <w:rFonts w:hint="default"/>
         </w:rPr>
-        <w:t>这些指标的采集通过 akars 程序内置的逐帧时间线输出来完成，在每帧处理结束后打印形如 `cap=63 pre=56(dec=0 rsz=56) fwd=44 post=14 handle=10 total=191ms` 的详细耗时分解</w:t>
+        <w:t>最后是利用 `ktracepoint` 追踪框架在关键内核路径上插入观测点，验证驱动程序内部逻辑的执行正确性——例如通过 `cvi_camera_ioctl` tracepoint 确认每次 ioctl 调用的命令类型和耗时是否符合预期。</w:t>
       </w:r>
       <w:r>
         <w:rPr>
           <w:rFonts w:hint="eastAsia"/>
           <w:lang w:eastAsia="zh-CN"/>
         </w:rPr>
-        <w:t>。</w:t>
+        <w:t>其调用如图</w:t>
+      </w:r>
+      <w:r>
+        <w:rPr>
+          <w:rFonts w:hint="eastAsia"/>
+          <w:lang w:val="en-US" w:eastAsia="zh-CN"/>
+        </w:rPr>
+        <w:t>4.6所示。</w:t>
+      </w:r>
+    </w:p>
+    <w:p>
+      <w:pPr>
+        <w:keepNext w:val="0"/>
+        <w:keepLines w:val="0"/>
+        <w:pageBreakBefore w:val="0"/>
+        <w:widowControl/>
+        <w:suppressLineNumbers w:val="0"/>
+        <w:kinsoku/>
+        <w:wordWrap/>
+        <w:overflowPunct/>
+        <w:topLinePunct w:val="0"/>
+        <w:autoSpaceDE/>
+        <w:autoSpaceDN/>
+        <w:bidi w:val="0"/>
+        <w:adjustRightInd/>
+        <w:snapToGrid/>
+        <w:spacing w:line="240" w:lineRule="auto"/>
+        <w:jc w:val="left"/>
+        <w:textAlignment w:val="auto"/>
+      </w:pPr>
+      <w:r>
+        <w:rPr>
+          <w:rFonts w:ascii="宋体" w:hAnsi="宋体" w:eastAsia="宋体" w:cs="宋体"/>
+          <w:kern w:val="0"/>
+          <w:sz w:val="24"/>
+          <w:szCs w:val="24"/>
+          <w:lang w:val="en-US" w:eastAsia="zh-CN" w:bidi="ar"/>
+        </w:rPr>
+        <w:drawing>
+          <wp:inline distT="0" distB="0" distL="114300" distR="114300">
+            <wp:extent cx="5216525" cy="3340100"/>
+            <wp:effectExtent l="0" t="0" r="10795" b="12700"/>
+            <wp:docPr id="25" name="图片 1" descr="IMG_256"/>
+            <wp:cNvGraphicFramePr>
+              <a:graphicFrameLocks xmlns:a="http://schemas.openxmlformats.org/drawingml/2006/main" noChangeAspect="1"/>
+            </wp:cNvGraphicFramePr>
+            <a:graphic xmlns:a="http://schemas.openxmlformats.org/drawingml/2006/main">
+              <a:graphicData uri="http://schemas.openxmlformats.org/drawingml/2006/picture">
+                <pic:pic xmlns:pic="http://schemas.openxmlformats.org/drawingml/2006/picture">
+                  <pic:nvPicPr>
+                    <pic:cNvPr id="25" name="图片 1" descr="IMG_256"/>
+                    <pic:cNvPicPr>
+                      <a:picLocks noChangeAspect="1"/>
+                    </pic:cNvPicPr>
+                  </pic:nvPicPr>
+                  <pic:blipFill>
+                    <a:blip r:embed="rId27"/>
+                    <a:stretch>
+                      <a:fillRect/>
+                    </a:stretch>
+                  </pic:blipFill>
+                  <pic:spPr>
+                    <a:xfrm>
+                      <a:off x="0" y="0"/>
+                      <a:ext cx="5216525" cy="3340100"/>
+                    </a:xfrm>
+                    <a:prstGeom prst="rect">
+                      <a:avLst/>
+                    </a:prstGeom>
+                    <a:noFill/>
+                    <a:ln w="9525">
+                      <a:noFill/>
+                    </a:ln>
+                  </pic:spPr>
+                </pic:pic>
+              </a:graphicData>
+            </a:graphic>
+          </wp:inline>
+        </w:drawing>
+      </w:r>
+    </w:p>
+    <w:p>
+      <w:pPr>
+        <w:ind w:firstLine="3338" w:firstLineChars="1391"/>
+        <w:jc w:val="both"/>
+        <w:rPr>
+          <w:rFonts w:hint="default"/>
+          <w:lang w:val="en-US" w:eastAsia="zh-CN"/>
+        </w:rPr>
+      </w:pPr>
+      <w:r>
+        <w:rPr>
+          <w:rFonts w:hint="eastAsia"/>
+          <w:lang w:val="en-US" w:eastAsia="zh-CN"/>
+        </w:rPr>
+        <w:t xml:space="preserve">图4.6 </w:t>
+      </w:r>
+      <w:r>
+        <w:rPr>
+          <w:rFonts w:hint="default"/>
+          <w:lang w:val="en-US" w:eastAsia="zh-CN"/>
+        </w:rPr>
+        <w:t>kstrace</w:t>
+      </w:r>
+      <w:r>
+        <w:rPr>
+          <w:rFonts w:hint="eastAsia"/>
+          <w:lang w:val="en-US" w:eastAsia="zh-CN"/>
+        </w:rPr>
+        <w:t>工具正常使用</w:t>
+      </w:r>
+    </w:p>
+    <w:p>
+      <w:pPr>
+        <w:ind w:firstLine="480"/>
+        <w:jc w:val="both"/>
+        <w:rPr>
+          <w:rFonts w:hint="default"/>
+          <w:lang w:val="en-US"/>
+        </w:rPr>
+      </w:pPr>
+      <w:r>
+        <w:rPr>
+          <w:rFonts w:hint="default"/>
+        </w:rPr>
+        <w:t>这些指标的采集通过 akars 程序内置的逐帧时间线输出来完成，在每帧处理结束后cap</w:t>
+      </w:r>
+      <w:r>
+        <w:rPr>
+          <w:rFonts w:hint="eastAsia"/>
+          <w:lang w:eastAsia="zh-CN"/>
+        </w:rPr>
+        <w:t>（摄像头捕获时间）、</w:t>
+      </w:r>
+      <w:r>
+        <w:rPr>
+          <w:rFonts w:hint="default"/>
+        </w:rPr>
+        <w:t xml:space="preserve"> pre</w:t>
+      </w:r>
+      <w:r>
+        <w:rPr>
+          <w:rFonts w:hint="eastAsia"/>
+          <w:lang w:eastAsia="zh-CN"/>
+        </w:rPr>
+        <w:t>（预处理时间）、</w:t>
+      </w:r>
+      <w:r>
+        <w:rPr>
+          <w:rFonts w:hint="default"/>
+        </w:rPr>
+        <w:t>fwd</w:t>
+      </w:r>
+      <w:r>
+        <w:rPr>
+          <w:rFonts w:hint="eastAsia"/>
+          <w:lang w:eastAsia="zh-CN"/>
+        </w:rPr>
+        <w:t>（推理时间）、</w:t>
+      </w:r>
+      <w:r>
+        <w:rPr>
+          <w:rFonts w:hint="default"/>
+        </w:rPr>
+        <w:t xml:space="preserve"> post</w:t>
+      </w:r>
+      <w:r>
+        <w:rPr>
+          <w:rFonts w:hint="eastAsia"/>
+          <w:lang w:eastAsia="zh-CN"/>
+        </w:rPr>
+        <w:t>（后处理时间）</w:t>
+      </w:r>
+      <w:r>
+        <w:rPr>
+          <w:rFonts w:hint="default"/>
+        </w:rPr>
+        <w:t>total</w:t>
+      </w:r>
+      <w:r>
+        <w:rPr>
+          <w:rFonts w:hint="eastAsia"/>
+          <w:lang w:eastAsia="zh-CN"/>
+        </w:rPr>
+        <w:t>（总耗时）。如图</w:t>
+      </w:r>
+      <w:r>
+        <w:rPr>
+          <w:rFonts w:hint="eastAsia"/>
+          <w:lang w:val="en-US" w:eastAsia="zh-CN"/>
+        </w:rPr>
+        <w:t xml:space="preserve">4.7所示， </w:t>
       </w:r>
     </w:p>
     <w:p>
@@ -4491,30 +4964,6 @@
         <w:ind w:firstLine="199" w:firstLineChars="83"/>
         <w:jc w:val="center"/>
         <w:textAlignment w:val="auto"/>
-      </w:pPr>
-    </w:p>
-    <w:p>
-      <w:pPr>
-        <w:keepNext w:val="0"/>
-        <w:keepLines w:val="0"/>
-        <w:pageBreakBefore w:val="0"/>
-        <w:widowControl/>
-        <w:kinsoku/>
-        <w:wordWrap/>
-        <w:overflowPunct/>
-        <w:topLinePunct w:val="0"/>
-        <w:autoSpaceDE/>
-        <w:autoSpaceDN/>
-        <w:bidi w:val="0"/>
-        <w:adjustRightInd/>
-        <w:snapToGrid/>
-        <w:spacing w:line="240" w:lineRule="auto"/>
-        <w:ind w:firstLine="199" w:firstLineChars="83"/>
-        <w:jc w:val="center"/>
-        <w:textAlignment w:val="auto"/>
-        <w:rPr>
-          <w:rFonts w:hint="default"/>
-        </w:rPr>
       </w:pPr>
       <w:r>
         <w:drawing>
@@ -4535,7 +4984,7 @@
                     </pic:cNvPicPr>
                   </pic:nvPicPr>
                   <pic:blipFill>
-                    <a:blip r:embed="rId27"/>
+                    <a:blip r:embed="rId28"/>
                     <a:srcRect l="-369" t="61866" r="369" b="864"/>
                     <a:stretch>
                       <a:fillRect/>
@@ -4559,10 +5008,43 @@
     </w:p>
     <w:p>
       <w:pPr>
+        <w:keepNext w:val="0"/>
+        <w:keepLines w:val="0"/>
+        <w:pageBreakBefore w:val="0"/>
+        <w:widowControl/>
+        <w:kinsoku/>
+        <w:wordWrap/>
+        <w:overflowPunct/>
+        <w:topLinePunct w:val="0"/>
+        <w:autoSpaceDE/>
+        <w:autoSpaceDN/>
+        <w:bidi w:val="0"/>
+        <w:adjustRightInd/>
+        <w:snapToGrid/>
+        <w:spacing w:line="240" w:lineRule="auto"/>
+        <w:ind w:firstLine="3067" w:firstLineChars="1278"/>
+        <w:jc w:val="both"/>
+        <w:textAlignment w:val="auto"/>
+        <w:rPr>
+          <w:rFonts w:hint="default" w:eastAsia="宋体"/>
+          <w:lang w:val="en-US" w:eastAsia="zh-CN"/>
+        </w:rPr>
+      </w:pPr>
+      <w:r>
+        <w:rPr>
+          <w:rFonts w:hint="eastAsia"/>
+          <w:lang w:val="en-US" w:eastAsia="zh-CN"/>
+        </w:rPr>
+        <w:t xml:space="preserve">   图4.7 各个阶段耗时</w:t>
+      </w:r>
+    </w:p>
+    <w:p>
+      <w:pPr>
         <w:ind w:firstLine="480"/>
         <w:jc w:val="both"/>
         <w:rPr>
-          <w:rFonts w:hint="default"/>
+          <w:rFonts w:hint="default" w:eastAsia="宋体"/>
+          <w:lang w:val="en-US" w:eastAsia="zh-CN"/>
         </w:rPr>
       </w:pPr>
       <w:r>
@@ -4570,6 +5052,20 @@
           <w:rFonts w:hint="default"/>
         </w:rPr>
         <w:t>此外，启动时自动运行的 `diagnose_timing()` 诊断函数分别测试 cmd3（原始 MJPEG）和 cmd4（YUV via JPU）两种摄像头采集模式各一帧的耗时，将帧等待与 JPU 硬件解码的时间分离，为性能瓶颈定位提供数据支撑。</w:t>
+      </w:r>
+      <w:r>
+        <w:rPr>
+          <w:rFonts w:hint="eastAsia"/>
+          <w:lang w:eastAsia="zh-CN"/>
+        </w:rPr>
+        <w:t>如图</w:t>
+      </w:r>
+      <w:r>
+        <w:rPr>
+          <w:rFonts w:hint="eastAsia"/>
+          <w:lang w:val="en-US" w:eastAsia="zh-CN"/>
+        </w:rPr>
+        <w:t>4.8所示。</w:t>
       </w:r>
     </w:p>
     <w:p>
@@ -4614,7 +5110,7 @@
                     </pic:cNvPicPr>
                   </pic:nvPicPr>
                   <pic:blipFill>
-                    <a:blip r:embed="rId28"/>
+                    <a:blip r:embed="rId29"/>
                     <a:stretch>
                       <a:fillRect/>
                     </a:stretch>
@@ -4637,18 +5133,62 @@
     </w:p>
     <w:p>
       <w:pPr>
-        <w:ind w:firstLine="199" w:firstLineChars="83"/>
-        <w:rPr>
-          <w:rFonts w:hint="default"/>
-        </w:rPr>
-      </w:pPr>
+        <w:ind w:firstLine="3784" w:firstLineChars="1577"/>
+        <w:rPr>
+          <w:rFonts w:hint="default" w:eastAsia="宋体"/>
+          <w:lang w:val="en-US" w:eastAsia="zh-CN"/>
+        </w:rPr>
+      </w:pPr>
+      <w:r>
+        <w:rPr>
+          <w:rFonts w:hint="eastAsia"/>
+          <w:lang w:eastAsia="zh-CN"/>
+        </w:rPr>
+        <w:t>图</w:t>
+      </w:r>
+      <w:r>
+        <w:rPr>
+          <w:rFonts w:hint="eastAsia"/>
+          <w:lang w:val="en-US" w:eastAsia="zh-CN"/>
+        </w:rPr>
+        <w:t xml:space="preserve">4.8 </w:t>
+      </w:r>
+      <w:r>
+        <w:rPr>
+          <w:rFonts w:hint="default"/>
+          <w:lang w:val="en-US" w:eastAsia="zh-CN"/>
+        </w:rPr>
+        <w:t xml:space="preserve">cmd3 </w:t>
+      </w:r>
+      <w:r>
+        <w:rPr>
+          <w:rFonts w:hint="eastAsia"/>
+          <w:lang w:val="en-US" w:eastAsia="zh-CN"/>
+        </w:rPr>
+        <w:t xml:space="preserve">和 </w:t>
+      </w:r>
+      <w:r>
+        <w:rPr>
+          <w:rFonts w:hint="default"/>
+          <w:lang w:val="en-US" w:eastAsia="zh-CN"/>
+        </w:rPr>
+        <w:t xml:space="preserve">cmd4 </w:t>
+      </w:r>
+      <w:r>
+        <w:rPr>
+          <w:rFonts w:hint="eastAsia"/>
+          <w:lang w:val="en-US" w:eastAsia="zh-CN"/>
+        </w:rPr>
+        <w:t>各自耗时</w:t>
+      </w:r>
     </w:p>
     <w:p>
       <w:pPr>
         <w:ind w:firstLine="480"/>
         <w:jc w:val="both"/>
         <w:rPr>
-          <w:rFonts w:hint="default"/>
+          <w:rFonts w:hint="default" w:eastAsia="宋体"/>
+          <w:lang w:val="en-US" w:eastAsia="zh-CN"/>
         </w:rPr>
       </w:pPr>
       <w:r>
@@ -4656,6 +5196,48 @@
           <w:rFonts w:hint="default"/>
         </w:rPr>
         <w:t>在机器人行为层面，正确性的验证采用实际环境测试：在铺设了网球的地面上运行 akars 的 `hunt` 模式，观察机器人是否能成功完成"搜索 → 发现网球 → 追击靠近 → 抓取收集"的完整闭环。</w:t>
+      </w:r>
+      <w:r>
+        <w:rPr>
+          <w:rFonts w:hint="eastAsia"/>
+          <w:lang w:eastAsia="zh-CN"/>
+        </w:rPr>
+        <w:t>如图</w:t>
+      </w:r>
+      <w:r>
+        <w:rPr>
+          <w:rFonts w:hint="eastAsia"/>
+          <w:lang w:val="en-US" w:eastAsia="zh-CN"/>
+        </w:rPr>
+        <w:t>4</w:t>
+      </w:r>
+      <w:r>
+        <w:rPr>
+          <w:rFonts w:hint="default"/>
+          <w:lang w:val="en-US" w:eastAsia="zh-CN"/>
+        </w:rPr>
+        <w:t>.9</w:t>
+      </w:r>
+      <w:r>
+        <w:rPr>
+          <w:rFonts w:hint="eastAsia"/>
+          <w:lang w:val="en-US" w:eastAsia="zh-CN"/>
+        </w:rPr>
+        <w:t>和图</w:t>
+      </w:r>
+      <w:r>
+        <w:rPr>
+          <w:rFonts w:hint="default"/>
+          <w:lang w:val="en-US" w:eastAsia="zh-CN"/>
+        </w:rPr>
+        <w:t>4.10</w:t>
+      </w:r>
+      <w:r>
+        <w:rPr>
+          <w:rFonts w:hint="eastAsia"/>
+          <w:lang w:val="en-US" w:eastAsia="zh-CN"/>
+        </w:rPr>
+        <w:t>所示</w:t>
       </w:r>
     </w:p>
     <w:p>
@@ -4676,10 +5258,6 @@
         <w:spacing w:line="240" w:lineRule="auto"/>
         <w:ind w:firstLine="199" w:firstLineChars="83"/>
         <w:textAlignment w:val="auto"/>
-        <w:rPr>
-          <w:rFonts w:hint="default" w:eastAsia="宋体"/>
-          <w:lang w:val="en-US" w:eastAsia="zh-CN"/>
-        </w:rPr>
       </w:pPr>
       <w:r>
         <w:drawing>
@@ -4700,7 +5278,7 @@
                     </pic:cNvPicPr>
                   </pic:nvPicPr>
                   <pic:blipFill>
-                    <a:blip r:embed="rId29"/>
+                    <a:blip r:embed="rId30"/>
                     <a:stretch>
                       <a:fillRect/>
                     </a:stretch>
@@ -4729,7 +5307,7 @@
           <w:rFonts w:hint="eastAsia"/>
           <w:lang w:val="en-US" w:eastAsia="zh-CN"/>
         </w:rPr>
-        <w:t xml:space="preserve">      </w:t>
+        <w:t xml:space="preserve">            </w:t>
       </w:r>
       <w:r>
         <w:drawing>
@@ -4750,7 +5328,7 @@
                     </pic:cNvPicPr>
                   </pic:nvPicPr>
                   <pic:blipFill>
-                    <a:blip r:embed="rId30"/>
+                    <a:blip r:embed="rId31"/>
                     <a:stretch>
                       <a:fillRect/>
                     </a:stretch>
@@ -4777,6 +5355,61 @@
     </w:p>
     <w:p>
       <w:pPr>
+        <w:keepNext w:val="0"/>
+        <w:keepLines w:val="0"/>
+        <w:pageBreakBefore w:val="0"/>
+        <w:widowControl/>
+        <w:kinsoku/>
+        <w:wordWrap/>
+        <w:overflowPunct/>
+        <w:topLinePunct w:val="0"/>
+        <w:autoSpaceDE/>
+        <w:autoSpaceDN/>
+        <w:bidi w:val="0"/>
+        <w:adjustRightInd/>
+        <w:snapToGrid/>
+        <w:spacing w:line="240" w:lineRule="auto"/>
+        <w:ind w:firstLine="199" w:firstLineChars="83"/>
+        <w:textAlignment w:val="auto"/>
+        <w:rPr>
+          <w:rFonts w:hint="default" w:eastAsia="宋体"/>
+          <w:lang w:val="en-US" w:eastAsia="zh-CN"/>
+        </w:rPr>
+      </w:pPr>
+      <w:r>
+        <w:rPr>
+          <w:rFonts w:hint="eastAsia"/>
+          <w:lang w:val="en-US" w:eastAsia="zh-CN"/>
+        </w:rPr>
+        <w:t xml:space="preserve">              图4.9 机器人发现目标</w:t>
+      </w:r>
+      <w:r>
+        <w:rPr>
+          <w:rFonts w:hint="eastAsia"/>
+          <w:lang w:val="en-US" w:eastAsia="zh-CN"/>
+        </w:rPr>
+        <w:tab/>
+        <w:t/>
+      </w:r>
+      <w:r>
+        <w:rPr>
+          <w:rFonts w:hint="eastAsia"/>
+          <w:lang w:val="en-US" w:eastAsia="zh-CN"/>
+        </w:rPr>
+        <w:tab/>
+        <w:t/>
+      </w:r>
+      <w:r>
+        <w:rPr>
+          <w:rFonts w:hint="eastAsia"/>
+          <w:lang w:val="en-US" w:eastAsia="zh-CN"/>
+        </w:rPr>
+        <w:tab/>
+        <w:t xml:space="preserve">图4.10 机器人设法徐徐靠近 </w:t>
+      </w:r>
+    </w:p>
+    <w:p>
+      <w:pPr>
         <w:ind w:firstLine="480"/>
         <w:jc w:val="both"/>
         <w:rPr>
@@ -4795,16 +5428,8 @@
         <w:ind w:firstLine="480"/>
         <w:jc w:val="both"/>
         <w:rPr>
-          <w:rFonts w:hint="default"/>
-        </w:rPr>
-      </w:pPr>
-    </w:p>
-    <w:p>
-      <w:pPr>
-        <w:ind w:firstLine="480"/>
-        <w:jc w:val="both"/>
-        <w:rPr>
-          <w:rFonts w:hint="default"/>
+          <w:rFonts w:hint="default" w:eastAsia="宋体"/>
+          <w:lang w:val="en-US" w:eastAsia="zh-CN"/>
         </w:rPr>
       </w:pPr>
       <w:r>
@@ -4812,6 +5437,20 @@
           <w:rFonts w:hint="default"/>
         </w:rPr>
         <w:t>TPU 推理链路（模型加载 → 图像输入 → 前向计算 → 结果输出）已完全打通，用户态程序能够在 StarryOS 上独立完成网球的 YOLOv8 检测。</w:t>
+      </w:r>
+      <w:r>
+        <w:rPr>
+          <w:rFonts w:hint="eastAsia"/>
+          <w:lang w:eastAsia="zh-CN"/>
+        </w:rPr>
+        <w:t>如图</w:t>
+      </w:r>
+      <w:r>
+        <w:rPr>
+          <w:rFonts w:hint="eastAsia"/>
+          <w:lang w:val="en-US" w:eastAsia="zh-CN"/>
+        </w:rPr>
+        <w:t>4.11和图4.12所示。</w:t>
       </w:r>
     </w:p>
     <w:p>
@@ -4832,10 +5471,6 @@
         <w:spacing w:line="240" w:lineRule="auto"/>
         <w:ind w:firstLine="480"/>
         <w:textAlignment w:val="auto"/>
-        <w:rPr>
-          <w:rFonts w:hint="default"/>
-          <w:lang w:val="en-US"/>
-        </w:rPr>
       </w:pPr>
       <w:r>
         <w:drawing>
@@ -4856,7 +5491,7 @@
                     </pic:cNvPicPr>
                   </pic:nvPicPr>
                   <pic:blipFill>
-                    <a:blip r:embed="rId28"/>
+                    <a:blip r:embed="rId29"/>
                     <a:stretch>
                       <a:fillRect/>
                     </a:stretch>
@@ -4884,6 +5519,13 @@
         <w:t xml:space="preserve"> </w:t>
       </w:r>
       <w:r>
+        <w:rPr>
+          <w:rFonts w:hint="eastAsia"/>
+          <w:lang w:val="en-US" w:eastAsia="zh-CN"/>
+        </w:rPr>
+        <w:t xml:space="preserve">     </w:t>
+      </w:r>
+      <w:r>
         <w:drawing>
           <wp:inline distT="0" distB="0" distL="114300" distR="114300">
             <wp:extent cx="2022475" cy="1969770"/>
@@ -4902,7 +5544,7 @@
                     </pic:cNvPicPr>
                   </pic:nvPicPr>
                   <pic:blipFill>
-                    <a:blip r:embed="rId31"/>
+                    <a:blip r:embed="rId32"/>
                     <a:stretch>
                       <a:fillRect/>
                     </a:stretch>
@@ -4925,6 +5567,65 @@
     </w:p>
     <w:p>
       <w:pPr>
+        <w:keepNext w:val="0"/>
+        <w:keepLines w:val="0"/>
+        <w:pageBreakBefore w:val="0"/>
+        <w:widowControl/>
+        <w:kinsoku/>
+        <w:wordWrap/>
+        <w:overflowPunct/>
+        <w:topLinePunct w:val="0"/>
+        <w:autoSpaceDE/>
+        <w:autoSpaceDN/>
+        <w:bidi w:val="0"/>
+        <w:adjustRightInd/>
+        <w:snapToGrid/>
+        <w:spacing w:line="240" w:lineRule="auto"/>
+        <w:ind w:firstLine="480"/>
+        <w:textAlignment w:val="auto"/>
+        <w:rPr>
+          <w:rFonts w:hint="default" w:eastAsia="宋体"/>
+          <w:lang w:val="en-US" w:eastAsia="zh-CN"/>
+        </w:rPr>
+      </w:pPr>
+      <w:r>
+        <w:rPr>
+          <w:rFonts w:hint="eastAsia"/>
+          <w:lang w:val="en-US" w:eastAsia="zh-CN"/>
+        </w:rPr>
+        <w:t xml:space="preserve">        图4.11 </w:t>
+      </w:r>
+      <w:r>
+        <w:rPr>
+          <w:rFonts w:hint="default"/>
+          <w:lang w:val="en-US" w:eastAsia="zh-CN"/>
+        </w:rPr>
+        <w:t>yolov8</w:t>
+      </w:r>
+      <w:r>
+        <w:rPr>
+          <w:rFonts w:hint="eastAsia"/>
+          <w:lang w:val="en-US" w:eastAsia="zh-CN"/>
+        </w:rPr>
+        <w:t>在</w:t>
+      </w:r>
+      <w:r>
+        <w:rPr>
+          <w:rFonts w:hint="default"/>
+          <w:lang w:val="en-US" w:eastAsia="zh-CN"/>
+        </w:rPr>
+        <w:t>sg2002</w:t>
+      </w:r>
+      <w:r>
+        <w:rPr>
+          <w:rFonts w:hint="eastAsia"/>
+          <w:lang w:val="en-US" w:eastAsia="zh-CN"/>
+        </w:rPr>
+        <w:t>上推理过程           图4.12 对应推理结果</w:t>
+      </w:r>
+    </w:p>
+    <w:p>
+      <w:pPr>
         <w:ind w:firstLine="480"/>
         <w:jc w:val="both"/>
         <w:rPr>
@@ -4943,14 +5644,55 @@
         <w:ind w:firstLine="480"/>
         <w:jc w:val="both"/>
         <w:rPr>
-          <w:rFonts w:hint="default"/>
-        </w:rPr>
-      </w:pPr>
-      <w:r>
-        <w:rPr>
-          <w:rFonts w:hint="default"/>
-        </w:rPr>
-        <w:t>在修复摄像头采集管道的 `INIT` ioctl 调用时机后，逐帧耗时发生了质的变化。修复后的逐帧耗时分解如下：摄像头采集约 63 毫秒（占比 33%），YUV 到 RGB 的预处理约 56 毫秒（占比 29%），TPU 前向推理约 44 毫秒（占比 23%），NMS 和后处理约 14 毫秒（占比 7%），电机控制约 9 至 140 毫秒（取决于当前行为的复杂度，占比 5% 至 42%）。单帧总时间从优化前的约 3100 毫秒降至约 190 毫秒，对应帧率从约 0.3 FPS 提升至 3 至 5 FPS，提升幅度约为 12 至 16 倍。其中摄像头采集环节的改善最为显著：从约 2860 毫秒降至约 63 毫秒，提升约 45 倍。</w:t>
+          <w:rFonts w:hint="default" w:eastAsia="宋体"/>
+          <w:lang w:val="en-US" w:eastAsia="zh-CN"/>
+        </w:rPr>
+      </w:pPr>
+      <w:r>
+        <w:rPr>
+          <w:rFonts w:hint="default"/>
+        </w:rPr>
+        <w:t xml:space="preserve">在修复摄像头采集管道的 `INIT` ioctl 调用时机后，逐帧耗时发生了质的变化。修复后的逐帧耗时分解如下：摄像头采集约 63 毫秒（占比 33%），YUV 到 RGB 的预处理约 56 毫秒（占比 29%），TPU 前向推理约 44 毫秒（占比 23%），NMS 和后处理约 14 毫秒（占比 7%），电机控制约 9 至 140 毫秒（取决于当前行为的复杂度，占比 5% 至 42%）。单帧总时间从优化前的约 3100 毫秒降至约 190 毫秒，对应帧率从约 0.3 FPS 提升至 3 至 5 FPS，提升幅度约为 12 至 16 倍。其中摄像头采集环节的改善最为显著：从约 </w:t>
+      </w:r>
+      <w:r>
+        <w:rPr>
+          <w:rFonts w:hint="eastAsia"/>
+          <w:lang w:val="en-US" w:eastAsia="zh-CN"/>
+        </w:rPr>
+        <w:t>3042</w:t>
+      </w:r>
+      <w:r>
+        <w:rPr>
+          <w:rFonts w:hint="default"/>
+        </w:rPr>
+        <w:t xml:space="preserve"> 毫秒降至约</w:t>
+      </w:r>
+      <w:r>
+        <w:rPr>
+          <w:rFonts w:hint="eastAsia"/>
+          <w:lang w:val="en-US" w:eastAsia="zh-CN"/>
+        </w:rPr>
+        <w:t>56</w:t>
+      </w:r>
+      <w:r>
+        <w:rPr>
+          <w:rFonts w:hint="default"/>
+        </w:rPr>
+        <w:t>毫秒，提升约 45 倍。</w:t>
+      </w:r>
+      <w:r>
+        <w:rPr>
+          <w:rFonts w:hint="eastAsia"/>
+          <w:lang w:eastAsia="zh-CN"/>
+        </w:rPr>
+        <w:t>如图</w:t>
+      </w:r>
+      <w:r>
+        <w:rPr>
+          <w:rFonts w:hint="eastAsia"/>
+          <w:lang w:val="en-US" w:eastAsia="zh-CN"/>
+        </w:rPr>
+        <w:t>4.13 和 图4.14所示。</w:t>
       </w:r>
     </w:p>
     <w:p>
@@ -4995,7 +5737,7 @@
                     </pic:cNvPicPr>
                   </pic:nvPicPr>
                   <pic:blipFill>
-                    <a:blip r:embed="rId32"/>
+                    <a:blip r:embed="rId33"/>
                     <a:stretch>
                       <a:fillRect/>
                     </a:stretch>
@@ -5045,7 +5787,7 @@
                     </pic:cNvPicPr>
                   </pic:nvPicPr>
                   <pic:blipFill>
-                    <a:blip r:embed="rId33"/>
+                    <a:blip r:embed="rId34"/>
                     <a:stretch>
                       <a:fillRect/>
                     </a:stretch>
@@ -5088,18 +5830,7 @@
     <w:p>
       <w:pPr>
         <w:ind w:firstLine="480"/>
-        <w:rPr>
-          <w:rFonts w:hint="default"/>
-        </w:rPr>
-      </w:pPr>
-    </w:p>
-    <w:p>
-      <w:pPr>
-        <w:ind w:firstLine="480"/>
         <w:jc w:val="both"/>
-        <w:rPr>
-          <w:rFonts w:hint="default"/>
-        </w:rPr>
       </w:pPr>
       <w:r>
         <w:rPr>
@@ -5107,115 +5838,6 @@
         </w:rPr>
         <w:t>机器人行为优化的效果在实际抓取测试中得到了验证。优化前的硬阈值行为模型在低速帧率下经常出现"冲过头"或"过早触发抓取"的失败模式。优化后的二次减速曲线和两帧确认机制使得机器人在接近网球时能够平缓减速并就位于有效抓取位置。按照最终校准后的参数，机器人能够在检测到网球后约 5 至 10 秒内完成接近和抓取动作（取决于初始距离），且机械臂 5 步序列的指令间延时确保了每一步动作的可靠执行，不再出现原始版本中指令丢失的问题。</w:t>
       </w:r>
-    </w:p>
-    <w:p>
-      <w:pPr>
-        <w:ind w:firstLine="480"/>
-      </w:pPr>
-    </w:p>
-    <w:p>
-      <w:pPr>
-        <w:ind w:firstLine="480"/>
-        <w:jc w:val="both"/>
-        <w:rPr>
-          <w:rFonts w:hint="eastAsia"/>
-        </w:rPr>
-      </w:pPr>
-      <w:r>
-        <w:rPr>
-          <w:rFonts w:hint="eastAsia"/>
-        </w:rPr>
-        <w:t>性能优化取得了显著的阶段性成果：在用户态程序的帧率指标上，经优化后的 StarryOS 运行帧率（3-5 FPS）已显著优于原始基线的帧率（0.3 FPS）；平均一帧视频采集需要73ms, 预处理56ms, 后处理14ms, 推理56ms, 一帧视频总处理时长189ms（不包括电机时间）</w:t>
-      </w:r>
-    </w:p>
-    <w:p>
-      <w:pPr>
-        <w:ind w:firstLine="480"/>
-        <w:jc w:val="both"/>
-        <w:rPr>
-          <w:rFonts w:hint="default"/>
-        </w:rPr>
-      </w:pPr>
-    </w:p>
-    <w:p>
-      <w:pPr>
-        <w:keepNext w:val="0"/>
-        <w:keepLines w:val="0"/>
-        <w:pageBreakBefore w:val="0"/>
-        <w:widowControl/>
-        <w:kinsoku/>
-        <w:wordWrap/>
-        <w:overflowPunct/>
-        <w:topLinePunct w:val="0"/>
-        <w:autoSpaceDE/>
-        <w:autoSpaceDN/>
-        <w:bidi w:val="0"/>
-        <w:adjustRightInd/>
-        <w:snapToGrid/>
-        <w:spacing w:line="240" w:lineRule="auto"/>
-        <w:ind w:firstLine="480"/>
-        <w:textAlignment w:val="auto"/>
-      </w:pPr>
-      <w:r>
-        <w:drawing>
-          <wp:inline distT="0" distB="0" distL="114300" distR="114300">
-            <wp:extent cx="6019165" cy="2762250"/>
-            <wp:effectExtent l="0" t="0" r="635" b="0"/>
-            <wp:docPr id="24" name="图片 1"/>
-            <wp:cNvGraphicFramePr>
-              <a:graphicFrameLocks xmlns:a="http://schemas.openxmlformats.org/drawingml/2006/main" noChangeAspect="1"/>
-            </wp:cNvGraphicFramePr>
-            <a:graphic xmlns:a="http://schemas.openxmlformats.org/drawingml/2006/main">
-              <a:graphicData uri="http://schemas.openxmlformats.org/drawingml/2006/picture">
-                <pic:pic xmlns:pic="http://schemas.openxmlformats.org/drawingml/2006/picture">
-                  <pic:nvPicPr>
-                    <pic:cNvPr id="24" name="图片 1"/>
-                    <pic:cNvPicPr>
-                      <a:picLocks noChangeAspect="1"/>
-                    </pic:cNvPicPr>
-                  </pic:nvPicPr>
-                  <pic:blipFill>
-                    <a:blip r:embed="rId27"/>
-                    <a:srcRect l="-369" t="61866" r="369" b="-7426"/>
-                    <a:stretch>
-                      <a:fillRect/>
-                    </a:stretch>
-                  </pic:blipFill>
-                  <pic:spPr>
-                    <a:xfrm>
-                      <a:off x="0" y="0"/>
-                      <a:ext cx="6019165" cy="2762250"/>
-                    </a:xfrm>
-                    <a:prstGeom prst="rect">
-                      <a:avLst/>
-                    </a:prstGeom>
-                  </pic:spPr>
-                </pic:pic>
-              </a:graphicData>
-            </a:graphic>
-          </wp:inline>
-        </w:drawing>
-      </w:r>
-    </w:p>
-    <w:p>
-      <w:pPr>
-        <w:keepNext w:val="0"/>
-        <w:keepLines w:val="0"/>
-        <w:pageBreakBefore w:val="0"/>
-        <w:widowControl/>
-        <w:kinsoku/>
-        <w:wordWrap/>
-        <w:overflowPunct/>
-        <w:topLinePunct w:val="0"/>
-        <w:autoSpaceDE/>
-        <w:autoSpaceDN/>
-        <w:bidi w:val="0"/>
-        <w:adjustRightInd/>
-        <w:snapToGrid/>
-        <w:spacing w:line="240" w:lineRule="auto"/>
-        <w:ind w:firstLine="480"/>
-        <w:textAlignment w:val="auto"/>
-      </w:pPr>
     </w:p>
     <w:p>
       <w:pPr>
@@ -5276,6 +5898,9 @@
       <w:pPr>
         <w:pStyle w:val="3"/>
         <w:bidi w:val="0"/>
+        <w:rPr>
+          <w:rFonts w:hint="default"/>
+        </w:rPr>
       </w:pPr>
       <w:bookmarkStart w:id="16" w:name="_Toc1309630601"/>
       <w:r>
@@ -5285,13 +5910,6 @@
         <w:t>DWC2 USB 控制器 4.20a 版本的复位兼容性问题</w:t>
       </w:r>
       <w:bookmarkEnd w:id="16"/>
-    </w:p>
-    <w:p>
-      <w:pPr>
-        <w:rPr>
-          <w:rFonts w:hint="default"/>
-        </w:rPr>
-      </w:pPr>
     </w:p>
     <w:p>
       <w:pPr>
@@ -5316,6 +5934,12 @@
           <w:rFonts w:hint="default"/>
         </w:rPr>
       </w:pPr>
+      <w:r>
+        <w:rPr>
+          <w:rFonts w:hint="default"/>
+        </w:rPr>
+        <w:t>旧版本 DWC2 的软复位流程为：软件向 GRSTCTL 寄存器的 Bit 0（CSFTRST）写入 1 触发软复位，然后持续轮询等待该位被硬件自动清零——清零即表示复位完成。新版本 4.20a 的流程则有所不同：触发软复位的操作相同，但完成标志变为 Bit 29（CSFTRST_DONE）被硬件置 1——软件需要轮询等待该位变为 1 而非等待 Bit 0 变为 0。更重要的是，复位完成后，软件需要手动将 Bit 0 和 Bit 29 都清零。</w:t>
+      </w:r>
     </w:p>
     <w:p>
       <w:pPr>
@@ -5329,7 +5953,7 @@
         <w:rPr>
           <w:rFonts w:hint="default"/>
         </w:rPr>
-        <w:t>旧版本 DWC2 的软复位流程为：软件向 GRSTCTL 寄存器的 Bit 0（CSFTRST）写入 1 触发软复位，然后持续轮询等待该位被硬件自动清零——清零即表示复位完成。新版本 4.20a 的流程则有所不同：触发软复位的操作相同，但完成标志变为 Bit 29（CSFTRST_DONE）被硬件置 1——软件需要轮询等待该位变为 1 而非等待 Bit 0 变为 0。更重要的是，复位完成后，软件需要手动将 Bit 0 和 Bit 29 都清零。</w:t>
+        <w:t>识别这一差异的线索来自于 GSNPSID 寄存器（偏移 0x040），该寄存器包含了 DWC2 核心的版本编号。通过读取该寄存器的值并与 DWC2_CORE_REV_MASK（0x0000ffff）进行掩码比较，可以判断当前硬件是否属于 4.20a 及更新版本。对于版本号小于 4.20a 的设备，保持原有的轮询逻辑；对于版本号大于等于 4.20a 的设备，则切换到新的 CSFTRST_DONE 轮询逻辑，并在确认完成后手动清理两个标志位。</w:t>
       </w:r>
     </w:p>
     <w:p>
@@ -5340,6 +5964,43 @@
           <w:rFonts w:hint="default"/>
         </w:rPr>
       </w:pPr>
+      <w:r>
+        <w:rPr>
+          <w:rFonts w:hint="default"/>
+        </w:rPr>
+        <w:t>除复位逻辑外，还发现并修复了以下与 USB 相关的硬件适配问题：CVITEK 平台的 board_usb_init 函数中未正确使能 USB 时钟门控（AXI4、APB、125M、33K、12M 各路时钟），导致 PHY 初始化时序不可靠；udc_disable 函数在退出时未将 D+ 线拉低（soft-disconnect），导致主机无法检测到设备断开；otg_phy_init 和 otg_phy_off 函数中包含 Exynos 平台的特定代码，与 CVITEK 平台不兼容（实际的 PHY 初始化已经在 board.c 中处理）；以及 RISC-V 架构下 #include &lt;asm/mach-types.h&gt; 的缺失（该头文件仅存在于 ARM 架构中）。这些问题的逐一排查和修复需要在缺乏完整文档的情况下，通过阅读 DWC2 IP 的数据手册、对比不同版本 U-Boot 的驱动代码、以及大量的"修改-编译-烧录-测试"迭代来完成。</w:t>
+      </w:r>
+    </w:p>
+    <w:p>
+      <w:pPr>
+        <w:rPr>
+          <w:rFonts w:hint="default"/>
+        </w:rPr>
+      </w:pPr>
+    </w:p>
+    <w:p>
+      <w:pPr>
+        <w:rPr>
+          <w:rFonts w:hint="default"/>
+        </w:rPr>
+      </w:pPr>
+    </w:p>
+    <w:p>
+      <w:pPr>
+        <w:pStyle w:val="3"/>
+        <w:bidi w:val="0"/>
+        <w:rPr>
+          <w:rFonts w:hint="default"/>
+        </w:rPr>
+      </w:pPr>
+      <w:bookmarkStart w:id="17" w:name="_Toc81434128"/>
+      <w:r>
+        <w:rPr>
+          <w:rFonts w:hint="default"/>
+        </w:rPr>
+        <w:t>摄像头采集管道的 INIT ioctl 时序问题</w:t>
+      </w:r>
+      <w:bookmarkEnd w:id="17"/>
     </w:p>
     <w:p>
       <w:pPr>
@@ -5353,7 +6014,7 @@
         <w:rPr>
           <w:rFonts w:hint="default"/>
         </w:rPr>
-        <w:t>识别这一差异的线索来自于 GSNPSID 寄存器（偏移 0x040），该寄存器包含了 DWC2 核心的版本编号。通过读取该寄存器的值并与 DWC2_CORE_REV_MASK（0x0000ffff）进行掩码比较，可以判断当前硬件是否属于 4.20a 及更新版本。对于版本号小于 4.20a 的设备，保持原有的轮询逻辑；对于版本号大于等于 4.20a 的设备，则切换到新的 CSFTRST_DONE 轮询逻辑，并在确认完成后手动清理两个标志位。</w:t>
+        <w:t>摄像头采集管道的性能问题——每帧约 2845 毫秒的异常耗时——是本项目在应用层遇到的最严重的性能瓶颈。这个问题的诊断和修复过程，展示了在复杂软硬件栈中进行性能分析的系统性方法论。</w:t>
       </w:r>
     </w:p>
     <w:p>
@@ -5364,6 +6025,12 @@
           <w:rFonts w:hint="default"/>
         </w:rPr>
       </w:pPr>
+      <w:r>
+        <w:rPr>
+          <w:rFonts w:hint="default"/>
+        </w:rPr>
+        <w:t>问题的症状十分明显：不管是在 Linux 还是 StarryOS 上运行 akars，单帧的总耗时都在 60 秒（Linux）到 1049 秒（StarryOS）的异常范围内。由于原始代码中没有逐阶段计时功能，首先需要做的是在关键路径上插入计时点，将总耗时分解为采集、预处理、推理、后处理等阶段的独立耗时。这一诊断输出立刻指明了问题的位置：camera capture 阶段独占了约 92% 的总耗时。</w:t>
+      </w:r>
     </w:p>
     <w:p>
       <w:pPr>
@@ -5377,11 +6044,56 @@
         <w:rPr>
           <w:rFonts w:hint="default"/>
         </w:rPr>
-        <w:t>除复位逻辑外，还发现并修复了以下与 USB 相关的硬件适配问题：CVITEK 平台的 board_usb_init 函数中未正确使能 USB 时钟门控（AXI4、APB、125M、33K、12M 各路时钟），导致 PHY 初始化时序不可靠；udc_disable 函数在退出时未将 D+ 线拉低（soft-disconnect），导致主机无法检测到设备断开；otg_phy_init 和 otg_phy_off 函数中包含 Exynos 平台的特定代码，与 CVITEK 平台不兼容（实际的 PHY 初始化已经在 board.c 中处理）；以及 RISC-V 架构下 #include &lt;asm/mach-types.h&gt; 的缺失（该头文件仅存在于 ARM 架构中）。这些问题的逐一排查和修复需要在缺乏完整文档的情况下，通过阅读 DWC2 IP 的数据手册、对比不同版本 U-Boot 的驱动代码、以及大量的"修改-编译-烧录-测试"迭代来完成。</w:t>
-      </w:r>
-    </w:p>
-    <w:p>
-      <w:pPr>
+        <w:t>但仅知道"摄像头慢"是不够的——问题出在硬件、内核驱动还是用户态调用方式？为了进一步分离变量，项目中新增了 diagnose_timing() 诊断函数，该函数在程序启动时分别以 cmd3（原始 MJPEG）和 cmd4（YUV via JPU）两种模式各采集一帧并独立计时。诊断结果显示：传感器本身的帧等待加 USB 传输仅需约 34 毫秒（cmd3），即使是加上 JPU 硬件解码也只需约 56 毫秒（cmd4）。这意味着硬件能力是完全正常的。</w:t>
+      </w:r>
+    </w:p>
+    <w:p>
+      <w:pPr>
+        <w:ind w:firstLine="480"/>
+        <w:jc w:val="both"/>
+        <w:rPr>
+          <w:rFonts w:hint="default"/>
+        </w:rPr>
+      </w:pPr>
+      <w:r>
+        <w:rPr>
+          <w:rFonts w:hint="default"/>
+        </w:rPr>
+        <w:t>至此，问题必然出在采集循环的控制逻辑上。通过阅读 StarryOS 内核中 cvi_usb_camera.rs 驱动的源码，发现了驱动层的帧同步状态机设计：UVC 摄像头在启动后需要约 3 秒的时间来完成自动曝光和自动白平衡的收敛，在此期间传感器输出大量不完整帧（有 JPEG SOI 标记但缺少 EOI 标记），这些帧被驱动状态机检测为无效并丢弃，同时触发状态重置。问题的</w:t>
+      </w:r>
+      <w:r>
+        <w:rPr>
+          <w:rFonts w:hint="eastAsia"/>
+          <w:lang w:eastAsia="zh-CN"/>
+        </w:rPr>
+        <w:t>根本原因</w:t>
+      </w:r>
+      <w:r>
+        <w:rPr>
+          <w:rFonts w:hint="default"/>
+        </w:rPr>
+        <w:t>在于原始用户态代码的调用模式：每次 get_frame() 都先调用 GET_FRAME ioctl 捕获一帧，然后在函数末尾调用 INIT ioctl 重置管道。这样下次调用 GET_FRAME 时，管道处于初始空闲状态，传感器的 AE/AWB 需要重新收敛——每帧都触发一次约 3 秒的收敛等待。</w:t>
+      </w:r>
+    </w:p>
+    <w:p>
+      <w:pPr>
+        <w:ind w:firstLine="480"/>
+        <w:jc w:val="both"/>
+        <w:rPr>
+          <w:rFonts w:hint="default"/>
+        </w:rPr>
+      </w:pPr>
+      <w:r>
+        <w:rPr>
+          <w:rFonts w:hint="default"/>
+        </w:rPr>
+        <w:t>解决方案的简洁性反而凸显了问题诊断的困难：仅需将 INIT 调用移至 GET_FRAME 之前，使两者紧邻执行，管道在帧之间保持活跃，传感器的状态得以连续维持。这个例子深刻说明了在硬件-驱动-应用的边界上，看似微小的接口调用顺序差异可能产生数量级级别的性能影响，而这类问题的诊断往往不能仅靠表面现象，需要深入阅读内核源码、理解硬件行为，并通过精确的计时测量来逐步缩小问题范围。</w:t>
+      </w:r>
+    </w:p>
+    <w:p>
+      <w:pPr>
+        <w:ind w:firstLine="480"/>
+        <w:jc w:val="both"/>
         <w:rPr>
           <w:rFonts w:hint="default"/>
         </w:rPr>
@@ -5402,14 +6114,14 @@
           <w:rFonts w:hint="default"/>
         </w:rPr>
       </w:pPr>
-      <w:bookmarkStart w:id="17" w:name="_Toc81434128"/>
-      <w:r>
-        <w:rPr>
-          <w:rFonts w:hint="default"/>
-        </w:rPr>
-        <w:t>摄像头采集管道的 INIT ioctl 时序问题</w:t>
-      </w:r>
-      <w:bookmarkEnd w:id="17"/>
+      <w:bookmarkStart w:id="18" w:name="_Toc262710640"/>
+      <w:r>
+        <w:rPr>
+          <w:rFonts w:hint="default"/>
+        </w:rPr>
+        <w:t>原子上下文中的睡眠锁问题</w:t>
+      </w:r>
+      <w:bookmarkEnd w:id="18"/>
     </w:p>
     <w:p>
       <w:pPr>
@@ -5423,7 +6135,7 @@
         <w:rPr>
           <w:rFonts w:hint="default"/>
         </w:rPr>
-        <w:t>摄像头采集管道的性能问题——每帧约 2845 毫秒的异常耗时——是本项目在应用层遇到的最严重的性能瓶颈。这个问题的诊断和修复过程，展示了在复杂软硬件栈中进行性能分析的系统性方法论。</w:t>
+        <w:t>ktracepoint 追踪框架的内核 panic 问题是本项目遇到的另一种类型的难题——并发安全性问题。这个问题导致在启用了摄像头 ioctl 追踪点后，内核在运行时随机 panic，系统挂死。</w:t>
       </w:r>
     </w:p>
     <w:p>
@@ -5434,6 +6146,12 @@
           <w:rFonts w:hint="default"/>
         </w:rPr>
       </w:pPr>
+      <w:r>
+        <w:rPr>
+          <w:rFonts w:hint="default"/>
+        </w:rPr>
+        <w:t>问题的症状是内核在 might_sleep() 断言处 panic。might_sleep() 是内核中用于检测当前上下文是否允许睡眠的断言函数：它通过读取当前的抢占计数（preempt count）来判断是否处于原子上下文（如持有自旋锁或关抢占的状态），如果发现处于原子上下文但试图睡眠，就触发 panic 以防止死锁或数据损坏。</w:t>
+      </w:r>
     </w:p>
     <w:p>
       <w:pPr>
@@ -5447,15 +6165,8 @@
         <w:rPr>
           <w:rFonts w:hint="default"/>
         </w:rPr>
-        <w:t>问题的症状十分明显：不管是在 Linux 还是 StarryOS 上运行 akars，单帧的总耗时都在 60 秒（Linux）到 1049 秒（StarryOS）的异常范围内。由于原始代码中没有逐阶段计时功能，首先需要做的是在关键路径上插入计时点，将总耗时分解为采集、预处理、推理、后处理等阶段的独立耗时。这一诊断输出立刻指明了问题的位置：camera capture 阶段独占了约 92% 的总耗时。</w:t>
-      </w:r>
-    </w:p>
-    <w:p>
-      <w:pPr>
-        <w:rPr>
-          <w:rFonts w:hint="default"/>
-        </w:rPr>
-      </w:pPr>
+        <w:t>通过分析 panic 时的调用栈，追踪到了问题的完整触发路径：摄像头驱动的 ioctl 处理函数持有一个 SpinNoPreempt 锁（该锁在加锁时关闭内核抢占，使抢占计数增加），在处理过程中调用了 trace_cvi_camera_ioctl() 追踪宏；该追踪宏内部又调用了 trace_pipe_push_raw_record() 将追踪记录写入管道缓冲区；而管道缓冲区的写入需要获取 raw_pipe.lock()——这把锁的类型是 Mutex，即睡眠锁。睡眠锁的 lock() 操作内部会调用 might_sleep() 来检查当前是否允许睡眠，而由于外层 SpinNoPreempt 锁已经增加了抢占计数，might_sleep() 判定当前处于原子上下文，于是触发 panic。</w:t>
+      </w:r>
     </w:p>
     <w:p>
       <w:pPr>
@@ -5469,7 +6180,7 @@
         <w:rPr>
           <w:rFonts w:hint="default"/>
         </w:rPr>
-        <w:t>但仅知道"摄像头慢"是不够的——问题出在硬件、内核驱动还是用户态调用方式？为了进一步分离变量，项目中新增了 diagnose_timing() 诊断函数，该函数在程序启动时分别以 cmd3（原始 MJPEG）和 cmd4（YUV via JPU）两种模式各采集一帧并独立计时。诊断结果显示：传感器本身的帧等待加 USB 传输仅需约 34 毫秒（cmd3），即使是加上 JPU 硬件解码也只需约 56 毫秒（cmd4）。这意味着硬件能力是完全正常的。</w:t>
+        <w:t>这个问题的本质是锁类型的不匹配：外层使用自旋锁（适用于短临界区、不可睡眠的上下文），内层却使用了睡眠锁（适用于可能长时间持有的临界区、允许睡眠的上下文）。在一个嵌套的锁获取路径中，如果外层已经是自旋锁，则内层绝不能使用睡眠锁——因为自旋锁持有期间调度被禁用，任何睡眠操作都会导致系统挂死。</w:t>
       </w:r>
     </w:p>
     <w:p>
@@ -5480,6 +6191,36 @@
           <w:rFonts w:hint="default"/>
         </w:rPr>
       </w:pPr>
+      <w:r>
+        <w:rPr>
+          <w:rFonts w:hint="default"/>
+        </w:rPr>
+        <w:t>解决方案是对追踪状态的内部锁进行升级：将 TRACE_STATE.raw_pipe 和 TRACE_STATE.cmdline_cache 两个字段的锁类型从 Mutex&lt;T&gt; 替换为 SpinNoPreempt&lt;T&gt;，与外层调用上下文的锁语义保持一致。这一修改消除了原子上下文中的睡眠可能性，使 ktracepoint 可以在任何内核路径上安全使用，不再受调用上下文的限制。</w:t>
+      </w:r>
+    </w:p>
+    <w:p>
+      <w:pPr>
+        <w:rPr>
+          <w:rFonts w:hint="default"/>
+        </w:rPr>
+      </w:pPr>
+    </w:p>
+    <w:p>
+      <w:pPr>
+        <w:pStyle w:val="3"/>
+        <w:bidi w:val="0"/>
+        <w:rPr>
+          <w:rFonts w:hint="default"/>
+        </w:rPr>
+      </w:pPr>
+      <w:bookmarkStart w:id="19" w:name="_Toc1052373241"/>
+      <w:r>
+        <w:rPr>
+          <w:rFonts w:hint="default"/>
+        </w:rPr>
+        <w:t>RISC-V 交叉编译与工具链适配</w:t>
+      </w:r>
+      <w:bookmarkEnd w:id="19"/>
     </w:p>
     <w:p>
       <w:pPr>
@@ -5493,20 +6234,7 @@
         <w:rPr>
           <w:rFonts w:hint="default"/>
         </w:rPr>
-        <w:t>至此，问题必然出在采集循环的控制逻辑上。通过阅读 StarryOS 内核中 cvi_usb_camera.rs 驱动的源码，发现了驱动层的帧同步状态机设计：UVC 摄像头在启动后需要约 3 秒的时间来完成自动曝光和自动白平衡的收敛，在此期间传感器输出大量不完整帧（有 JPEG SOI 标记但缺少 EOI 标记），这些帧被驱动状态机检测为无效并丢弃，同时触发状态重置。问题的</w:t>
-      </w:r>
-      <w:r>
-        <w:rPr>
-          <w:rFonts w:hint="eastAsia"/>
-          <w:lang w:eastAsia="zh-CN"/>
-        </w:rPr>
-        <w:t>根本原因</w:t>
-      </w:r>
-      <w:r>
-        <w:rPr>
-          <w:rFonts w:hint="default"/>
-        </w:rPr>
-        <w:t>在于原始用户态代码的调用模式：每次 get_frame() 都先调用 GET_FRAME ioctl 捕获一帧，然后在函数末尾调用 INIT ioctl 重置管道。这样下次调用 GET_FRAME 时，管道处于初始空闲状态，传感器的 AE/AWB 需要重新收敛——每帧都触发一次约 3 秒的收敛等待。</w:t>
+        <w:t>项目在开发过程中遇到的另一类实际困难涉及 RISC-V 交叉编译工具链的配置和维护。SG2002 的 C906 核心使用 RISC-V 64 位指令集架构，但宿主机（开发机）通常是 x86_64 架构，因此所有为目标平台构建的代码都需要通过交叉编译工具链完成。</w:t>
       </w:r>
     </w:p>
     <w:p>
@@ -5530,220 +6258,8 @@
         <w:rPr>
           <w:rFonts w:hint="default"/>
         </w:rPr>
-        <w:t>解决方案的简洁性反而凸显了问题诊断的困难：仅需将 INIT 调用移至 GET_FRAME 之前，使两者紧邻执行，管道在帧之间保持活跃，传感器的状态得以连续维持。这个例子深刻说明了在硬件-驱动-应用的边界上，看似微小的接口调用顺序差异可能产生数量级级别的性能影响，而这类问题的诊断往往不能仅靠表面现象，需要深入阅读内核源码、理解硬件行为，并通过精确的计时测量来逐步缩小问题范围。</w:t>
-      </w:r>
-    </w:p>
-    <w:p>
-      <w:pPr>
-        <w:ind w:firstLine="480"/>
-        <w:jc w:val="both"/>
-        <w:rPr>
-          <w:rFonts w:hint="default"/>
-        </w:rPr>
-      </w:pPr>
-    </w:p>
-    <w:p>
-      <w:pPr>
-        <w:rPr>
-          <w:rFonts w:hint="default"/>
-        </w:rPr>
-      </w:pPr>
-    </w:p>
-    <w:p>
-      <w:pPr>
-        <w:pStyle w:val="3"/>
-        <w:bidi w:val="0"/>
-        <w:rPr>
-          <w:rFonts w:hint="default"/>
-        </w:rPr>
-      </w:pPr>
-      <w:bookmarkStart w:id="18" w:name="_Toc262710640"/>
-      <w:r>
-        <w:rPr>
-          <w:rFonts w:hint="default"/>
-        </w:rPr>
-        <w:t>原子上下文中的睡眠锁问题</w:t>
-      </w:r>
-      <w:bookmarkEnd w:id="18"/>
-    </w:p>
-    <w:p>
-      <w:pPr>
-        <w:ind w:firstLine="480"/>
-        <w:jc w:val="both"/>
-        <w:rPr>
-          <w:rFonts w:hint="default"/>
-        </w:rPr>
-      </w:pPr>
-      <w:r>
-        <w:rPr>
-          <w:rFonts w:hint="default"/>
-        </w:rPr>
-        <w:t>ktracepoint 追踪框架的内核 panic 问题是本项目遇到的另一种类型的难题——并发安全性问题。这个问题导致在启用了摄像头 ioctl 追踪点后，内核在运行时随机 panic，系统挂死。</w:t>
-      </w:r>
-    </w:p>
-    <w:p>
-      <w:pPr>
-        <w:rPr>
-          <w:rFonts w:hint="default"/>
-        </w:rPr>
-      </w:pPr>
-    </w:p>
-    <w:p>
-      <w:pPr>
-        <w:ind w:firstLine="480"/>
-        <w:jc w:val="both"/>
-        <w:rPr>
-          <w:rFonts w:hint="default"/>
-        </w:rPr>
-      </w:pPr>
-      <w:r>
-        <w:rPr>
-          <w:rFonts w:hint="default"/>
-        </w:rPr>
-        <w:t>问题的症状是内核在 might_sleep() 断言处 panic。might_sleep() 是内核中用于检测当前上下文是否允许睡眠的断言函数：它通过读取当前的抢占计数（preempt count）来判断是否处于原子上下文（如持有自旋锁或关抢占的状态），如果发现处于原子上下文但试图睡眠，就触发 panic 以防止死锁或数据损坏。</w:t>
-      </w:r>
-    </w:p>
-    <w:p>
-      <w:pPr>
-        <w:ind w:firstLine="480"/>
-        <w:jc w:val="both"/>
-        <w:rPr>
-          <w:rFonts w:hint="default"/>
-        </w:rPr>
-      </w:pPr>
-    </w:p>
-    <w:p>
-      <w:pPr>
-        <w:ind w:firstLine="480"/>
-        <w:jc w:val="both"/>
-        <w:rPr>
-          <w:rFonts w:hint="default"/>
-        </w:rPr>
-      </w:pPr>
-      <w:r>
-        <w:rPr>
-          <w:rFonts w:hint="default"/>
-        </w:rPr>
-        <w:t>通过分析 panic 时的调用栈，追踪到了问题的完整触发路径：摄像头驱动的 ioctl 处理函数持有一个 SpinNoPreempt 锁（该锁在加锁时关闭内核抢占，使抢占计数增加），在处理过程中调用了 trace_cvi_camera_ioctl() 追踪宏；该追踪宏内部又调用了 trace_pipe_push_raw_record() 将追踪记录写入管道缓冲区；而管道缓冲区的写入需要获取 raw_pipe.lock()——这把锁的类型是 Mutex，即睡眠锁。睡眠锁的 lock() 操作内部会调用 might_sleep() 来检查当前是否允许睡眠，而由于外层 SpinNoPreempt 锁已经增加了抢占计数，might_sleep() 判定当前处于原子上下文，于是触发 panic。</w:t>
-      </w:r>
-    </w:p>
-    <w:p>
-      <w:pPr>
-        <w:ind w:firstLine="480"/>
-        <w:jc w:val="both"/>
-        <w:rPr>
-          <w:rFonts w:hint="default"/>
-        </w:rPr>
-      </w:pPr>
-    </w:p>
-    <w:p>
-      <w:pPr>
-        <w:ind w:firstLine="480"/>
-        <w:jc w:val="both"/>
-        <w:rPr>
-          <w:rFonts w:hint="default"/>
-        </w:rPr>
-      </w:pPr>
-      <w:r>
-        <w:rPr>
-          <w:rFonts w:hint="default"/>
-        </w:rPr>
-        <w:t>这个问题的本质是锁类型的不匹配：外层使用自旋锁（适用于短临界区、不可睡眠的上下文），内层却使用了睡眠锁（适用于可能长时间持有的临界区、允许睡眠的上下文）。在一个嵌套的锁获取路径中，如果外层已经是自旋锁，则内层绝不能使用睡眠锁——因为自旋锁持有期间调度被禁用，任何睡眠操作都会导致系统挂死。</w:t>
-      </w:r>
-    </w:p>
-    <w:p>
-      <w:pPr>
-        <w:ind w:firstLine="480"/>
-        <w:jc w:val="both"/>
-        <w:rPr>
-          <w:rFonts w:hint="default"/>
-        </w:rPr>
-      </w:pPr>
-    </w:p>
-    <w:p>
-      <w:pPr>
-        <w:ind w:firstLine="480"/>
-        <w:jc w:val="both"/>
-        <w:rPr>
-          <w:rFonts w:hint="default"/>
-        </w:rPr>
-      </w:pPr>
-      <w:r>
-        <w:rPr>
-          <w:rFonts w:hint="default"/>
-        </w:rPr>
-        <w:t>解决方案是对追踪状态的内部锁进行升级：将 TRACE_STATE.raw_pipe 和 TRACE_STATE.cmdline_cache 两个字段的锁类型从 Mutex&lt;T&gt; 替换为 SpinNoPreempt&lt;T&gt;，与外层调用上下文的锁语义保持一致。这一修改消除了原子上下文中的睡眠可能性，使 ktracepoint 可以在任何内核路径上安全使用，不再受调用上下文的限制。</w:t>
-      </w:r>
-    </w:p>
-    <w:p>
-      <w:pPr>
-        <w:rPr>
-          <w:rFonts w:hint="default"/>
-        </w:rPr>
-      </w:pPr>
-    </w:p>
-    <w:p>
-      <w:pPr>
-        <w:pStyle w:val="3"/>
-        <w:bidi w:val="0"/>
-        <w:rPr>
-          <w:rFonts w:hint="default"/>
-        </w:rPr>
-      </w:pPr>
-      <w:bookmarkStart w:id="19" w:name="_Toc1052373241"/>
-      <w:r>
-        <w:rPr>
-          <w:rFonts w:hint="default"/>
-        </w:rPr>
-        <w:t>RISC-V 交叉编译与工具链适配</w:t>
-      </w:r>
-      <w:bookmarkEnd w:id="19"/>
-    </w:p>
-    <w:p>
-      <w:pPr>
-        <w:ind w:firstLine="480"/>
-        <w:jc w:val="both"/>
-        <w:rPr>
-          <w:rFonts w:hint="default"/>
-        </w:rPr>
-      </w:pPr>
-      <w:r>
-        <w:rPr>
-          <w:rFonts w:hint="default"/>
-        </w:rPr>
-        <w:t>项目在开发过程中遇到的另一类实际困难涉及 RISC-V 交叉编译工具链的配置和维护。SG2002 的 C906 核心使用 RISC-V 64 位指令集架构，但宿主机（开发机）通常是 x86_64 架构，因此所有为目标平台构建的代码都需要通过交叉编译工具链完成。</w:t>
-      </w:r>
-    </w:p>
-    <w:p>
-      <w:pPr>
-        <w:ind w:firstLine="480"/>
-        <w:jc w:val="both"/>
-        <w:rPr>
-          <w:rFonts w:hint="default"/>
-        </w:rPr>
-      </w:pPr>
-    </w:p>
-    <w:p>
-      <w:pPr>
-        <w:ind w:firstLine="480"/>
-        <w:jc w:val="both"/>
-        <w:rPr>
-          <w:rFonts w:hint="default"/>
-        </w:rPr>
-      </w:pPr>
-      <w:r>
-        <w:rPr>
-          <w:rFonts w:hint="default"/>
-        </w:rPr>
         <w:t>在 StarryOS 内核的构建中，涉及两种不同的 RISC-V 目标三元组：riscv64gc-unknown-none-elf 用于裸机环境的内核代码编译（通过 rustup target add 安装 Rust 标准库的该目标），以及 riscv64-linux-musl-gcc 用于用户态 C 程序（如 wifi_switch）的编译（需要手动下载并配置 musl 交叉编译器）。此外，SG2002 SDK 中的 U-Boot 和固件构建还需要额外的工具链（host-tools）和特定版本的 Python 依赖。整个构建流程涉及 Rust 工具链、C 交叉编译器、Python 脚本、以及 SoC 供应商提供的专有工具，各组件之间的版本兼容性需要仔细管理。</w:t>
       </w:r>
-    </w:p>
-    <w:p>
-      <w:pPr>
-        <w:rPr>
-          <w:rFonts w:hint="default"/>
-        </w:rPr>
-      </w:pPr>
     </w:p>
     <w:p>
       <w:pPr>
@@ -5789,11 +6305,7 @@
       </w:r>
       <w:bookmarkEnd w:id="20"/>
     </w:p>
-    <w:p>
-      <w:pPr>
-        <w:ind w:firstLine="480"/>
-      </w:pPr>
-    </w:p>
+    <w:p/>
     <w:p>
       <w:pPr>
         <w:ind w:firstLine="480"/>
@@ -5802,7 +6314,6 @@
           <w:rFonts w:hint="default"/>
         </w:rPr>
       </w:pPr>
-      <w:bookmarkStart w:id="22" w:name="_GoBack"/>
       <w:r>
         <w:rPr>
           <w:rFonts w:hint="default"/>
@@ -5900,12 +6411,13 @@
         </w:sectPr>
       </w:pPr>
     </w:p>
-    <w:bookmarkEnd w:id="22"/>
     <w:p>
       <w:pPr>
         <w:pStyle w:val="40"/>
         <w:spacing w:before="120" w:after="120"/>
       </w:pPr>
+      <w:bookmarkStart w:id="22" w:name="_GoBack"/>
+      <w:bookmarkEnd w:id="22"/>
       <w:bookmarkStart w:id="21" w:name="_Toc1462024680"/>
       <w:r>
         <w:rPr>
@@ -6373,7 +6885,7 @@
   <w:docDefaults>
     <w:rPrDefault>
       <w:rPr>
-        <w:rFonts w:asciiTheme="minorHAnsi" w:hAnsiTheme="minorHAnsi" w:eastAsiaTheme="minorEastAsia" w:cstheme="minorBidi"/>
+        <w:rFonts w:ascii="Times New Roman" w:hAnsi="Times New Roman" w:eastAsia="宋体" w:cs="Times New Roman"/>
       </w:rPr>
     </w:rPrDefault>
     <w:pPrDefault/>

</xml_diff>